<commit_message>
CF-247 e133: bug fix for duplicate intakes and Canadian provinces (migration 20261015040000); developer guide and register v1.6; System reference 1.17
Co-Authored-By: Claude Opus 5.5 <noreply@anthropic.com>
Claude-Session: https://claude.ai/code/session_01RnriTf32Hcv4Xqnq2DF1qq
</commit_message>
<xml_diff>
--- a/docs/integrations/developer-pack/StudySearch-Website-API-Developer-Guide.docx
+++ b/docs/integrations/developer-pack/StudySearch-Website-API-Developer-Guide.docx
@@ -7129,7 +7129,35 @@
           <w:p>
             <w:pPr>
               <w:pStyle w:val="Compact"/>
-            </w:pPr>
+              <w:jc w:val="left"/>
+            </w:pPr>
+            <w:r>
+              <w:rPr>
+                <w:rStyle w:val="VerbatimChar"/>
+              </w:rPr>
+              <w:t xml:space="preserve">subdivision_codes</w:t>
+            </w:r>
+            <w:r>
+              <w:t xml:space="preserve"> </w:t>
+            </w:r>
+            <w:r>
+              <w:t xml:space="preserve">are the course’s states or provinces from its campuses; a Canadian course with no campus (often online) takes its provider’s province. The</w:t>
+            </w:r>
+            <w:r>
+              <w:t xml:space="preserve"> </w:t>
+            </w:r>
+            <w:r>
+              <w:rPr>
+                <w:rStyle w:val="VerbatimChar"/>
+              </w:rPr>
+              <w:t xml:space="preserve">subdivision_codes</w:t>
+            </w:r>
+            <w:r>
+              <w:t xml:space="preserve"> </w:t>
+            </w:r>
+            <w:r>
+              <w:t xml:space="preserve">filter uses the same values</w:t>
+            </w:r>
           </w:p>
         </w:tc>
       </w:tr>
@@ -14013,6 +14041,62 @@
                 <w:rStyle w:val="VerbatimChar"/>
               </w:rPr>
               <w:t xml:space="preserve">page_size</w:t>
+            </w:r>
+          </w:p>
+        </w:tc>
+      </w:tr>
+      <w:tr>
+        <w:tc>
+          <w:tcPr/>
+          <w:p>
+            <w:pPr>
+              <w:pStyle w:val="Compact"/>
+              <w:jc w:val="left"/>
+            </w:pPr>
+            <w:r>
+              <w:t xml:space="preserve">15 October 2026 (afternoon)</w:t>
+            </w:r>
+          </w:p>
+        </w:tc>
+        <w:tc>
+          <w:tcPr/>
+          <w:p>
+            <w:pPr>
+              <w:pStyle w:val="Compact"/>
+              <w:jc w:val="left"/>
+            </w:pPr>
+            <w:r>
+              <w:t xml:space="preserve">A Canadian course with no campus now lists its provider’s province in</w:t>
+            </w:r>
+            <w:r>
+              <w:t xml:space="preserve"> </w:t>
+            </w:r>
+            <w:r>
+              <w:rPr>
+                <w:rStyle w:val="VerbatimChar"/>
+              </w:rPr>
+              <w:t xml:space="preserve">subdivision_codes</w:t>
+            </w:r>
+            <w:r>
+              <w:t xml:space="preserve"> </w:t>
+            </w:r>
+            <w:r>
+              <w:t xml:space="preserve">(all 4,723 Canadian courses have one; 2,332 before). Intake months are no longer repeated in</w:t>
+            </w:r>
+            <w:r>
+              <w:t xml:space="preserve"> </w:t>
+            </w:r>
+            <w:r>
+              <w:rPr>
+                <w:rStyle w:val="VerbatimChar"/>
+              </w:rPr>
+              <w:t xml:space="preserve">intakes[]</w:t>
+            </w:r>
+            <w:r>
+              <w:t xml:space="preserve"> </w:t>
+            </w:r>
+            <w:r>
+              <w:t xml:space="preserve">(a month was listed twice for 410 courses)</w:t>
             </w:r>
           </w:p>
         </w:tc>

</xml_diff>

<commit_message>
CF-247 e133: bug fix for duplicate intakes and Canadian provinces (migration 20261015040000); developer guide and register v1.6; System reference 1.17 (#347)
Claude-Session: https://claude.ai/code/session_01RnriTf32Hcv4Xqnq2DF1qq

Co-authored-by: Claude <noreply@anthropic.com>
</commit_message>
<xml_diff>
--- a/docs/integrations/developer-pack/StudySearch-Website-API-Developer-Guide.docx
+++ b/docs/integrations/developer-pack/StudySearch-Website-API-Developer-Guide.docx
@@ -7129,7 +7129,35 @@
           <w:p>
             <w:pPr>
               <w:pStyle w:val="Compact"/>
-            </w:pPr>
+              <w:jc w:val="left"/>
+            </w:pPr>
+            <w:r>
+              <w:rPr>
+                <w:rStyle w:val="VerbatimChar"/>
+              </w:rPr>
+              <w:t xml:space="preserve">subdivision_codes</w:t>
+            </w:r>
+            <w:r>
+              <w:t xml:space="preserve"> </w:t>
+            </w:r>
+            <w:r>
+              <w:t xml:space="preserve">are the course’s states or provinces from its campuses; a Canadian course with no campus (often online) takes its provider’s province. The</w:t>
+            </w:r>
+            <w:r>
+              <w:t xml:space="preserve"> </w:t>
+            </w:r>
+            <w:r>
+              <w:rPr>
+                <w:rStyle w:val="VerbatimChar"/>
+              </w:rPr>
+              <w:t xml:space="preserve">subdivision_codes</w:t>
+            </w:r>
+            <w:r>
+              <w:t xml:space="preserve"> </w:t>
+            </w:r>
+            <w:r>
+              <w:t xml:space="preserve">filter uses the same values</w:t>
+            </w:r>
           </w:p>
         </w:tc>
       </w:tr>
@@ -14013,6 +14041,62 @@
                 <w:rStyle w:val="VerbatimChar"/>
               </w:rPr>
               <w:t xml:space="preserve">page_size</w:t>
+            </w:r>
+          </w:p>
+        </w:tc>
+      </w:tr>
+      <w:tr>
+        <w:tc>
+          <w:tcPr/>
+          <w:p>
+            <w:pPr>
+              <w:pStyle w:val="Compact"/>
+              <w:jc w:val="left"/>
+            </w:pPr>
+            <w:r>
+              <w:t xml:space="preserve">15 October 2026 (afternoon)</w:t>
+            </w:r>
+          </w:p>
+        </w:tc>
+        <w:tc>
+          <w:tcPr/>
+          <w:p>
+            <w:pPr>
+              <w:pStyle w:val="Compact"/>
+              <w:jc w:val="left"/>
+            </w:pPr>
+            <w:r>
+              <w:t xml:space="preserve">A Canadian course with no campus now lists its provider’s province in</w:t>
+            </w:r>
+            <w:r>
+              <w:t xml:space="preserve"> </w:t>
+            </w:r>
+            <w:r>
+              <w:rPr>
+                <w:rStyle w:val="VerbatimChar"/>
+              </w:rPr>
+              <w:t xml:space="preserve">subdivision_codes</w:t>
+            </w:r>
+            <w:r>
+              <w:t xml:space="preserve"> </w:t>
+            </w:r>
+            <w:r>
+              <w:t xml:space="preserve">(all 4,723 Canadian courses have one; 2,332 before). Intake months are no longer repeated in</w:t>
+            </w:r>
+            <w:r>
+              <w:t xml:space="preserve"> </w:t>
+            </w:r>
+            <w:r>
+              <w:rPr>
+                <w:rStyle w:val="VerbatimChar"/>
+              </w:rPr>
+              <w:t xml:space="preserve">intakes[]</w:t>
+            </w:r>
+            <w:r>
+              <w:t xml:space="preserve"> </w:t>
+            </w:r>
+            <w:r>
+              <w:t xml:space="preserve">(a month was listed twice for 410 courses)</w:t>
             </w:r>
           </w:p>
         </w:tc>

</xml_diff>

<commit_message>
CF-247 e136: Website API developer pack refreshed and reissued (figures re-measured, change line); reference city metro areas corrected; register v1.7; System reference 1.20
Co-Authored-By: Claude Opus 5.5 <noreply@anthropic.com>
Claude-Session: https://claude.ai/code/session_01RnriTf32Hcv4Xqnq2DF1qq
</commit_message>
<xml_diff>
--- a/docs/integrations/developer-pack/StudySearch-Website-API-Developer-Guide.docx
+++ b/docs/integrations/developer-pack/StudySearch-Website-API-Developer-Guide.docx
@@ -3776,7 +3776,7 @@
         <w:pStyle w:val="Compact"/>
       </w:pPr>
       <w:r>
-        <w:t xml:space="preserve">A full load is about 40,400 items (15 October 2026): about 1,400 calls, roughly 25 minutes within the limit of 60 calls a minute.</w:t>
+        <w:t xml:space="preserve">A full load is about 40,600 items (15 October 2026): about 1,400 calls, roughly 25 minutes within the limit of 60 calls a minute.</w:t>
       </w:r>
     </w:p>
     <w:p>
@@ -5256,7 +5256,7 @@
         <w:pStyle w:val="FirstParagraph"/>
       </w:pPr>
       <w:r>
-        <w:t xml:space="preserve">This returned 35 courses on 15 October 2026. All filters are optional and combine with AND.</w:t>
+        <w:t xml:space="preserve">This returned 78 courses on the evening of 15 October 2026; the count grows as English and intake data are added. All filters are optional and combine with AND.</w:t>
       </w:r>
     </w:p>
     <w:tbl>
@@ -12668,7 +12668,7 @@
         <w:pStyle w:val="FirstParagraph"/>
       </w:pPr>
       <w:r>
-        <w:t xml:space="preserve">Counts are as measured on Pilot on 15 October 2026 and grow as data is added.</w:t>
+        <w:t xml:space="preserve">Counts are as measured on Pilot on the evening of 15 October 2026 and grow as data is added.</w:t>
       </w:r>
     </w:p>
     <w:tbl>
@@ -12915,7 +12915,7 @@
               <w:jc w:val="left"/>
             </w:pPr>
             <w:r>
-              <w:t xml:space="preserve">The example in 7.2 returns 35 courses; each has a February intake, an IELTS minimum at or below 6.5 and annual tuition at or below 45,000</w:t>
+              <w:t xml:space="preserve">The example in 7.2 returns 78 courses or more; each has a February intake, an IELTS minimum at or below 6.5 and annual tuition at or below 45,000</w:t>
             </w:r>
           </w:p>
         </w:tc>
@@ -13562,7 +13562,7 @@
               <w:t xml:space="preserve"> </w:t>
             </w:r>
             <w:r>
-              <w:t xml:space="preserve">true returns 49 providers; each</w:t>
+              <w:t xml:space="preserve">true returns 265 providers or more (more each day as logos are found); each</w:t>
             </w:r>
             <w:r>
               <w:t xml:space="preserve"> </w:t>
@@ -14097,6 +14097,47 @@
             </w:r>
             <w:r>
               <w:t xml:space="preserve">(a month was listed twice for 410 courses)</w:t>
+            </w:r>
+          </w:p>
+        </w:tc>
+      </w:tr>
+      <w:tr>
+        <w:tc>
+          <w:tcPr/>
+          <w:p>
+            <w:pPr>
+              <w:pStyle w:val="Compact"/>
+              <w:jc w:val="left"/>
+            </w:pPr>
+            <w:r>
+              <w:t xml:space="preserve">15 October 2026 (evening)</w:t>
+            </w:r>
+          </w:p>
+        </w:tc>
+        <w:tc>
+          <w:tcPr/>
+          <w:p>
+            <w:pPr>
+              <w:pStyle w:val="Compact"/>
+              <w:jc w:val="left"/>
+            </w:pPr>
+            <w:r>
+              <w:t xml:space="preserve">Each city in</w:t>
+            </w:r>
+            <w:r>
+              <w:t xml:space="preserve"> </w:t>
+            </w:r>
+            <w:r>
+              <w:rPr>
+                <w:rStyle w:val="VerbatimChar"/>
+              </w:rPr>
+              <w:t xml:space="preserve">reference</w:t>
+            </w:r>
+            <w:r>
+              <w:t xml:space="preserve"> </w:t>
+            </w:r>
+            <w:r>
+              <w:t xml:space="preserve">is now listed under the metro area most of its campuses have (Sydney was listed under Brisbane), and two campuses registered under the wrong state now carry the state their address names. More providers have a logo (49 that morning, 265 now, rising daily as logos are found on providers’ own websites): copy each new logo into Wix Media as before. Acceptance test counts refreshed. No field added, renamed or removed</w:t>
             </w:r>
           </w:p>
         </w:tc>

</xml_diff>

<commit_message>
CF-247 e136: Website API developer pack refreshed and reissued (figures re-measured, change line); reference city metro areas corrected; register v1.7; System reference 1.20 (#350)
Claude-Session: https://claude.ai/code/session_01RnriTf32Hcv4Xqnq2DF1qq

Co-authored-by: Claude <noreply@anthropic.com>
</commit_message>
<xml_diff>
--- a/docs/integrations/developer-pack/StudySearch-Website-API-Developer-Guide.docx
+++ b/docs/integrations/developer-pack/StudySearch-Website-API-Developer-Guide.docx
@@ -3776,7 +3776,7 @@
         <w:pStyle w:val="Compact"/>
       </w:pPr>
       <w:r>
-        <w:t xml:space="preserve">A full load is about 40,400 items (15 October 2026): about 1,400 calls, roughly 25 minutes within the limit of 60 calls a minute.</w:t>
+        <w:t xml:space="preserve">A full load is about 40,600 items (15 October 2026): about 1,400 calls, roughly 25 minutes within the limit of 60 calls a minute.</w:t>
       </w:r>
     </w:p>
     <w:p>
@@ -5256,7 +5256,7 @@
         <w:pStyle w:val="FirstParagraph"/>
       </w:pPr>
       <w:r>
-        <w:t xml:space="preserve">This returned 35 courses on 15 October 2026. All filters are optional and combine with AND.</w:t>
+        <w:t xml:space="preserve">This returned 78 courses on the evening of 15 October 2026; the count grows as English and intake data are added. All filters are optional and combine with AND.</w:t>
       </w:r>
     </w:p>
     <w:tbl>
@@ -12668,7 +12668,7 @@
         <w:pStyle w:val="FirstParagraph"/>
       </w:pPr>
       <w:r>
-        <w:t xml:space="preserve">Counts are as measured on Pilot on 15 October 2026 and grow as data is added.</w:t>
+        <w:t xml:space="preserve">Counts are as measured on Pilot on the evening of 15 October 2026 and grow as data is added.</w:t>
       </w:r>
     </w:p>
     <w:tbl>
@@ -12915,7 +12915,7 @@
               <w:jc w:val="left"/>
             </w:pPr>
             <w:r>
-              <w:t xml:space="preserve">The example in 7.2 returns 35 courses; each has a February intake, an IELTS minimum at or below 6.5 and annual tuition at or below 45,000</w:t>
+              <w:t xml:space="preserve">The example in 7.2 returns 78 courses or more; each has a February intake, an IELTS minimum at or below 6.5 and annual tuition at or below 45,000</w:t>
             </w:r>
           </w:p>
         </w:tc>
@@ -13562,7 +13562,7 @@
               <w:t xml:space="preserve"> </w:t>
             </w:r>
             <w:r>
-              <w:t xml:space="preserve">true returns 49 providers; each</w:t>
+              <w:t xml:space="preserve">true returns 265 providers or more (more each day as logos are found); each</w:t>
             </w:r>
             <w:r>
               <w:t xml:space="preserve"> </w:t>
@@ -14097,6 +14097,47 @@
             </w:r>
             <w:r>
               <w:t xml:space="preserve">(a month was listed twice for 410 courses)</w:t>
+            </w:r>
+          </w:p>
+        </w:tc>
+      </w:tr>
+      <w:tr>
+        <w:tc>
+          <w:tcPr/>
+          <w:p>
+            <w:pPr>
+              <w:pStyle w:val="Compact"/>
+              <w:jc w:val="left"/>
+            </w:pPr>
+            <w:r>
+              <w:t xml:space="preserve">15 October 2026 (evening)</w:t>
+            </w:r>
+          </w:p>
+        </w:tc>
+        <w:tc>
+          <w:tcPr/>
+          <w:p>
+            <w:pPr>
+              <w:pStyle w:val="Compact"/>
+              <w:jc w:val="left"/>
+            </w:pPr>
+            <w:r>
+              <w:t xml:space="preserve">Each city in</w:t>
+            </w:r>
+            <w:r>
+              <w:t xml:space="preserve"> </w:t>
+            </w:r>
+            <w:r>
+              <w:rPr>
+                <w:rStyle w:val="VerbatimChar"/>
+              </w:rPr>
+              <w:t xml:space="preserve">reference</w:t>
+            </w:r>
+            <w:r>
+              <w:t xml:space="preserve"> </w:t>
+            </w:r>
+            <w:r>
+              <w:t xml:space="preserve">is now listed under the metro area most of its campuses have (Sydney was listed under Brisbane), and two campuses registered under the wrong state now carry the state their address names. More providers have a logo (49 that morning, 265 now, rising daily as logos are found on providers’ own websites): copy each new logo into Wix Media as before. Acceptance test counts refreshed. No field added, renamed or removed</w:t>
             </w:r>
           </w:p>
         </w:tc>

</xml_diff>

<commit_message>
CF-247 e137: developer documents carry API changes only; guide reissued (section 13 first-issue line only; section 8 re-measured); register v1.8
Co-Authored-By: Claude Opus 5.5 <noreply@anthropic.com>
Claude-Session: https://claude.ai/code/session_01RnriTf32Hcv4Xqnq2DF1qq
</commit_message>
<xml_diff>
--- a/docs/integrations/developer-pack/StudySearch-Website-API-Developer-Guide.docx
+++ b/docs/integrations/developer-pack/StudySearch-Website-API-Developer-Guide.docx
@@ -5256,7 +5256,7 @@
         <w:pStyle w:val="FirstParagraph"/>
       </w:pPr>
       <w:r>
-        <w:t xml:space="preserve">This returned 78 courses on the evening of 15 October 2026; the count grows as English and intake data are added. All filters are optional and combine with AND.</w:t>
+        <w:t xml:space="preserve">This returned 78 courses on 15 October 2026. All filters are optional and combine with AND.</w:t>
       </w:r>
     </w:p>
     <w:tbl>
@@ -11480,7 +11480,7 @@
         <w:pStyle w:val="FirstParagraph"/>
       </w:pPr>
       <w:r>
-        <w:t xml:space="preserve">Courses or records the API returns holding a value (14 October 2026; coverage grows daily).</w:t>
+        <w:t xml:space="preserve">Courses or records the API returns holding a value (15 October 2026; coverage grows daily).</w:t>
       </w:r>
     </w:p>
     <w:tbl>
@@ -11652,31 +11652,31 @@
               <w:jc w:val="left"/>
             </w:pPr>
             <w:r>
-              <w:t xml:space="preserve">13,895</w:t>
-            </w:r>
-          </w:p>
-        </w:tc>
-        <w:tc>
-          <w:tcPr/>
-          <w:p>
-            <w:pPr>
-              <w:pStyle w:val="Compact"/>
-              <w:jc w:val="left"/>
-            </w:pPr>
-            <w:r>
-              <w:t xml:space="preserve">1,810</w:t>
-            </w:r>
-          </w:p>
-        </w:tc>
-        <w:tc>
-          <w:tcPr/>
-          <w:p>
-            <w:pPr>
-              <w:pStyle w:val="Compact"/>
-              <w:jc w:val="left"/>
-            </w:pPr>
-            <w:r>
-              <w:t xml:space="preserve">1,593</w:t>
+              <w:t xml:space="preserve">15,901</w:t>
+            </w:r>
+          </w:p>
+        </w:tc>
+        <w:tc>
+          <w:tcPr/>
+          <w:p>
+            <w:pPr>
+              <w:pStyle w:val="Compact"/>
+              <w:jc w:val="left"/>
+            </w:pPr>
+            <w:r>
+              <w:t xml:space="preserve">1,927</w:t>
+            </w:r>
+          </w:p>
+        </w:tc>
+        <w:tc>
+          <w:tcPr/>
+          <w:p>
+            <w:pPr>
+              <w:pStyle w:val="Compact"/>
+              <w:jc w:val="left"/>
+            </w:pPr>
+            <w:r>
+              <w:t xml:space="preserve">1,688</w:t>
             </w:r>
           </w:p>
         </w:tc>
@@ -11752,7 +11752,7 @@
               <w:jc w:val="left"/>
             </w:pPr>
             <w:r>
-              <w:t xml:space="preserve">25,716</w:t>
+              <w:t xml:space="preserve">25,922</w:t>
             </w:r>
           </w:p>
         </w:tc>
@@ -11914,19 +11914,19 @@
               <w:jc w:val="left"/>
             </w:pPr>
             <w:r>
-              <w:t xml:space="preserve">2,929</w:t>
-            </w:r>
-          </w:p>
-        </w:tc>
-        <w:tc>
-          <w:tcPr/>
-          <w:p>
-            <w:pPr>
-              <w:pStyle w:val="Compact"/>
-              <w:jc w:val="left"/>
-            </w:pPr>
-            <w:r>
-              <w:t xml:space="preserve">1,319</w:t>
+              <w:t xml:space="preserve">3,073</w:t>
+            </w:r>
+          </w:p>
+        </w:tc>
+        <w:tc>
+          <w:tcPr/>
+          <w:p>
+            <w:pPr>
+              <w:pStyle w:val="Compact"/>
+              <w:jc w:val="left"/>
+            </w:pPr>
+            <w:r>
+              <w:t xml:space="preserve">1,469</w:t>
             </w:r>
           </w:p>
         </w:tc>
@@ -11952,19 +11952,19 @@
               <w:jc w:val="left"/>
             </w:pPr>
             <w:r>
-              <w:t xml:space="preserve">26,078</w:t>
-            </w:r>
-          </w:p>
-        </w:tc>
-        <w:tc>
-          <w:tcPr/>
-          <w:p>
-            <w:pPr>
-              <w:pStyle w:val="Compact"/>
-              <w:jc w:val="left"/>
-            </w:pPr>
-            <w:r>
-              <w:t xml:space="preserve">3,868</w:t>
+              <w:t xml:space="preserve">26,087</w:t>
+            </w:r>
+          </w:p>
+        </w:tc>
+        <w:tc>
+          <w:tcPr/>
+          <w:p>
+            <w:pPr>
+              <w:pStyle w:val="Compact"/>
+              <w:jc w:val="left"/>
+            </w:pPr>
+            <w:r>
+              <w:t xml:space="preserve">3,870</w:t>
             </w:r>
           </w:p>
         </w:tc>
@@ -12137,7 +12137,7 @@
         <w:pStyle w:val="BodyText"/>
       </w:pPr>
       <w:r>
-        <w:t xml:space="preserve">Scholarships returned: 1,100 (Australia 901, New Zealand 141, Canada 58); 1,096 open to international students. Providers with an approved logo: 49. QS 2027 ranked Australian providers: 38. QILT statistics: 116 Australian providers. Institution type: held for Australian and New Zealand providers (null for Canada).</w:t>
+        <w:t xml:space="preserve">Scholarships returned: 1,100 (Australia 901, New Zealand 141, Canada 58); 1,096 open to international students. Providers with an approved logo: 265. QS 2027 ranked Australian providers: 38. QILT statistics: 116 Australian providers. Institution type: held for Australian and New Zealand providers (null for Canada).</w:t>
       </w:r>
     </w:p>
     <w:bookmarkEnd w:id="35"/>
@@ -12668,7 +12668,7 @@
         <w:pStyle w:val="FirstParagraph"/>
       </w:pPr>
       <w:r>
-        <w:t xml:space="preserve">Counts are as measured on Pilot on the evening of 15 October 2026 and grow as data is added.</w:t>
+        <w:t xml:space="preserve">Counts are as measured on Pilot on 15 October 2026; expect the same or more.</w:t>
       </w:r>
     </w:p>
     <w:tbl>
@@ -12915,7 +12915,7 @@
               <w:jc w:val="left"/>
             </w:pPr>
             <w:r>
-              <w:t xml:space="preserve">The example in 7.2 returns 78 courses or more; each has a February intake, an IELTS minimum at or below 6.5 and annual tuition at or below 45,000</w:t>
+              <w:t xml:space="preserve">The example in 7.2 returns 78 courses; each has a February intake, an IELTS minimum at or below 6.5 and annual tuition at or below 45,000</w:t>
             </w:r>
           </w:p>
         </w:tc>
@@ -13562,7 +13562,7 @@
               <w:t xml:space="preserve"> </w:t>
             </w:r>
             <w:r>
-              <w:t xml:space="preserve">true returns 265 providers or more (more each day as logos are found); each</w:t>
+              <w:t xml:space="preserve">true returns 265 providers; each</w:t>
             </w:r>
             <w:r>
               <w:t xml:space="preserve"> </w:t>
@@ -13917,7 +13917,7 @@
         <w:t xml:space="preserve"> </w:t>
       </w:r>
       <w:r>
-        <w:t xml:space="preserve">are additive. Each one reissues this guide with a new date and a line here.</w:t>
+        <w:t xml:space="preserve">are additive. A change to the API (a new field, filter, action or behaviour) reissues this guide with a new date and a line here. Data grows between issues; the counts in this guide are measures on the date shown.</w:t>
       </w:r>
     </w:p>
     <w:tbl>
@@ -14001,7 +14001,7 @@
               <w:jc w:val="left"/>
             </w:pPr>
             <w:r>
-              <w:t xml:space="preserve">First issue of the developer guide, with the OpenAPI file and Postman collection. It replaces the Version 2 handover of 14 October 2026; the contract is unchanged. Developer key added;</w:t>
+              <w:t xml:space="preserve">First issue, with the OpenAPI file and Postman collection. Changes from the Version 2 handover of 14 October 2026: a developer key;</w:t>
             </w:r>
             <w:r>
               <w:t xml:space="preserve"> </w:t>
@@ -14016,7 +14016,7 @@
               <w:t xml:space="preserve"> </w:t>
             </w:r>
             <w:r>
-              <w:t xml:space="preserve">now rebuilt every 15 minutes;</w:t>
+              <w:t xml:space="preserve">rebuilt every 15 minutes;</w:t>
             </w:r>
             <w:r>
               <w:t xml:space="preserve"> </w:t>
@@ -14041,103 +14041,6 @@
                 <w:rStyle w:val="VerbatimChar"/>
               </w:rPr>
               <w:t xml:space="preserve">page_size</w:t>
-            </w:r>
-          </w:p>
-        </w:tc>
-      </w:tr>
-      <w:tr>
-        <w:tc>
-          <w:tcPr/>
-          <w:p>
-            <w:pPr>
-              <w:pStyle w:val="Compact"/>
-              <w:jc w:val="left"/>
-            </w:pPr>
-            <w:r>
-              <w:t xml:space="preserve">15 October 2026 (afternoon)</w:t>
-            </w:r>
-          </w:p>
-        </w:tc>
-        <w:tc>
-          <w:tcPr/>
-          <w:p>
-            <w:pPr>
-              <w:pStyle w:val="Compact"/>
-              <w:jc w:val="left"/>
-            </w:pPr>
-            <w:r>
-              <w:t xml:space="preserve">A Canadian course with no campus now lists its provider’s province in</w:t>
-            </w:r>
-            <w:r>
-              <w:t xml:space="preserve"> </w:t>
-            </w:r>
-            <w:r>
-              <w:rPr>
-                <w:rStyle w:val="VerbatimChar"/>
-              </w:rPr>
-              <w:t xml:space="preserve">subdivision_codes</w:t>
-            </w:r>
-            <w:r>
-              <w:t xml:space="preserve"> </w:t>
-            </w:r>
-            <w:r>
-              <w:t xml:space="preserve">(all 4,723 Canadian courses have one; 2,332 before). Intake months are no longer repeated in</w:t>
-            </w:r>
-            <w:r>
-              <w:t xml:space="preserve"> </w:t>
-            </w:r>
-            <w:r>
-              <w:rPr>
-                <w:rStyle w:val="VerbatimChar"/>
-              </w:rPr>
-              <w:t xml:space="preserve">intakes[]</w:t>
-            </w:r>
-            <w:r>
-              <w:t xml:space="preserve"> </w:t>
-            </w:r>
-            <w:r>
-              <w:t xml:space="preserve">(a month was listed twice for 410 courses)</w:t>
-            </w:r>
-          </w:p>
-        </w:tc>
-      </w:tr>
-      <w:tr>
-        <w:tc>
-          <w:tcPr/>
-          <w:p>
-            <w:pPr>
-              <w:pStyle w:val="Compact"/>
-              <w:jc w:val="left"/>
-            </w:pPr>
-            <w:r>
-              <w:t xml:space="preserve">15 October 2026 (evening)</w:t>
-            </w:r>
-          </w:p>
-        </w:tc>
-        <w:tc>
-          <w:tcPr/>
-          <w:p>
-            <w:pPr>
-              <w:pStyle w:val="Compact"/>
-              <w:jc w:val="left"/>
-            </w:pPr>
-            <w:r>
-              <w:t xml:space="preserve">Each city in</w:t>
-            </w:r>
-            <w:r>
-              <w:t xml:space="preserve"> </w:t>
-            </w:r>
-            <w:r>
-              <w:rPr>
-                <w:rStyle w:val="VerbatimChar"/>
-              </w:rPr>
-              <w:t xml:space="preserve">reference</w:t>
-            </w:r>
-            <w:r>
-              <w:t xml:space="preserve"> </w:t>
-            </w:r>
-            <w:r>
-              <w:t xml:space="preserve">is now listed under the metro area most of its campuses have (Sydney was listed under Brisbane), and two campuses registered under the wrong state now carry the state their address names. More providers have a logo (49 that morning, 265 now, rising daily as logos are found on providers’ own websites): copy each new logo into Wix Media as before. Acceptance test counts refreshed. No field added, renamed or removed</w:t>
             </w:r>
           </w:p>
         </w:tc>

</xml_diff>

<commit_message>
CF-247 e137: developer documents carry API changes only; guide reissued (section 13 first-issue line only; section 8 re-measured); register v1.8 (#351)
Claude-Session: https://claude.ai/code/session_01RnriTf32Hcv4Xqnq2DF1qq

Co-authored-by: Claude <noreply@anthropic.com>
</commit_message>
<xml_diff>
--- a/docs/integrations/developer-pack/StudySearch-Website-API-Developer-Guide.docx
+++ b/docs/integrations/developer-pack/StudySearch-Website-API-Developer-Guide.docx
@@ -5256,7 +5256,7 @@
         <w:pStyle w:val="FirstParagraph"/>
       </w:pPr>
       <w:r>
-        <w:t xml:space="preserve">This returned 78 courses on the evening of 15 October 2026; the count grows as English and intake data are added. All filters are optional and combine with AND.</w:t>
+        <w:t xml:space="preserve">This returned 78 courses on 15 October 2026. All filters are optional and combine with AND.</w:t>
       </w:r>
     </w:p>
     <w:tbl>
@@ -11480,7 +11480,7 @@
         <w:pStyle w:val="FirstParagraph"/>
       </w:pPr>
       <w:r>
-        <w:t xml:space="preserve">Courses or records the API returns holding a value (14 October 2026; coverage grows daily).</w:t>
+        <w:t xml:space="preserve">Courses or records the API returns holding a value (15 October 2026; coverage grows daily).</w:t>
       </w:r>
     </w:p>
     <w:tbl>
@@ -11652,31 +11652,31 @@
               <w:jc w:val="left"/>
             </w:pPr>
             <w:r>
-              <w:t xml:space="preserve">13,895</w:t>
-            </w:r>
-          </w:p>
-        </w:tc>
-        <w:tc>
-          <w:tcPr/>
-          <w:p>
-            <w:pPr>
-              <w:pStyle w:val="Compact"/>
-              <w:jc w:val="left"/>
-            </w:pPr>
-            <w:r>
-              <w:t xml:space="preserve">1,810</w:t>
-            </w:r>
-          </w:p>
-        </w:tc>
-        <w:tc>
-          <w:tcPr/>
-          <w:p>
-            <w:pPr>
-              <w:pStyle w:val="Compact"/>
-              <w:jc w:val="left"/>
-            </w:pPr>
-            <w:r>
-              <w:t xml:space="preserve">1,593</w:t>
+              <w:t xml:space="preserve">15,901</w:t>
+            </w:r>
+          </w:p>
+        </w:tc>
+        <w:tc>
+          <w:tcPr/>
+          <w:p>
+            <w:pPr>
+              <w:pStyle w:val="Compact"/>
+              <w:jc w:val="left"/>
+            </w:pPr>
+            <w:r>
+              <w:t xml:space="preserve">1,927</w:t>
+            </w:r>
+          </w:p>
+        </w:tc>
+        <w:tc>
+          <w:tcPr/>
+          <w:p>
+            <w:pPr>
+              <w:pStyle w:val="Compact"/>
+              <w:jc w:val="left"/>
+            </w:pPr>
+            <w:r>
+              <w:t xml:space="preserve">1,688</w:t>
             </w:r>
           </w:p>
         </w:tc>
@@ -11752,7 +11752,7 @@
               <w:jc w:val="left"/>
             </w:pPr>
             <w:r>
-              <w:t xml:space="preserve">25,716</w:t>
+              <w:t xml:space="preserve">25,922</w:t>
             </w:r>
           </w:p>
         </w:tc>
@@ -11914,19 +11914,19 @@
               <w:jc w:val="left"/>
             </w:pPr>
             <w:r>
-              <w:t xml:space="preserve">2,929</w:t>
-            </w:r>
-          </w:p>
-        </w:tc>
-        <w:tc>
-          <w:tcPr/>
-          <w:p>
-            <w:pPr>
-              <w:pStyle w:val="Compact"/>
-              <w:jc w:val="left"/>
-            </w:pPr>
-            <w:r>
-              <w:t xml:space="preserve">1,319</w:t>
+              <w:t xml:space="preserve">3,073</w:t>
+            </w:r>
+          </w:p>
+        </w:tc>
+        <w:tc>
+          <w:tcPr/>
+          <w:p>
+            <w:pPr>
+              <w:pStyle w:val="Compact"/>
+              <w:jc w:val="left"/>
+            </w:pPr>
+            <w:r>
+              <w:t xml:space="preserve">1,469</w:t>
             </w:r>
           </w:p>
         </w:tc>
@@ -11952,19 +11952,19 @@
               <w:jc w:val="left"/>
             </w:pPr>
             <w:r>
-              <w:t xml:space="preserve">26,078</w:t>
-            </w:r>
-          </w:p>
-        </w:tc>
-        <w:tc>
-          <w:tcPr/>
-          <w:p>
-            <w:pPr>
-              <w:pStyle w:val="Compact"/>
-              <w:jc w:val="left"/>
-            </w:pPr>
-            <w:r>
-              <w:t xml:space="preserve">3,868</w:t>
+              <w:t xml:space="preserve">26,087</w:t>
+            </w:r>
+          </w:p>
+        </w:tc>
+        <w:tc>
+          <w:tcPr/>
+          <w:p>
+            <w:pPr>
+              <w:pStyle w:val="Compact"/>
+              <w:jc w:val="left"/>
+            </w:pPr>
+            <w:r>
+              <w:t xml:space="preserve">3,870</w:t>
             </w:r>
           </w:p>
         </w:tc>
@@ -12137,7 +12137,7 @@
         <w:pStyle w:val="BodyText"/>
       </w:pPr>
       <w:r>
-        <w:t xml:space="preserve">Scholarships returned: 1,100 (Australia 901, New Zealand 141, Canada 58); 1,096 open to international students. Providers with an approved logo: 49. QS 2027 ranked Australian providers: 38. QILT statistics: 116 Australian providers. Institution type: held for Australian and New Zealand providers (null for Canada).</w:t>
+        <w:t xml:space="preserve">Scholarships returned: 1,100 (Australia 901, New Zealand 141, Canada 58); 1,096 open to international students. Providers with an approved logo: 265. QS 2027 ranked Australian providers: 38. QILT statistics: 116 Australian providers. Institution type: held for Australian and New Zealand providers (null for Canada).</w:t>
       </w:r>
     </w:p>
     <w:bookmarkEnd w:id="35"/>
@@ -12668,7 +12668,7 @@
         <w:pStyle w:val="FirstParagraph"/>
       </w:pPr>
       <w:r>
-        <w:t xml:space="preserve">Counts are as measured on Pilot on the evening of 15 October 2026 and grow as data is added.</w:t>
+        <w:t xml:space="preserve">Counts are as measured on Pilot on 15 October 2026; expect the same or more.</w:t>
       </w:r>
     </w:p>
     <w:tbl>
@@ -12915,7 +12915,7 @@
               <w:jc w:val="left"/>
             </w:pPr>
             <w:r>
-              <w:t xml:space="preserve">The example in 7.2 returns 78 courses or more; each has a February intake, an IELTS minimum at or below 6.5 and annual tuition at or below 45,000</w:t>
+              <w:t xml:space="preserve">The example in 7.2 returns 78 courses; each has a February intake, an IELTS minimum at or below 6.5 and annual tuition at or below 45,000</w:t>
             </w:r>
           </w:p>
         </w:tc>
@@ -13562,7 +13562,7 @@
               <w:t xml:space="preserve"> </w:t>
             </w:r>
             <w:r>
-              <w:t xml:space="preserve">true returns 265 providers or more (more each day as logos are found); each</w:t>
+              <w:t xml:space="preserve">true returns 265 providers; each</w:t>
             </w:r>
             <w:r>
               <w:t xml:space="preserve"> </w:t>
@@ -13917,7 +13917,7 @@
         <w:t xml:space="preserve"> </w:t>
       </w:r>
       <w:r>
-        <w:t xml:space="preserve">are additive. Each one reissues this guide with a new date and a line here.</w:t>
+        <w:t xml:space="preserve">are additive. A change to the API (a new field, filter, action or behaviour) reissues this guide with a new date and a line here. Data grows between issues; the counts in this guide are measures on the date shown.</w:t>
       </w:r>
     </w:p>
     <w:tbl>
@@ -14001,7 +14001,7 @@
               <w:jc w:val="left"/>
             </w:pPr>
             <w:r>
-              <w:t xml:space="preserve">First issue of the developer guide, with the OpenAPI file and Postman collection. It replaces the Version 2 handover of 14 October 2026; the contract is unchanged. Developer key added;</w:t>
+              <w:t xml:space="preserve">First issue, with the OpenAPI file and Postman collection. Changes from the Version 2 handover of 14 October 2026: a developer key;</w:t>
             </w:r>
             <w:r>
               <w:t xml:space="preserve"> </w:t>
@@ -14016,7 +14016,7 @@
               <w:t xml:space="preserve"> </w:t>
             </w:r>
             <w:r>
-              <w:t xml:space="preserve">now rebuilt every 15 minutes;</w:t>
+              <w:t xml:space="preserve">rebuilt every 15 minutes;</w:t>
             </w:r>
             <w:r>
               <w:t xml:space="preserve"> </w:t>
@@ -14041,103 +14041,6 @@
                 <w:rStyle w:val="VerbatimChar"/>
               </w:rPr>
               <w:t xml:space="preserve">page_size</w:t>
-            </w:r>
-          </w:p>
-        </w:tc>
-      </w:tr>
-      <w:tr>
-        <w:tc>
-          <w:tcPr/>
-          <w:p>
-            <w:pPr>
-              <w:pStyle w:val="Compact"/>
-              <w:jc w:val="left"/>
-            </w:pPr>
-            <w:r>
-              <w:t xml:space="preserve">15 October 2026 (afternoon)</w:t>
-            </w:r>
-          </w:p>
-        </w:tc>
-        <w:tc>
-          <w:tcPr/>
-          <w:p>
-            <w:pPr>
-              <w:pStyle w:val="Compact"/>
-              <w:jc w:val="left"/>
-            </w:pPr>
-            <w:r>
-              <w:t xml:space="preserve">A Canadian course with no campus now lists its provider’s province in</w:t>
-            </w:r>
-            <w:r>
-              <w:t xml:space="preserve"> </w:t>
-            </w:r>
-            <w:r>
-              <w:rPr>
-                <w:rStyle w:val="VerbatimChar"/>
-              </w:rPr>
-              <w:t xml:space="preserve">subdivision_codes</w:t>
-            </w:r>
-            <w:r>
-              <w:t xml:space="preserve"> </w:t>
-            </w:r>
-            <w:r>
-              <w:t xml:space="preserve">(all 4,723 Canadian courses have one; 2,332 before). Intake months are no longer repeated in</w:t>
-            </w:r>
-            <w:r>
-              <w:t xml:space="preserve"> </w:t>
-            </w:r>
-            <w:r>
-              <w:rPr>
-                <w:rStyle w:val="VerbatimChar"/>
-              </w:rPr>
-              <w:t xml:space="preserve">intakes[]</w:t>
-            </w:r>
-            <w:r>
-              <w:t xml:space="preserve"> </w:t>
-            </w:r>
-            <w:r>
-              <w:t xml:space="preserve">(a month was listed twice for 410 courses)</w:t>
-            </w:r>
-          </w:p>
-        </w:tc>
-      </w:tr>
-      <w:tr>
-        <w:tc>
-          <w:tcPr/>
-          <w:p>
-            <w:pPr>
-              <w:pStyle w:val="Compact"/>
-              <w:jc w:val="left"/>
-            </w:pPr>
-            <w:r>
-              <w:t xml:space="preserve">15 October 2026 (evening)</w:t>
-            </w:r>
-          </w:p>
-        </w:tc>
-        <w:tc>
-          <w:tcPr/>
-          <w:p>
-            <w:pPr>
-              <w:pStyle w:val="Compact"/>
-              <w:jc w:val="left"/>
-            </w:pPr>
-            <w:r>
-              <w:t xml:space="preserve">Each city in</w:t>
-            </w:r>
-            <w:r>
-              <w:t xml:space="preserve"> </w:t>
-            </w:r>
-            <w:r>
-              <w:rPr>
-                <w:rStyle w:val="VerbatimChar"/>
-              </w:rPr>
-              <w:t xml:space="preserve">reference</w:t>
-            </w:r>
-            <w:r>
-              <w:t xml:space="preserve"> </w:t>
-            </w:r>
-            <w:r>
-              <w:t xml:space="preserve">is now listed under the metro area most of its campuses have (Sydney was listed under Brisbane), and two campuses registered under the wrong state now carry the state their address names. More providers have a logo (49 that morning, 265 now, rising daily as logos are found on providers’ own websites): copy each new logo into Wix Media as before. Acceptance test counts refreshed. No field added, renamed or removed</w:t>
             </w:r>
           </w:p>
         </w:tc>

</xml_diff>

<commit_message>
CF-247 e138: faster Wix full load (prepared items, pages up to 200); developer guide issue 2 with expectations (6.1, 6.2); OpenAPI and Postman regenerated; register v1.9; System reference 1.21
Co-Authored-By: Claude Opus 5.5 <noreply@anthropic.com>
Claude-Session: https://claude.ai/code/session_01RnriTf32Hcv4Xqnq2DF1qq
</commit_message>
<xml_diff>
--- a/docs/integrations/developer-pack/StudySearch-Website-API-Developer-Guide.docx
+++ b/docs/integrations/developer-pack/StudySearch-Website-API-Developer-Guide.docx
@@ -1176,7 +1176,7 @@
         <w:t xml:space="preserve"> </w:t>
       </w:r>
       <w:r>
-        <w:t xml:space="preserve">starts at 1.</w:t>
+        <w:t xml:space="preserve">starts at 1. For the list actions</w:t>
       </w:r>
       <w:r>
         <w:t xml:space="preserve"> </w:t>
@@ -1191,7 +1191,22 @@
         <w:t xml:space="preserve"> </w:t>
       </w:r>
       <w:r>
-        <w:t xml:space="preserve">is 1–50 (default 20).</w:t>
+        <w:t xml:space="preserve">is 1–50 (default 20);</w:t>
+      </w:r>
+      <w:r>
+        <w:t xml:space="preserve"> </w:t>
+      </w:r>
+      <w:r>
+        <w:rPr>
+          <w:rStyle w:val="VerbatimChar"/>
+        </w:rPr>
+        <w:t xml:space="preserve">sync</w:t>
+      </w:r>
+      <w:r>
+        <w:t xml:space="preserve"> </w:t>
+      </w:r>
+      <w:r>
+        <w:t xml:space="preserve">pages are covered in section 6.</w:t>
       </w:r>
     </w:p>
     <w:p>
@@ -2192,7 +2207,7 @@
       </w:r>
     </w:p>
     <w:bookmarkEnd w:id="24"/>
-    <w:bookmarkStart w:id="25" w:name="sync-full-load-then-only-what-changed"/>
+    <w:bookmarkStart w:id="27" w:name="sync-full-load-then-only-what-changed"/>
     <w:p>
       <w:pPr>
         <w:pStyle w:val="Heading1"/>
@@ -2376,7 +2391,7 @@
         <w:rPr>
           <w:rStyle w:val="DecValTok"/>
         </w:rPr>
-        <w:t xml:space="preserve">50</w:t>
+        <w:t xml:space="preserve">200</w:t>
       </w:r>
       <w:r>
         <w:br/>
@@ -2829,7 +2844,7 @@
               <w:jc w:val="left"/>
             </w:pPr>
             <w:r>
-              <w:t xml:space="preserve">1–50 (default 50)</w:t>
+              <w:t xml:space="preserve">1–200 (default 200). A page also stops at about 550 KB, so large items (provider details, scholarships) come fewer to a page</w:t>
             </w:r>
           </w:p>
         </w:tc>
@@ -3749,7 +3764,7 @@
         <w:t xml:space="preserve"> </w:t>
       </w:r>
       <w:r>
-        <w:t xml:space="preserve">items when they are large (a page of provider details holds 3). Keep going while</w:t>
+        <w:t xml:space="preserve">items when they are large. Keep going while</w:t>
       </w:r>
       <w:r>
         <w:t xml:space="preserve"> </w:t>
@@ -3776,7 +3791,7 @@
         <w:pStyle w:val="Compact"/>
       </w:pPr>
       <w:r>
-        <w:t xml:space="preserve">A full load is about 40,600 items (15 October 2026): about 1,400 calls, roughly 25 minutes within the limit of 60 calls a minute.</w:t>
+        <w:t xml:space="preserve">The platform checks every item for changes every minute in a rolling pass; a full pass takes about 90 minutes. A change appears in a later delta.</w:t>
       </w:r>
     </w:p>
     <w:p>
@@ -3788,7 +3803,19 @@
         <w:pStyle w:val="Compact"/>
       </w:pPr>
       <w:r>
-        <w:t xml:space="preserve">The platform checks every item for changes every minute in a rolling pass; a full pass takes about 90 minutes. A change appears in a later delta.</w:t>
+        <w:t xml:space="preserve">A removal comes as</w:t>
+      </w:r>
+      <w:r>
+        <w:t xml:space="preserve"> </w:t>
+      </w:r>
+      <w:r>
+        <w:rPr>
+          <w:rStyle w:val="VerbatimChar"/>
+        </w:rPr>
+        <w:t xml:space="preserve">change: "remove"</w:t>
+      </w:r>
+      <w:r>
+        <w:t xml:space="preserve">: for example a provider switched off (with its courses, logo and rankings) or a scholarship no longer published.</w:t>
       </w:r>
     </w:p>
     <w:p>
@@ -3800,26 +3827,286 @@
         <w:pStyle w:val="Compact"/>
       </w:pPr>
       <w:r>
-        <w:t xml:space="preserve">A removal comes as</w:t>
-      </w:r>
-      <w:r>
-        <w:t xml:space="preserve"> </w:t>
+        <w:rPr>
+          <w:bCs/>
+          <w:b/>
+        </w:rPr>
+        <w:t xml:space="preserve">Logos:</w:t>
+      </w:r>
+      <w:r>
+        <w:t xml:space="preserve"> </w:t>
+      </w:r>
+      <w:r>
+        <w:t xml:space="preserve">each logo link is valid for 365 days (</w:t>
       </w:r>
       <w:r>
         <w:rPr>
           <w:rStyle w:val="VerbatimChar"/>
         </w:rPr>
-        <w:t xml:space="preserve">change: "remove"</w:t>
-      </w:r>
-      <w:r>
-        <w:t xml:space="preserve">: for example a provider switched off (with its courses, logo and rankings) or a scholarship no longer published.</w:t>
+        <w:t xml:space="preserve">url_expires_at</w:t>
+      </w:r>
+      <w:r>
+        <w:t xml:space="preserve">). Copy the file into Wix Media and serve your copy; never link to the signed URL from a visitor page. The platform sends a logo again with a new link 30 days before the old one ends, and whenever the file changes (</w:t>
+      </w:r>
+      <w:r>
+        <w:rPr>
+          <w:rStyle w:val="VerbatimChar"/>
+        </w:rPr>
+        <w:t xml:space="preserve">content_hash</w:t>
+      </w:r>
+      <w:r>
+        <w:t xml:space="preserve">).</w:t>
+      </w:r>
+    </w:p>
+    <w:bookmarkStart w:id="25" w:name="full-load-what-to-expect"/>
+    <w:p>
+      <w:pPr>
+        <w:pStyle w:val="Heading2"/>
+      </w:pPr>
+      <w:r>
+        <w:t xml:space="preserve">6.1 Full load: what to expect</w:t>
+      </w:r>
+    </w:p>
+    <w:p>
+      <w:pPr>
+        <w:pStyle w:val="FirstParagraph"/>
+      </w:pPr>
+      <w:r>
+        <w:t xml:space="preserve">Measured on Pilot on 15 October 2026.</w:t>
+      </w:r>
+    </w:p>
+    <w:tbl>
+      <w:tblPr>
+        <w:tblStyle w:val="Table"/>
+        <w:tblW w:type="pct" w:w="5000"/>
+        <w:tblLook w:firstRow="1" w:lastRow="0" w:firstColumn="0" w:lastColumn="0" w:noHBand="0" w:noVBand="0" w:val="0020"/>
+        <w:jc w:val="start"/>
+        <w:tblBorders>
+          <w:top w:val="single" w:sz="4" w:color="BFBFBF"/>
+          <w:left w:val="single" w:sz="4" w:color="BFBFBF"/>
+          <w:bottom w:val="single" w:sz="4" w:color="BFBFBF"/>
+          <w:right w:val="single" w:sz="4" w:color="BFBFBF"/>
+          <w:insideH w:val="single" w:sz="4" w:color="BFBFBF"/>
+          <w:insideV w:val="single" w:sz="4" w:color="BFBFBF"/>
+        </w:tblBorders>
+      </w:tblPr>
+      <w:tblGrid>
+        <w:gridCol w:w="3960"/>
+        <w:gridCol w:w="3960"/>
+      </w:tblGrid>
+      <w:tr>
+        <w:trPr>
+          <w:tblHeader w:val="true"/>
+        </w:trPr>
+        <w:tc>
+          <w:tcPr>
+            <w:shd w:val="clear" w:color="auto" w:fill="1F3864"/>
+          </w:tcPr>
+          <w:p>
+            <w:pPr>
+              <w:pStyle w:val="Compact"/>
+              <w:jc w:val="left"/>
+            </w:pPr>
+            <w:r>
+              <w:rPr>
+                <w:b/>
+                <w:color w:val="FFFFFF"/>
+              </w:rPr>
+              <w:t xml:space="preserve">Measure</w:t>
+            </w:r>
+          </w:p>
+        </w:tc>
+        <w:tc>
+          <w:tcPr>
+            <w:shd w:val="clear" w:color="auto" w:fill="1F3864"/>
+          </w:tcPr>
+          <w:p>
+            <w:pPr>
+              <w:pStyle w:val="Compact"/>
+              <w:jc w:val="left"/>
+            </w:pPr>
+            <w:r>
+              <w:rPr>
+                <w:b/>
+                <w:color w:val="FFFFFF"/>
+              </w:rPr>
+              <w:t xml:space="preserve">Full load</w:t>
+            </w:r>
+          </w:p>
+        </w:tc>
+      </w:tr>
+      <w:tr>
+        <w:tc>
+          <w:tcPr/>
+          <w:p>
+            <w:pPr>
+              <w:pStyle w:val="Compact"/>
+              <w:jc w:val="left"/>
+            </w:pPr>
+            <w:r>
+              <w:t xml:space="preserve">Items</w:t>
+            </w:r>
+          </w:p>
+        </w:tc>
+        <w:tc>
+          <w:tcPr/>
+          <w:p>
+            <w:pPr>
+              <w:pStyle w:val="Compact"/>
+              <w:jc w:val="left"/>
+            </w:pPr>
+            <w:r>
+              <w:t xml:space="preserve">About 40,600 (courses 37,300; providers 1,885; scholarships 1,100; logos 275; ranking sets 56; reference 1)</w:t>
+            </w:r>
+          </w:p>
+        </w:tc>
+      </w:tr>
+      <w:tr>
+        <w:tc>
+          <w:tcPr/>
+          <w:p>
+            <w:pPr>
+              <w:pStyle w:val="Compact"/>
+              <w:jc w:val="left"/>
+            </w:pPr>
+            <w:r>
+              <w:t xml:space="preserve">Calls</w:t>
+            </w:r>
+          </w:p>
+        </w:tc>
+        <w:tc>
+          <w:tcPr/>
+          <w:p>
+            <w:pPr>
+              <w:pStyle w:val="Compact"/>
+              <w:jc w:val="left"/>
+            </w:pPr>
+            <w:r>
+              <w:t xml:space="preserve">About 250 at the default page size</w:t>
+            </w:r>
+          </w:p>
+        </w:tc>
+      </w:tr>
+      <w:tr>
+        <w:tc>
+          <w:tcPr/>
+          <w:p>
+            <w:pPr>
+              <w:pStyle w:val="Compact"/>
+              <w:jc w:val="left"/>
+            </w:pPr>
+            <w:r>
+              <w:t xml:space="preserve">Data</w:t>
+            </w:r>
+          </w:p>
+        </w:tc>
+        <w:tc>
+          <w:tcPr/>
+          <w:p>
+            <w:pPr>
+              <w:pStyle w:val="Compact"/>
+              <w:jc w:val="left"/>
+            </w:pPr>
+            <w:r>
+              <w:t xml:space="preserve">About 100 MB of JSON in total; the largest page about 550 KB</w:t>
+            </w:r>
+          </w:p>
+        </w:tc>
+      </w:tr>
+      <w:tr>
+        <w:tc>
+          <w:tcPr/>
+          <w:p>
+            <w:pPr>
+              <w:pStyle w:val="Compact"/>
+              <w:jc w:val="left"/>
+            </w:pPr>
+            <w:r>
+              <w:t xml:space="preserve">Reply time</w:t>
+            </w:r>
+          </w:p>
+        </w:tc>
+        <w:tc>
+          <w:tcPr/>
+          <w:p>
+            <w:pPr>
+              <w:pStyle w:val="Compact"/>
+              <w:jc w:val="left"/>
+            </w:pPr>
+            <w:r>
+              <w:t xml:space="preserve">Under a second a page</w:t>
+            </w:r>
+          </w:p>
+        </w:tc>
+      </w:tr>
+      <w:tr>
+        <w:tc>
+          <w:tcPr/>
+          <w:p>
+            <w:pPr>
+              <w:pStyle w:val="Compact"/>
+              <w:jc w:val="left"/>
+            </w:pPr>
+            <w:r>
+              <w:t xml:space="preserve">Elapsed time</w:t>
+            </w:r>
+          </w:p>
+        </w:tc>
+        <w:tc>
+          <w:tcPr/>
+          <w:p>
+            <w:pPr>
+              <w:pStyle w:val="Compact"/>
+              <w:jc w:val="left"/>
+            </w:pPr>
+            <w:r>
+              <w:t xml:space="preserve">About 5 minutes, paced at the limit of 60 calls a minute</w:t>
+            </w:r>
+          </w:p>
+        </w:tc>
+      </w:tr>
+      <w:tr>
+        <w:tc>
+          <w:tcPr/>
+          <w:p>
+            <w:pPr>
+              <w:pStyle w:val="Compact"/>
+              <w:jc w:val="left"/>
+            </w:pPr>
+            <w:r>
+              <w:t xml:space="preserve">After the full load</w:t>
+            </w:r>
+          </w:p>
+        </w:tc>
+        <w:tc>
+          <w:tcPr/>
+          <w:p>
+            <w:pPr>
+              <w:pStyle w:val="Compact"/>
+              <w:jc w:val="left"/>
+            </w:pPr>
+            <w:r>
+              <w:t xml:space="preserve">A delta is usually one call; the platform checks every item for changes within about 90 minutes, and a change appears in the next delta after that</w:t>
+            </w:r>
+          </w:p>
+        </w:tc>
+      </w:tr>
+    </w:tbl>
+    <w:bookmarkEnd w:id="25"/>
+    <w:bookmarkStart w:id="26" w:name="what-we-expect-from-your-sync-job"/>
+    <w:p>
+      <w:pPr>
+        <w:pStyle w:val="Heading2"/>
+      </w:pPr>
+      <w:r>
+        <w:t xml:space="preserve">6.2 What we expect from your sync job</w:t>
       </w:r>
     </w:p>
     <w:p>
       <w:pPr>
         <w:numPr>
           <w:ilvl w:val="0"/>
-          <w:numId w:val="1007"/>
+          <w:numId w:val="1008"/>
         </w:numPr>
         <w:pStyle w:val="Compact"/>
       </w:pPr>
@@ -3828,35 +4115,197 @@
           <w:bCs/>
           <w:b/>
         </w:rPr>
-        <w:t xml:space="preserve">Logos:</w:t>
-      </w:r>
-      <w:r>
-        <w:t xml:space="preserve"> </w:t>
-      </w:r>
-      <w:r>
-        <w:t xml:space="preserve">each logo link is valid for 365 days (</w:t>
+        <w:t xml:space="preserve">Run it as a scheduled backend job that can resume.</w:t>
+      </w:r>
+      <w:r>
+        <w:t xml:space="preserve"> </w:t>
+      </w:r>
+      <w:r>
+        <w:t xml:space="preserve">Save</w:t>
+      </w:r>
+      <w:r>
+        <w:t xml:space="preserve"> </w:t>
       </w:r>
       <w:r>
         <w:rPr>
           <w:rStyle w:val="VerbatimChar"/>
         </w:rPr>
-        <w:t xml:space="preserve">url_expires_at</w:t>
-      </w:r>
-      <w:r>
-        <w:t xml:space="preserve">). Copy the file into Wix Media and serve your copy; never link to the signed URL from a visitor page. The platform sends a logo again with a new link 30 days before the old one ends, and whenever the file changes (</w:t>
+        <w:t xml:space="preserve">next_cursor</w:t>
+      </w:r>
+      <w:r>
+        <w:t xml:space="preserve"> </w:t>
+      </w:r>
+      <w:r>
+        <w:t xml:space="preserve">after each page is written. If the job stops (for example at a Wix time limit), the next run carries on from the saved cursor.</w:t>
+      </w:r>
+    </w:p>
+    <w:p>
+      <w:pPr>
+        <w:numPr>
+          <w:ilvl w:val="0"/>
+          <w:numId w:val="1008"/>
+        </w:numPr>
+        <w:pStyle w:val="Compact"/>
+      </w:pPr>
+      <w:r>
+        <w:rPr>
+          <w:bCs/>
+          <w:b/>
+        </w:rPr>
+        <w:t xml:space="preserve">One cursor at a time.</w:t>
+      </w:r>
+      <w:r>
+        <w:t xml:space="preserve"> </w:t>
+      </w:r>
+      <w:r>
+        <w:t xml:space="preserve">Each call needs the previous reply’s cursor; do not start a second full load while one is running.</w:t>
+      </w:r>
+    </w:p>
+    <w:p>
+      <w:pPr>
+        <w:numPr>
+          <w:ilvl w:val="0"/>
+          <w:numId w:val="1008"/>
+        </w:numPr>
+        <w:pStyle w:val="Compact"/>
+      </w:pPr>
+      <w:r>
+        <w:rPr>
+          <w:bCs/>
+          <w:b/>
+        </w:rPr>
+        <w:t xml:space="preserve">Stay within 60 calls a minute.</w:t>
+      </w:r>
+      <w:r>
+        <w:t xml:space="preserve"> </w:t>
+      </w:r>
+      <w:r>
+        <w:t xml:space="preserve">On 429, wait for</w:t>
+      </w:r>
+      <w:r>
+        <w:t xml:space="preserve"> </w:t>
       </w:r>
       <w:r>
         <w:rPr>
           <w:rStyle w:val="VerbatimChar"/>
         </w:rPr>
-        <w:t xml:space="preserve">content_hash</w:t>
-      </w:r>
-      <w:r>
-        <w:t xml:space="preserve">).</w:t>
+        <w:t xml:space="preserve">Retry-After</w:t>
+      </w:r>
+      <w:r>
+        <w:t xml:space="preserve"> </w:t>
+      </w:r>
+      <w:r>
+        <w:t xml:space="preserve">and send the same cursor again.</w:t>
       </w:r>
     </w:p>
-    <w:bookmarkEnd w:id="25"/>
-    <w:bookmarkStart w:id="34" w:name="actions-and-data"/>
+    <w:p>
+      <w:pPr>
+        <w:numPr>
+          <w:ilvl w:val="0"/>
+          <w:numId w:val="1008"/>
+        </w:numPr>
+        <w:pStyle w:val="Compact"/>
+      </w:pPr>
+      <w:r>
+        <w:rPr>
+          <w:bCs/>
+          <w:b/>
+        </w:rPr>
+        <w:t xml:space="preserve">Write each page in one bulk save,</w:t>
+      </w:r>
+      <w:r>
+        <w:t xml:space="preserve"> </w:t>
+      </w:r>
+      <w:r>
+        <w:t xml:space="preserve">upserting by</w:t>
+      </w:r>
+      <w:r>
+        <w:t xml:space="preserve"> </w:t>
+      </w:r>
+      <w:r>
+        <w:rPr>
+          <w:rStyle w:val="VerbatimChar"/>
+        </w:rPr>
+        <w:t xml:space="preserve">id</w:t>
+      </w:r>
+      <w:r>
+        <w:t xml:space="preserve">; delete by</w:t>
+      </w:r>
+      <w:r>
+        <w:t xml:space="preserve"> </w:t>
+      </w:r>
+      <w:r>
+        <w:rPr>
+          <w:rStyle w:val="VerbatimChar"/>
+        </w:rPr>
+        <w:t xml:space="preserve">id</w:t>
+      </w:r>
+      <w:r>
+        <w:t xml:space="preserve"> </w:t>
+      </w:r>
+      <w:r>
+        <w:t xml:space="preserve">on</w:t>
+      </w:r>
+      <w:r>
+        <w:t xml:space="preserve"> </w:t>
+      </w:r>
+      <w:r>
+        <w:rPr>
+          <w:rStyle w:val="VerbatimChar"/>
+        </w:rPr>
+        <w:t xml:space="preserve">remove</w:t>
+      </w:r>
+      <w:r>
+        <w:t xml:space="preserve">.</w:t>
+      </w:r>
+    </w:p>
+    <w:p>
+      <w:pPr>
+        <w:numPr>
+          <w:ilvl w:val="0"/>
+          <w:numId w:val="1008"/>
+        </w:numPr>
+        <w:pStyle w:val="Compact"/>
+      </w:pPr>
+      <w:r>
+        <w:rPr>
+          <w:bCs/>
+          <w:b/>
+        </w:rPr>
+        <w:t xml:space="preserve">After the full load, run a delta every 5 to 15 minutes.</w:t>
+      </w:r>
+      <w:r>
+        <w:t xml:space="preserve"> </w:t>
+      </w:r>
+      <w:r>
+        <w:t xml:space="preserve">Run a full load again only to rebuild your collections.</w:t>
+      </w:r>
+    </w:p>
+    <w:p>
+      <w:pPr>
+        <w:numPr>
+          <w:ilvl w:val="0"/>
+          <w:numId w:val="1008"/>
+        </w:numPr>
+        <w:pStyle w:val="Compact"/>
+      </w:pPr>
+      <w:r>
+        <w:rPr>
+          <w:bCs/>
+          <w:b/>
+        </w:rPr>
+        <w:t xml:space="preserve">Copy each new or renewed logo into Wix Media</w:t>
+      </w:r>
+      <w:r>
+        <w:t xml:space="preserve"> </w:t>
+      </w:r>
+      <w:r>
+        <w:t xml:space="preserve">in the run that receives it.</w:t>
+      </w:r>
+    </w:p>
+    <w:bookmarkEnd w:id="26"/>
+    <w:bookmarkEnd w:id="27"/>
+    <w:bookmarkStart w:id="36" w:name="actions-and-data"/>
     <w:p>
       <w:pPr>
         <w:pStyle w:val="Heading1"/>
@@ -4536,7 +4985,7 @@
         </w:tc>
       </w:tr>
     </w:tbl>
-    <w:bookmarkStart w:id="26" w:name="reference"/>
+    <w:bookmarkStart w:id="28" w:name="reference"/>
     <w:p>
       <w:pPr>
         <w:pStyle w:val="Heading2"/>
@@ -4657,8 +5106,8 @@
         <w:t xml:space="preserve">says when the counts were built (every 15 minutes).</w:t>
       </w:r>
     </w:p>
-    <w:bookmarkEnd w:id="26"/>
-    <w:bookmarkStart w:id="27" w:name="search-course-finder"/>
+    <w:bookmarkEnd w:id="28"/>
+    <w:bookmarkStart w:id="29" w:name="search-course-finder"/>
     <w:p>
       <w:pPr>
         <w:pStyle w:val="Heading2"/>
@@ -7162,8 +7611,8 @@
         </w:tc>
       </w:tr>
     </w:tbl>
-    <w:bookmarkEnd w:id="27"/>
-    <w:bookmarkStart w:id="28" w:name="course-detail"/>
+    <w:bookmarkEnd w:id="29"/>
+    <w:bookmarkStart w:id="30" w:name="course-detail"/>
     <w:p>
       <w:pPr>
         <w:pStyle w:val="Heading2"/>
@@ -7431,8 +7880,8 @@
         <w:t xml:space="preserve">(the provider’s QILT statistics, as in 7.4).</w:t>
       </w:r>
     </w:p>
-    <w:bookmarkEnd w:id="28"/>
-    <w:bookmarkStart w:id="29" w:name="providers-and-provider-university-finder"/>
+    <w:bookmarkEnd w:id="30"/>
+    <w:bookmarkStart w:id="31" w:name="providers-and-provider-university-finder"/>
     <w:p>
       <w:pPr>
         <w:pStyle w:val="Heading2"/>
@@ -8971,8 +9420,8 @@
         <w:t xml:space="preserve">An average tuition per provider is not returned: there is no sound basis for one.</w:t>
       </w:r>
     </w:p>
-    <w:bookmarkEnd w:id="29"/>
-    <w:bookmarkStart w:id="30" w:name="Xfb71ca4790f1d65c8dcc94c263d00ffddef2aba"/>
+    <w:bookmarkEnd w:id="31"/>
+    <w:bookmarkStart w:id="32" w:name="Xfb71ca4790f1d65c8dcc94c263d00ffddef2aba"/>
     <w:p>
       <w:pPr>
         <w:pStyle w:val="Heading2"/>
@@ -10421,8 +10870,8 @@
         </w:tc>
       </w:tr>
     </w:tbl>
-    <w:bookmarkEnd w:id="30"/>
-    <w:bookmarkStart w:id="31" w:name="rankings"/>
+    <w:bookmarkEnd w:id="32"/>
+    <w:bookmarkStart w:id="33" w:name="rankings"/>
     <w:p>
       <w:pPr>
         <w:pStyle w:val="Heading2"/>
@@ -11088,8 +11537,8 @@
         <w:t xml:space="preserve">with every ranking.</w:t>
       </w:r>
     </w:p>
-    <w:bookmarkEnd w:id="31"/>
-    <w:bookmarkStart w:id="32" w:name="logos"/>
+    <w:bookmarkEnd w:id="33"/>
+    <w:bookmarkStart w:id="34" w:name="logos"/>
     <w:p>
       <w:pPr>
         <w:pStyle w:val="Heading2"/>
@@ -11125,133 +11574,6 @@
       </w:r>
       <w:r>
         <w:t xml:space="preserve">where no approved logo is held.</w:t>
-      </w:r>
-    </w:p>
-    <w:p>
-      <w:pPr>
-        <w:numPr>
-          <w:ilvl w:val="0"/>
-          <w:numId w:val="1008"/>
-        </w:numPr>
-        <w:pStyle w:val="Compact"/>
-      </w:pPr>
-      <w:r>
-        <w:t xml:space="preserve">One primary logo per provider, from the provider’s own website, as published (SVG, PNG or JPEG; not recoloured or resized).</w:t>
-      </w:r>
-    </w:p>
-    <w:p>
-      <w:pPr>
-        <w:numPr>
-          <w:ilvl w:val="0"/>
-          <w:numId w:val="1008"/>
-        </w:numPr>
-        <w:pStyle w:val="Compact"/>
-      </w:pPr>
-      <w:r>
-        <w:rPr>
-          <w:rStyle w:val="VerbatimChar"/>
-        </w:rPr>
-        <w:t xml:space="preserve">url</w:t>
-      </w:r>
-      <w:r>
-        <w:t xml:space="preserve"> </w:t>
-      </w:r>
-      <w:r>
-        <w:t xml:space="preserve">is a signed link valid for 365 days. Copy the file to Wix Media and serve your copy. Copy it again when</w:t>
-      </w:r>
-      <w:r>
-        <w:t xml:space="preserve"> </w:t>
-      </w:r>
-      <w:r>
-        <w:rPr>
-          <w:rStyle w:val="VerbatimChar"/>
-        </w:rPr>
-        <w:t xml:space="preserve">content_hash</w:t>
-      </w:r>
-      <w:r>
-        <w:t xml:space="preserve"> </w:t>
-      </w:r>
-      <w:r>
-        <w:t xml:space="preserve">changes or when</w:t>
-      </w:r>
-      <w:r>
-        <w:t xml:space="preserve"> </w:t>
-      </w:r>
-      <w:r>
-        <w:rPr>
-          <w:rStyle w:val="VerbatimChar"/>
-        </w:rPr>
-        <w:t xml:space="preserve">sync</w:t>
-      </w:r>
-      <w:r>
-        <w:t xml:space="preserve"> </w:t>
-      </w:r>
-      <w:r>
-        <w:t xml:space="preserve">sends the logo again.</w:t>
-      </w:r>
-    </w:p>
-    <w:p>
-      <w:pPr>
-        <w:numPr>
-          <w:ilvl w:val="0"/>
-          <w:numId w:val="1008"/>
-        </w:numPr>
-        <w:pStyle w:val="Compact"/>
-      </w:pPr>
-      <w:r>
-        <w:t xml:space="preserve">If signing fails for a call,</w:t>
-      </w:r>
-      <w:r>
-        <w:t xml:space="preserve"> </w:t>
-      </w:r>
-      <w:r>
-        <w:rPr>
-          <w:rStyle w:val="VerbatimChar"/>
-        </w:rPr>
-        <w:t xml:space="preserve">url</w:t>
-      </w:r>
-      <w:r>
-        <w:t xml:space="preserve"> </w:t>
-      </w:r>
-      <w:r>
-        <w:t xml:space="preserve">is</w:t>
-      </w:r>
-      <w:r>
-        <w:t xml:space="preserve"> </w:t>
-      </w:r>
-      <w:r>
-        <w:rPr>
-          <w:rStyle w:val="VerbatimChar"/>
-        </w:rPr>
-        <w:t xml:space="preserve">null</w:t>
-      </w:r>
-      <w:r>
-        <w:t xml:space="preserve"> </w:t>
-      </w:r>
-      <w:r>
-        <w:t xml:space="preserve">for that call only; the rest of the response is unaffected.</w:t>
-      </w:r>
-    </w:p>
-    <w:p>
-      <w:pPr>
-        <w:numPr>
-          <w:ilvl w:val="0"/>
-          <w:numId w:val="1008"/>
-        </w:numPr>
-        <w:pStyle w:val="Compact"/>
-      </w:pPr>
-      <w:r>
-        <w:t xml:space="preserve">A dark variant and a brand colour are not held.</w:t>
-      </w:r>
-    </w:p>
-    <w:bookmarkEnd w:id="32"/>
-    <w:bookmarkStart w:id="33" w:name="tuition-rules"/>
-    <w:p>
-      <w:pPr>
-        <w:pStyle w:val="Heading2"/>
-      </w:pPr>
-      <w:r>
-        <w:t xml:space="preserve">7.8 Tuition rules</w:t>
       </w:r>
     </w:p>
     <w:p>
@@ -11263,94 +11585,7 @@
         <w:pStyle w:val="Compact"/>
       </w:pPr>
       <w:r>
-        <w:rPr>
-          <w:rStyle w:val="VerbatimChar"/>
-        </w:rPr>
-        <w:t xml:space="preserve">basis</w:t>
-      </w:r>
-      <w:r>
-        <w:t xml:space="preserve"> </w:t>
-      </w:r>
-      <w:r>
-        <w:t xml:space="preserve">is always stated:</w:t>
-      </w:r>
-      <w:r>
-        <w:t xml:space="preserve"> </w:t>
-      </w:r>
-      <w:r>
-        <w:rPr>
-          <w:rStyle w:val="VerbatimChar"/>
-        </w:rPr>
-        <w:t xml:space="preserve">annual</w:t>
-      </w:r>
-      <w:r>
-        <w:t xml:space="preserve">,</w:t>
-      </w:r>
-      <w:r>
-        <w:t xml:space="preserve"> </w:t>
-      </w:r>
-      <w:r>
-        <w:rPr>
-          <w:rStyle w:val="VerbatimChar"/>
-        </w:rPr>
-        <w:t xml:space="preserve">indicative_annual</w:t>
-      </w:r>
-      <w:r>
-        <w:t xml:space="preserve">,</w:t>
-      </w:r>
-      <w:r>
-        <w:t xml:space="preserve"> </w:t>
-      </w:r>
-      <w:r>
-        <w:rPr>
-          <w:rStyle w:val="VerbatimChar"/>
-        </w:rPr>
-        <w:t xml:space="preserve">course_total</w:t>
-      </w:r>
-      <w:r>
-        <w:t xml:space="preserve">,</w:t>
-      </w:r>
-      <w:r>
-        <w:t xml:space="preserve"> </w:t>
-      </w:r>
-      <w:r>
-        <w:rPr>
-          <w:rStyle w:val="VerbatimChar"/>
-        </w:rPr>
-        <w:t xml:space="preserve">per_session</w:t>
-      </w:r>
-      <w:r>
-        <w:t xml:space="preserve"> </w:t>
-      </w:r>
-      <w:r>
-        <w:t xml:space="preserve">or</w:t>
-      </w:r>
-      <w:r>
-        <w:t xml:space="preserve"> </w:t>
-      </w:r>
-      <w:r>
-        <w:rPr>
-          <w:rStyle w:val="VerbatimChar"/>
-        </w:rPr>
-        <w:t xml:space="preserve">unspecified</w:t>
-      </w:r>
-      <w:r>
-        <w:t xml:space="preserve">.</w:t>
-      </w:r>
-      <w:r>
-        <w:t xml:space="preserve"> </w:t>
-      </w:r>
-      <w:r>
-        <w:rPr>
-          <w:rStyle w:val="VerbatimChar"/>
-        </w:rPr>
-        <w:t xml:space="preserve">basis_label</w:t>
-      </w:r>
-      <w:r>
-        <w:t xml:space="preserve"> </w:t>
-      </w:r>
-      <w:r>
-        <w:t xml:space="preserve">keeps the provider’s own words.</w:t>
+        <w:t xml:space="preserve">One primary logo per provider, from the provider’s own website, as published (SVG, PNG or JPEG; not recoloured or resized).</w:t>
       </w:r>
     </w:p>
     <w:p>
@@ -11365,13 +11600,13 @@
         <w:rPr>
           <w:rStyle w:val="VerbatimChar"/>
         </w:rPr>
-        <w:t xml:space="preserve">source</w:t>
-      </w:r>
-      <w:r>
-        <w:t xml:space="preserve"> </w:t>
-      </w:r>
-      <w:r>
-        <w:t xml:space="preserve">is</w:t>
+        <w:t xml:space="preserve">url</w:t>
+      </w:r>
+      <w:r>
+        <w:t xml:space="preserve"> </w:t>
+      </w:r>
+      <w:r>
+        <w:t xml:space="preserve">is a signed link valid for 365 days. Copy the file to Wix Media and serve your copy. Copy it again when</w:t>
       </w:r>
       <w:r>
         <w:t xml:space="preserve"> </w:t>
@@ -11380,13 +11615,13 @@
         <w:rPr>
           <w:rStyle w:val="VerbatimChar"/>
         </w:rPr>
-        <w:t xml:space="preserve">provider_current</w:t>
-      </w:r>
-      <w:r>
-        <w:t xml:space="preserve"> </w:t>
-      </w:r>
-      <w:r>
-        <w:t xml:space="preserve">(the provider’s current fee page, preferred) or</w:t>
+        <w:t xml:space="preserve">content_hash</w:t>
+      </w:r>
+      <w:r>
+        <w:t xml:space="preserve"> </w:t>
+      </w:r>
+      <w:r>
+        <w:t xml:space="preserve">changes or when</w:t>
       </w:r>
       <w:r>
         <w:t xml:space="preserve"> </w:t>
@@ -11395,13 +11630,13 @@
         <w:rPr>
           <w:rStyle w:val="VerbatimChar"/>
         </w:rPr>
-        <w:t xml:space="preserve">regulatory_registered</w:t>
-      </w:r>
-      <w:r>
-        <w:t xml:space="preserve"> </w:t>
-      </w:r>
-      <w:r>
-        <w:t xml:space="preserve">(the Australian CRICOS registered course total).</w:t>
+        <w:t xml:space="preserve">sync</w:t>
+      </w:r>
+      <w:r>
+        <w:t xml:space="preserve"> </w:t>
+      </w:r>
+      <w:r>
+        <w:t xml:space="preserve">sends the logo again.</w:t>
       </w:r>
     </w:p>
     <w:p>
@@ -11413,16 +11648,22 @@
         <w:pStyle w:val="Compact"/>
       </w:pPr>
       <w:r>
+        <w:t xml:space="preserve">If signing fails for a call,</w:t>
+      </w:r>
+      <w:r>
+        <w:t xml:space="preserve"> </w:t>
+      </w:r>
+      <w:r>
         <w:rPr>
           <w:rStyle w:val="VerbatimChar"/>
         </w:rPr>
-        <w:t xml:space="preserve">annual_amount</w:t>
-      </w:r>
-      <w:r>
-        <w:t xml:space="preserve"> </w:t>
-      </w:r>
-      <w:r>
-        <w:t xml:space="preserve">is the stated annual figure, or is derived from a course total only for courses of 12 months or more (then</w:t>
+        <w:t xml:space="preserve">url</w:t>
+      </w:r>
+      <w:r>
+        <w:t xml:space="preserve"> </w:t>
+      </w:r>
+      <w:r>
+        <w:t xml:space="preserve">is</w:t>
       </w:r>
       <w:r>
         <w:t xml:space="preserve"> </w:t>
@@ -11431,13 +11672,13 @@
         <w:rPr>
           <w:rStyle w:val="VerbatimChar"/>
         </w:rPr>
-        <w:t xml:space="preserve">annual_is_derived</w:t>
-      </w:r>
-      <w:r>
-        <w:t xml:space="preserve"> </w:t>
-      </w:r>
-      <w:r>
-        <w:t xml:space="preserve">is true). Per-session and unspecified figures have no annual amount.</w:t>
+        <w:t xml:space="preserve">null</w:t>
+      </w:r>
+      <w:r>
+        <w:t xml:space="preserve"> </w:t>
+      </w:r>
+      <w:r>
+        <w:t xml:space="preserve">for that call only; the rest of the response is unaffected.</w:t>
       </w:r>
     </w:p>
     <w:p>
@@ -11449,24 +11690,232 @@
         <w:pStyle w:val="Compact"/>
       </w:pPr>
       <w:r>
-        <w:t xml:space="preserve">A whole-course total is never presented as per year. An amount under 1,000 is treated as not held (provider pages use $0 or $1 as placeholders).</w:t>
+        <w:t xml:space="preserve">A dark variant and a brand colour are not held.</w:t>
+      </w:r>
+    </w:p>
+    <w:bookmarkEnd w:id="34"/>
+    <w:bookmarkStart w:id="35" w:name="tuition-rules"/>
+    <w:p>
+      <w:pPr>
+        <w:pStyle w:val="Heading2"/>
+      </w:pPr>
+      <w:r>
+        <w:t xml:space="preserve">7.8 Tuition rules</w:t>
       </w:r>
     </w:p>
     <w:p>
       <w:pPr>
         <w:numPr>
           <w:ilvl w:val="0"/>
-          <w:numId w:val="1009"/>
+          <w:numId w:val="1010"/>
         </w:numPr>
         <w:pStyle w:val="Compact"/>
       </w:pPr>
       <w:r>
+        <w:rPr>
+          <w:rStyle w:val="VerbatimChar"/>
+        </w:rPr>
+        <w:t xml:space="preserve">basis</w:t>
+      </w:r>
+      <w:r>
+        <w:t xml:space="preserve"> </w:t>
+      </w:r>
+      <w:r>
+        <w:t xml:space="preserve">is always stated:</w:t>
+      </w:r>
+      <w:r>
+        <w:t xml:space="preserve"> </w:t>
+      </w:r>
+      <w:r>
+        <w:rPr>
+          <w:rStyle w:val="VerbatimChar"/>
+        </w:rPr>
+        <w:t xml:space="preserve">annual</w:t>
+      </w:r>
+      <w:r>
+        <w:t xml:space="preserve">,</w:t>
+      </w:r>
+      <w:r>
+        <w:t xml:space="preserve"> </w:t>
+      </w:r>
+      <w:r>
+        <w:rPr>
+          <w:rStyle w:val="VerbatimChar"/>
+        </w:rPr>
+        <w:t xml:space="preserve">indicative_annual</w:t>
+      </w:r>
+      <w:r>
+        <w:t xml:space="preserve">,</w:t>
+      </w:r>
+      <w:r>
+        <w:t xml:space="preserve"> </w:t>
+      </w:r>
+      <w:r>
+        <w:rPr>
+          <w:rStyle w:val="VerbatimChar"/>
+        </w:rPr>
+        <w:t xml:space="preserve">course_total</w:t>
+      </w:r>
+      <w:r>
+        <w:t xml:space="preserve">,</w:t>
+      </w:r>
+      <w:r>
+        <w:t xml:space="preserve"> </w:t>
+      </w:r>
+      <w:r>
+        <w:rPr>
+          <w:rStyle w:val="VerbatimChar"/>
+        </w:rPr>
+        <w:t xml:space="preserve">per_session</w:t>
+      </w:r>
+      <w:r>
+        <w:t xml:space="preserve"> </w:t>
+      </w:r>
+      <w:r>
+        <w:t xml:space="preserve">or</w:t>
+      </w:r>
+      <w:r>
+        <w:t xml:space="preserve"> </w:t>
+      </w:r>
+      <w:r>
+        <w:rPr>
+          <w:rStyle w:val="VerbatimChar"/>
+        </w:rPr>
+        <w:t xml:space="preserve">unspecified</w:t>
+      </w:r>
+      <w:r>
+        <w:t xml:space="preserve">.</w:t>
+      </w:r>
+      <w:r>
+        <w:t xml:space="preserve"> </w:t>
+      </w:r>
+      <w:r>
+        <w:rPr>
+          <w:rStyle w:val="VerbatimChar"/>
+        </w:rPr>
+        <w:t xml:space="preserve">basis_label</w:t>
+      </w:r>
+      <w:r>
+        <w:t xml:space="preserve"> </w:t>
+      </w:r>
+      <w:r>
+        <w:t xml:space="preserve">keeps the provider’s own words.</w:t>
+      </w:r>
+    </w:p>
+    <w:p>
+      <w:pPr>
+        <w:numPr>
+          <w:ilvl w:val="0"/>
+          <w:numId w:val="1010"/>
+        </w:numPr>
+        <w:pStyle w:val="Compact"/>
+      </w:pPr>
+      <w:r>
+        <w:rPr>
+          <w:rStyle w:val="VerbatimChar"/>
+        </w:rPr>
+        <w:t xml:space="preserve">source</w:t>
+      </w:r>
+      <w:r>
+        <w:t xml:space="preserve"> </w:t>
+      </w:r>
+      <w:r>
+        <w:t xml:space="preserve">is</w:t>
+      </w:r>
+      <w:r>
+        <w:t xml:space="preserve"> </w:t>
+      </w:r>
+      <w:r>
+        <w:rPr>
+          <w:rStyle w:val="VerbatimChar"/>
+        </w:rPr>
+        <w:t xml:space="preserve">provider_current</w:t>
+      </w:r>
+      <w:r>
+        <w:t xml:space="preserve"> </w:t>
+      </w:r>
+      <w:r>
+        <w:t xml:space="preserve">(the provider’s current fee page, preferred) or</w:t>
+      </w:r>
+      <w:r>
+        <w:t xml:space="preserve"> </w:t>
+      </w:r>
+      <w:r>
+        <w:rPr>
+          <w:rStyle w:val="VerbatimChar"/>
+        </w:rPr>
+        <w:t xml:space="preserve">regulatory_registered</w:t>
+      </w:r>
+      <w:r>
+        <w:t xml:space="preserve"> </w:t>
+      </w:r>
+      <w:r>
+        <w:t xml:space="preserve">(the Australian CRICOS registered course total).</w:t>
+      </w:r>
+    </w:p>
+    <w:p>
+      <w:pPr>
+        <w:numPr>
+          <w:ilvl w:val="0"/>
+          <w:numId w:val="1010"/>
+        </w:numPr>
+        <w:pStyle w:val="Compact"/>
+      </w:pPr>
+      <w:r>
+        <w:rPr>
+          <w:rStyle w:val="VerbatimChar"/>
+        </w:rPr>
+        <w:t xml:space="preserve">annual_amount</w:t>
+      </w:r>
+      <w:r>
+        <w:t xml:space="preserve"> </w:t>
+      </w:r>
+      <w:r>
+        <w:t xml:space="preserve">is the stated annual figure, or is derived from a course total only for courses of 12 months or more (then</w:t>
+      </w:r>
+      <w:r>
+        <w:t xml:space="preserve"> </w:t>
+      </w:r>
+      <w:r>
+        <w:rPr>
+          <w:rStyle w:val="VerbatimChar"/>
+        </w:rPr>
+        <w:t xml:space="preserve">annual_is_derived</w:t>
+      </w:r>
+      <w:r>
+        <w:t xml:space="preserve"> </w:t>
+      </w:r>
+      <w:r>
+        <w:t xml:space="preserve">is true). Per-session and unspecified figures have no annual amount.</w:t>
+      </w:r>
+    </w:p>
+    <w:p>
+      <w:pPr>
+        <w:numPr>
+          <w:ilvl w:val="0"/>
+          <w:numId w:val="1010"/>
+        </w:numPr>
+        <w:pStyle w:val="Compact"/>
+      </w:pPr>
+      <w:r>
+        <w:t xml:space="preserve">A whole-course total is never presented as per year. An amount under 1,000 is treated as not held (provider pages use $0 or $1 as placeholders).</w:t>
+      </w:r>
+    </w:p>
+    <w:p>
+      <w:pPr>
+        <w:numPr>
+          <w:ilvl w:val="0"/>
+          <w:numId w:val="1010"/>
+        </w:numPr>
+        <w:pStyle w:val="Compact"/>
+      </w:pPr>
+      <w:r>
         <w:t xml:space="preserve">Currency is the course’s own (AUD, NZD or CAD). There is no conversion: filter by country before filtering by tuition.</w:t>
       </w:r>
     </w:p>
-    <w:bookmarkEnd w:id="33"/>
-    <w:bookmarkEnd w:id="34"/>
-    <w:bookmarkStart w:id="35" w:name="what-is-held-now"/>
+    <w:bookmarkEnd w:id="35"/>
+    <w:bookmarkEnd w:id="36"/>
+    <w:bookmarkStart w:id="37" w:name="what-is-held-now"/>
     <w:p>
       <w:pPr>
         <w:pStyle w:val="Heading1"/>
@@ -12140,8 +12589,8 @@
         <w:t xml:space="preserve">Scholarships returned: 1,100 (Australia 901, New Zealand 141, Canada 58); 1,096 open to international students. Providers with an approved logo: 265. QS 2027 ranked Australian providers: 38. QILT statistics: 116 Australian providers. Institution type: held for Australian and New Zealand providers (null for Canada).</w:t>
       </w:r>
     </w:p>
-    <w:bookmarkEnd w:id="35"/>
-    <w:bookmarkStart w:id="36" w:name="your-wix-collections-suggested"/>
+    <w:bookmarkEnd w:id="37"/>
+    <w:bookmarkStart w:id="38" w:name="your-wix-collections-suggested"/>
     <w:p>
       <w:pPr>
         <w:pStyle w:val="Heading1"/>
@@ -12565,8 +13014,8 @@
         <w:t xml:space="preserve">Do not mirror the platform’s own database; map the fields you need once and ignore the rest.</w:t>
       </w:r>
     </w:p>
-    <w:bookmarkEnd w:id="36"/>
-    <w:bookmarkStart w:id="37" w:name="support"/>
+    <w:bookmarkEnd w:id="38"/>
+    <w:bookmarkStart w:id="39" w:name="support"/>
     <w:p>
       <w:pPr>
         <w:pStyle w:val="Heading1"/>
@@ -12595,8 +13044,8 @@
         <w:t xml:space="preserve">, the HTTP status, the time (with time zone) and whether it affects live search, a scheduled sync or your cached pages. Never include the key.</w:t>
       </w:r>
     </w:p>
-    <w:bookmarkEnd w:id="37"/>
-    <w:bookmarkStart w:id="38" w:name="production"/>
+    <w:bookmarkEnd w:id="39"/>
+    <w:bookmarkStart w:id="40" w:name="production"/>
     <w:p>
       <w:pPr>
         <w:pStyle w:val="Heading1"/>
@@ -12609,7 +13058,7 @@
       <w:pPr>
         <w:numPr>
           <w:ilvl w:val="0"/>
-          <w:numId w:val="1010"/>
+          <w:numId w:val="1011"/>
         </w:numPr>
         <w:pStyle w:val="Compact"/>
       </w:pPr>
@@ -12621,7 +13070,7 @@
       <w:pPr>
         <w:numPr>
           <w:ilvl w:val="0"/>
-          <w:numId w:val="1010"/>
+          <w:numId w:val="1011"/>
         </w:numPr>
         <w:pStyle w:val="Compact"/>
       </w:pPr>
@@ -12645,7 +13094,7 @@
       <w:pPr>
         <w:numPr>
           <w:ilvl w:val="0"/>
-          <w:numId w:val="1010"/>
+          <w:numId w:val="1011"/>
         </w:numPr>
         <w:pStyle w:val="Compact"/>
       </w:pPr>
@@ -12653,8 +13102,8 @@
         <w:t xml:space="preserve">The Pilot key is disabled after the Production tests pass.</w:t>
       </w:r>
     </w:p>
-    <w:bookmarkEnd w:id="38"/>
-    <w:bookmarkStart w:id="39" w:name="acceptance-tests"/>
+    <w:bookmarkEnd w:id="40"/>
+    <w:bookmarkStart w:id="41" w:name="acceptance-tests"/>
     <w:p>
       <w:pPr>
         <w:pStyle w:val="Heading1"/>
@@ -13887,8 +14336,8 @@
         </w:tc>
       </w:tr>
     </w:tbl>
-    <w:bookmarkEnd w:id="39"/>
-    <w:bookmarkStart w:id="40" w:name="changes-to-this-guide"/>
+    <w:bookmarkEnd w:id="41"/>
+    <w:bookmarkStart w:id="42" w:name="changes-to-this-guide"/>
     <w:p>
       <w:pPr>
         <w:pStyle w:val="Heading1"/>
@@ -14045,8 +14494,43 @@
           </w:p>
         </w:tc>
       </w:tr>
+      <w:tr>
+        <w:tc>
+          <w:tcPr/>
+          <w:p>
+            <w:pPr>
+              <w:pStyle w:val="Compact"/>
+              <w:jc w:val="left"/>
+            </w:pPr>
+            <w:r>
+              <w:t xml:space="preserve">15 October 2026 (issue 2)</w:t>
+            </w:r>
+          </w:p>
+        </w:tc>
+        <w:tc>
+          <w:tcPr/>
+          <w:p>
+            <w:pPr>
+              <w:pStyle w:val="Compact"/>
+              <w:jc w:val="left"/>
+            </w:pPr>
+            <w:r>
+              <w:rPr>
+                <w:rStyle w:val="VerbatimChar"/>
+              </w:rPr>
+              <w:t xml:space="preserve">sync</w:t>
+            </w:r>
+            <w:r>
+              <w:t xml:space="preserve"> </w:t>
+            </w:r>
+            <w:r>
+              <w:t xml:space="preserve">pages hold up to 200 items (was 50; default 200), and a page also stops at about 550 KB. A full load is about 250 calls, about 5 minutes (was about 1,400 calls, about 25 minutes). Sections 6.1 and 6.2 added: what to expect from a full load, and what we expect from your sync job</w:t>
+            </w:r>
+          </w:p>
+        </w:tc>
+      </w:tr>
     </w:tbl>
-    <w:bookmarkEnd w:id="40"/>
+    <w:bookmarkEnd w:id="42"/>
     <w:sectPr>
       <w:headerReference w:type="default" r:id="rId9"/>
       <w:footerReference w:type="default" r:id="rId10"/>
@@ -14486,12 +14970,42 @@
     <w:abstractNumId w:val="991"/>
   </w:num>
   <w:num w:numId="1008">
-    <w:abstractNumId w:val="991"/>
+    <w:abstractNumId w:val="99411"/>
+    <w:lvlOverride w:ilvl="0">
+      <w:startOverride w:val="1"/>
+    </w:lvlOverride>
+    <w:lvlOverride w:ilvl="1">
+      <w:startOverride w:val="1"/>
+    </w:lvlOverride>
+    <w:lvlOverride w:ilvl="2">
+      <w:startOverride w:val="1"/>
+    </w:lvlOverride>
+    <w:lvlOverride w:ilvl="3">
+      <w:startOverride w:val="1"/>
+    </w:lvlOverride>
+    <w:lvlOverride w:ilvl="4">
+      <w:startOverride w:val="1"/>
+    </w:lvlOverride>
+    <w:lvlOverride w:ilvl="5">
+      <w:startOverride w:val="1"/>
+    </w:lvlOverride>
+    <w:lvlOverride w:ilvl="6">
+      <w:startOverride w:val="1"/>
+    </w:lvlOverride>
+    <w:lvlOverride w:ilvl="7">
+      <w:startOverride w:val="1"/>
+    </w:lvlOverride>
+    <w:lvlOverride w:ilvl="8">
+      <w:startOverride w:val="1"/>
+    </w:lvlOverride>
   </w:num>
   <w:num w:numId="1009">
     <w:abstractNumId w:val="991"/>
   </w:num>
   <w:num w:numId="1010">
+    <w:abstractNumId w:val="991"/>
+  </w:num>
+  <w:num w:numId="1011">
     <w:abstractNumId w:val="991"/>
   </w:num>
 </w:numbering>

</xml_diff>

<commit_message>
CF-247 e138: faster Wix full load (prepared items, pages up to 200); developer guide issue 2 with expectations (6.1, 6.2); OpenAPI and Postman regenerated; register v1.9; System reference 1.21 (#352)
Claude-Session: https://claude.ai/code/session_01RnriTf32Hcv4Xqnq2DF1qq

Co-authored-by: Claude <noreply@anthropic.com>
</commit_message>
<xml_diff>
--- a/docs/integrations/developer-pack/StudySearch-Website-API-Developer-Guide.docx
+++ b/docs/integrations/developer-pack/StudySearch-Website-API-Developer-Guide.docx
@@ -1176,7 +1176,7 @@
         <w:t xml:space="preserve"> </w:t>
       </w:r>
       <w:r>
-        <w:t xml:space="preserve">starts at 1.</w:t>
+        <w:t xml:space="preserve">starts at 1. For the list actions</w:t>
       </w:r>
       <w:r>
         <w:t xml:space="preserve"> </w:t>
@@ -1191,7 +1191,22 @@
         <w:t xml:space="preserve"> </w:t>
       </w:r>
       <w:r>
-        <w:t xml:space="preserve">is 1–50 (default 20).</w:t>
+        <w:t xml:space="preserve">is 1–50 (default 20);</w:t>
+      </w:r>
+      <w:r>
+        <w:t xml:space="preserve"> </w:t>
+      </w:r>
+      <w:r>
+        <w:rPr>
+          <w:rStyle w:val="VerbatimChar"/>
+        </w:rPr>
+        <w:t xml:space="preserve">sync</w:t>
+      </w:r>
+      <w:r>
+        <w:t xml:space="preserve"> </w:t>
+      </w:r>
+      <w:r>
+        <w:t xml:space="preserve">pages are covered in section 6.</w:t>
       </w:r>
     </w:p>
     <w:p>
@@ -2192,7 +2207,7 @@
       </w:r>
     </w:p>
     <w:bookmarkEnd w:id="24"/>
-    <w:bookmarkStart w:id="25" w:name="sync-full-load-then-only-what-changed"/>
+    <w:bookmarkStart w:id="27" w:name="sync-full-load-then-only-what-changed"/>
     <w:p>
       <w:pPr>
         <w:pStyle w:val="Heading1"/>
@@ -2376,7 +2391,7 @@
         <w:rPr>
           <w:rStyle w:val="DecValTok"/>
         </w:rPr>
-        <w:t xml:space="preserve">50</w:t>
+        <w:t xml:space="preserve">200</w:t>
       </w:r>
       <w:r>
         <w:br/>
@@ -2829,7 +2844,7 @@
               <w:jc w:val="left"/>
             </w:pPr>
             <w:r>
-              <w:t xml:space="preserve">1–50 (default 50)</w:t>
+              <w:t xml:space="preserve">1–200 (default 200). A page also stops at about 550 KB, so large items (provider details, scholarships) come fewer to a page</w:t>
             </w:r>
           </w:p>
         </w:tc>
@@ -3749,7 +3764,7 @@
         <w:t xml:space="preserve"> </w:t>
       </w:r>
       <w:r>
-        <w:t xml:space="preserve">items when they are large (a page of provider details holds 3). Keep going while</w:t>
+        <w:t xml:space="preserve">items when they are large. Keep going while</w:t>
       </w:r>
       <w:r>
         <w:t xml:space="preserve"> </w:t>
@@ -3776,7 +3791,7 @@
         <w:pStyle w:val="Compact"/>
       </w:pPr>
       <w:r>
-        <w:t xml:space="preserve">A full load is about 40,600 items (15 October 2026): about 1,400 calls, roughly 25 minutes within the limit of 60 calls a minute.</w:t>
+        <w:t xml:space="preserve">The platform checks every item for changes every minute in a rolling pass; a full pass takes about 90 minutes. A change appears in a later delta.</w:t>
       </w:r>
     </w:p>
     <w:p>
@@ -3788,7 +3803,19 @@
         <w:pStyle w:val="Compact"/>
       </w:pPr>
       <w:r>
-        <w:t xml:space="preserve">The platform checks every item for changes every minute in a rolling pass; a full pass takes about 90 minutes. A change appears in a later delta.</w:t>
+        <w:t xml:space="preserve">A removal comes as</w:t>
+      </w:r>
+      <w:r>
+        <w:t xml:space="preserve"> </w:t>
+      </w:r>
+      <w:r>
+        <w:rPr>
+          <w:rStyle w:val="VerbatimChar"/>
+        </w:rPr>
+        <w:t xml:space="preserve">change: "remove"</w:t>
+      </w:r>
+      <w:r>
+        <w:t xml:space="preserve">: for example a provider switched off (with its courses, logo and rankings) or a scholarship no longer published.</w:t>
       </w:r>
     </w:p>
     <w:p>
@@ -3800,26 +3827,286 @@
         <w:pStyle w:val="Compact"/>
       </w:pPr>
       <w:r>
-        <w:t xml:space="preserve">A removal comes as</w:t>
-      </w:r>
-      <w:r>
-        <w:t xml:space="preserve"> </w:t>
+        <w:rPr>
+          <w:bCs/>
+          <w:b/>
+        </w:rPr>
+        <w:t xml:space="preserve">Logos:</w:t>
+      </w:r>
+      <w:r>
+        <w:t xml:space="preserve"> </w:t>
+      </w:r>
+      <w:r>
+        <w:t xml:space="preserve">each logo link is valid for 365 days (</w:t>
       </w:r>
       <w:r>
         <w:rPr>
           <w:rStyle w:val="VerbatimChar"/>
         </w:rPr>
-        <w:t xml:space="preserve">change: "remove"</w:t>
-      </w:r>
-      <w:r>
-        <w:t xml:space="preserve">: for example a provider switched off (with its courses, logo and rankings) or a scholarship no longer published.</w:t>
+        <w:t xml:space="preserve">url_expires_at</w:t>
+      </w:r>
+      <w:r>
+        <w:t xml:space="preserve">). Copy the file into Wix Media and serve your copy; never link to the signed URL from a visitor page. The platform sends a logo again with a new link 30 days before the old one ends, and whenever the file changes (</w:t>
+      </w:r>
+      <w:r>
+        <w:rPr>
+          <w:rStyle w:val="VerbatimChar"/>
+        </w:rPr>
+        <w:t xml:space="preserve">content_hash</w:t>
+      </w:r>
+      <w:r>
+        <w:t xml:space="preserve">).</w:t>
+      </w:r>
+    </w:p>
+    <w:bookmarkStart w:id="25" w:name="full-load-what-to-expect"/>
+    <w:p>
+      <w:pPr>
+        <w:pStyle w:val="Heading2"/>
+      </w:pPr>
+      <w:r>
+        <w:t xml:space="preserve">6.1 Full load: what to expect</w:t>
+      </w:r>
+    </w:p>
+    <w:p>
+      <w:pPr>
+        <w:pStyle w:val="FirstParagraph"/>
+      </w:pPr>
+      <w:r>
+        <w:t xml:space="preserve">Measured on Pilot on 15 October 2026.</w:t>
+      </w:r>
+    </w:p>
+    <w:tbl>
+      <w:tblPr>
+        <w:tblStyle w:val="Table"/>
+        <w:tblW w:type="pct" w:w="5000"/>
+        <w:tblLook w:firstRow="1" w:lastRow="0" w:firstColumn="0" w:lastColumn="0" w:noHBand="0" w:noVBand="0" w:val="0020"/>
+        <w:jc w:val="start"/>
+        <w:tblBorders>
+          <w:top w:val="single" w:sz="4" w:color="BFBFBF"/>
+          <w:left w:val="single" w:sz="4" w:color="BFBFBF"/>
+          <w:bottom w:val="single" w:sz="4" w:color="BFBFBF"/>
+          <w:right w:val="single" w:sz="4" w:color="BFBFBF"/>
+          <w:insideH w:val="single" w:sz="4" w:color="BFBFBF"/>
+          <w:insideV w:val="single" w:sz="4" w:color="BFBFBF"/>
+        </w:tblBorders>
+      </w:tblPr>
+      <w:tblGrid>
+        <w:gridCol w:w="3960"/>
+        <w:gridCol w:w="3960"/>
+      </w:tblGrid>
+      <w:tr>
+        <w:trPr>
+          <w:tblHeader w:val="true"/>
+        </w:trPr>
+        <w:tc>
+          <w:tcPr>
+            <w:shd w:val="clear" w:color="auto" w:fill="1F3864"/>
+          </w:tcPr>
+          <w:p>
+            <w:pPr>
+              <w:pStyle w:val="Compact"/>
+              <w:jc w:val="left"/>
+            </w:pPr>
+            <w:r>
+              <w:rPr>
+                <w:b/>
+                <w:color w:val="FFFFFF"/>
+              </w:rPr>
+              <w:t xml:space="preserve">Measure</w:t>
+            </w:r>
+          </w:p>
+        </w:tc>
+        <w:tc>
+          <w:tcPr>
+            <w:shd w:val="clear" w:color="auto" w:fill="1F3864"/>
+          </w:tcPr>
+          <w:p>
+            <w:pPr>
+              <w:pStyle w:val="Compact"/>
+              <w:jc w:val="left"/>
+            </w:pPr>
+            <w:r>
+              <w:rPr>
+                <w:b/>
+                <w:color w:val="FFFFFF"/>
+              </w:rPr>
+              <w:t xml:space="preserve">Full load</w:t>
+            </w:r>
+          </w:p>
+        </w:tc>
+      </w:tr>
+      <w:tr>
+        <w:tc>
+          <w:tcPr/>
+          <w:p>
+            <w:pPr>
+              <w:pStyle w:val="Compact"/>
+              <w:jc w:val="left"/>
+            </w:pPr>
+            <w:r>
+              <w:t xml:space="preserve">Items</w:t>
+            </w:r>
+          </w:p>
+        </w:tc>
+        <w:tc>
+          <w:tcPr/>
+          <w:p>
+            <w:pPr>
+              <w:pStyle w:val="Compact"/>
+              <w:jc w:val="left"/>
+            </w:pPr>
+            <w:r>
+              <w:t xml:space="preserve">About 40,600 (courses 37,300; providers 1,885; scholarships 1,100; logos 275; ranking sets 56; reference 1)</w:t>
+            </w:r>
+          </w:p>
+        </w:tc>
+      </w:tr>
+      <w:tr>
+        <w:tc>
+          <w:tcPr/>
+          <w:p>
+            <w:pPr>
+              <w:pStyle w:val="Compact"/>
+              <w:jc w:val="left"/>
+            </w:pPr>
+            <w:r>
+              <w:t xml:space="preserve">Calls</w:t>
+            </w:r>
+          </w:p>
+        </w:tc>
+        <w:tc>
+          <w:tcPr/>
+          <w:p>
+            <w:pPr>
+              <w:pStyle w:val="Compact"/>
+              <w:jc w:val="left"/>
+            </w:pPr>
+            <w:r>
+              <w:t xml:space="preserve">About 250 at the default page size</w:t>
+            </w:r>
+          </w:p>
+        </w:tc>
+      </w:tr>
+      <w:tr>
+        <w:tc>
+          <w:tcPr/>
+          <w:p>
+            <w:pPr>
+              <w:pStyle w:val="Compact"/>
+              <w:jc w:val="left"/>
+            </w:pPr>
+            <w:r>
+              <w:t xml:space="preserve">Data</w:t>
+            </w:r>
+          </w:p>
+        </w:tc>
+        <w:tc>
+          <w:tcPr/>
+          <w:p>
+            <w:pPr>
+              <w:pStyle w:val="Compact"/>
+              <w:jc w:val="left"/>
+            </w:pPr>
+            <w:r>
+              <w:t xml:space="preserve">About 100 MB of JSON in total; the largest page about 550 KB</w:t>
+            </w:r>
+          </w:p>
+        </w:tc>
+      </w:tr>
+      <w:tr>
+        <w:tc>
+          <w:tcPr/>
+          <w:p>
+            <w:pPr>
+              <w:pStyle w:val="Compact"/>
+              <w:jc w:val="left"/>
+            </w:pPr>
+            <w:r>
+              <w:t xml:space="preserve">Reply time</w:t>
+            </w:r>
+          </w:p>
+        </w:tc>
+        <w:tc>
+          <w:tcPr/>
+          <w:p>
+            <w:pPr>
+              <w:pStyle w:val="Compact"/>
+              <w:jc w:val="left"/>
+            </w:pPr>
+            <w:r>
+              <w:t xml:space="preserve">Under a second a page</w:t>
+            </w:r>
+          </w:p>
+        </w:tc>
+      </w:tr>
+      <w:tr>
+        <w:tc>
+          <w:tcPr/>
+          <w:p>
+            <w:pPr>
+              <w:pStyle w:val="Compact"/>
+              <w:jc w:val="left"/>
+            </w:pPr>
+            <w:r>
+              <w:t xml:space="preserve">Elapsed time</w:t>
+            </w:r>
+          </w:p>
+        </w:tc>
+        <w:tc>
+          <w:tcPr/>
+          <w:p>
+            <w:pPr>
+              <w:pStyle w:val="Compact"/>
+              <w:jc w:val="left"/>
+            </w:pPr>
+            <w:r>
+              <w:t xml:space="preserve">About 5 minutes, paced at the limit of 60 calls a minute</w:t>
+            </w:r>
+          </w:p>
+        </w:tc>
+      </w:tr>
+      <w:tr>
+        <w:tc>
+          <w:tcPr/>
+          <w:p>
+            <w:pPr>
+              <w:pStyle w:val="Compact"/>
+              <w:jc w:val="left"/>
+            </w:pPr>
+            <w:r>
+              <w:t xml:space="preserve">After the full load</w:t>
+            </w:r>
+          </w:p>
+        </w:tc>
+        <w:tc>
+          <w:tcPr/>
+          <w:p>
+            <w:pPr>
+              <w:pStyle w:val="Compact"/>
+              <w:jc w:val="left"/>
+            </w:pPr>
+            <w:r>
+              <w:t xml:space="preserve">A delta is usually one call; the platform checks every item for changes within about 90 minutes, and a change appears in the next delta after that</w:t>
+            </w:r>
+          </w:p>
+        </w:tc>
+      </w:tr>
+    </w:tbl>
+    <w:bookmarkEnd w:id="25"/>
+    <w:bookmarkStart w:id="26" w:name="what-we-expect-from-your-sync-job"/>
+    <w:p>
+      <w:pPr>
+        <w:pStyle w:val="Heading2"/>
+      </w:pPr>
+      <w:r>
+        <w:t xml:space="preserve">6.2 What we expect from your sync job</w:t>
       </w:r>
     </w:p>
     <w:p>
       <w:pPr>
         <w:numPr>
           <w:ilvl w:val="0"/>
-          <w:numId w:val="1007"/>
+          <w:numId w:val="1008"/>
         </w:numPr>
         <w:pStyle w:val="Compact"/>
       </w:pPr>
@@ -3828,35 +4115,197 @@
           <w:bCs/>
           <w:b/>
         </w:rPr>
-        <w:t xml:space="preserve">Logos:</w:t>
-      </w:r>
-      <w:r>
-        <w:t xml:space="preserve"> </w:t>
-      </w:r>
-      <w:r>
-        <w:t xml:space="preserve">each logo link is valid for 365 days (</w:t>
+        <w:t xml:space="preserve">Run it as a scheduled backend job that can resume.</w:t>
+      </w:r>
+      <w:r>
+        <w:t xml:space="preserve"> </w:t>
+      </w:r>
+      <w:r>
+        <w:t xml:space="preserve">Save</w:t>
+      </w:r>
+      <w:r>
+        <w:t xml:space="preserve"> </w:t>
       </w:r>
       <w:r>
         <w:rPr>
           <w:rStyle w:val="VerbatimChar"/>
         </w:rPr>
-        <w:t xml:space="preserve">url_expires_at</w:t>
-      </w:r>
-      <w:r>
-        <w:t xml:space="preserve">). Copy the file into Wix Media and serve your copy; never link to the signed URL from a visitor page. The platform sends a logo again with a new link 30 days before the old one ends, and whenever the file changes (</w:t>
+        <w:t xml:space="preserve">next_cursor</w:t>
+      </w:r>
+      <w:r>
+        <w:t xml:space="preserve"> </w:t>
+      </w:r>
+      <w:r>
+        <w:t xml:space="preserve">after each page is written. If the job stops (for example at a Wix time limit), the next run carries on from the saved cursor.</w:t>
+      </w:r>
+    </w:p>
+    <w:p>
+      <w:pPr>
+        <w:numPr>
+          <w:ilvl w:val="0"/>
+          <w:numId w:val="1008"/>
+        </w:numPr>
+        <w:pStyle w:val="Compact"/>
+      </w:pPr>
+      <w:r>
+        <w:rPr>
+          <w:bCs/>
+          <w:b/>
+        </w:rPr>
+        <w:t xml:space="preserve">One cursor at a time.</w:t>
+      </w:r>
+      <w:r>
+        <w:t xml:space="preserve"> </w:t>
+      </w:r>
+      <w:r>
+        <w:t xml:space="preserve">Each call needs the previous reply’s cursor; do not start a second full load while one is running.</w:t>
+      </w:r>
+    </w:p>
+    <w:p>
+      <w:pPr>
+        <w:numPr>
+          <w:ilvl w:val="0"/>
+          <w:numId w:val="1008"/>
+        </w:numPr>
+        <w:pStyle w:val="Compact"/>
+      </w:pPr>
+      <w:r>
+        <w:rPr>
+          <w:bCs/>
+          <w:b/>
+        </w:rPr>
+        <w:t xml:space="preserve">Stay within 60 calls a minute.</w:t>
+      </w:r>
+      <w:r>
+        <w:t xml:space="preserve"> </w:t>
+      </w:r>
+      <w:r>
+        <w:t xml:space="preserve">On 429, wait for</w:t>
+      </w:r>
+      <w:r>
+        <w:t xml:space="preserve"> </w:t>
       </w:r>
       <w:r>
         <w:rPr>
           <w:rStyle w:val="VerbatimChar"/>
         </w:rPr>
-        <w:t xml:space="preserve">content_hash</w:t>
-      </w:r>
-      <w:r>
-        <w:t xml:space="preserve">).</w:t>
+        <w:t xml:space="preserve">Retry-After</w:t>
+      </w:r>
+      <w:r>
+        <w:t xml:space="preserve"> </w:t>
+      </w:r>
+      <w:r>
+        <w:t xml:space="preserve">and send the same cursor again.</w:t>
       </w:r>
     </w:p>
-    <w:bookmarkEnd w:id="25"/>
-    <w:bookmarkStart w:id="34" w:name="actions-and-data"/>
+    <w:p>
+      <w:pPr>
+        <w:numPr>
+          <w:ilvl w:val="0"/>
+          <w:numId w:val="1008"/>
+        </w:numPr>
+        <w:pStyle w:val="Compact"/>
+      </w:pPr>
+      <w:r>
+        <w:rPr>
+          <w:bCs/>
+          <w:b/>
+        </w:rPr>
+        <w:t xml:space="preserve">Write each page in one bulk save,</w:t>
+      </w:r>
+      <w:r>
+        <w:t xml:space="preserve"> </w:t>
+      </w:r>
+      <w:r>
+        <w:t xml:space="preserve">upserting by</w:t>
+      </w:r>
+      <w:r>
+        <w:t xml:space="preserve"> </w:t>
+      </w:r>
+      <w:r>
+        <w:rPr>
+          <w:rStyle w:val="VerbatimChar"/>
+        </w:rPr>
+        <w:t xml:space="preserve">id</w:t>
+      </w:r>
+      <w:r>
+        <w:t xml:space="preserve">; delete by</w:t>
+      </w:r>
+      <w:r>
+        <w:t xml:space="preserve"> </w:t>
+      </w:r>
+      <w:r>
+        <w:rPr>
+          <w:rStyle w:val="VerbatimChar"/>
+        </w:rPr>
+        <w:t xml:space="preserve">id</w:t>
+      </w:r>
+      <w:r>
+        <w:t xml:space="preserve"> </w:t>
+      </w:r>
+      <w:r>
+        <w:t xml:space="preserve">on</w:t>
+      </w:r>
+      <w:r>
+        <w:t xml:space="preserve"> </w:t>
+      </w:r>
+      <w:r>
+        <w:rPr>
+          <w:rStyle w:val="VerbatimChar"/>
+        </w:rPr>
+        <w:t xml:space="preserve">remove</w:t>
+      </w:r>
+      <w:r>
+        <w:t xml:space="preserve">.</w:t>
+      </w:r>
+    </w:p>
+    <w:p>
+      <w:pPr>
+        <w:numPr>
+          <w:ilvl w:val="0"/>
+          <w:numId w:val="1008"/>
+        </w:numPr>
+        <w:pStyle w:val="Compact"/>
+      </w:pPr>
+      <w:r>
+        <w:rPr>
+          <w:bCs/>
+          <w:b/>
+        </w:rPr>
+        <w:t xml:space="preserve">After the full load, run a delta every 5 to 15 minutes.</w:t>
+      </w:r>
+      <w:r>
+        <w:t xml:space="preserve"> </w:t>
+      </w:r>
+      <w:r>
+        <w:t xml:space="preserve">Run a full load again only to rebuild your collections.</w:t>
+      </w:r>
+    </w:p>
+    <w:p>
+      <w:pPr>
+        <w:numPr>
+          <w:ilvl w:val="0"/>
+          <w:numId w:val="1008"/>
+        </w:numPr>
+        <w:pStyle w:val="Compact"/>
+      </w:pPr>
+      <w:r>
+        <w:rPr>
+          <w:bCs/>
+          <w:b/>
+        </w:rPr>
+        <w:t xml:space="preserve">Copy each new or renewed logo into Wix Media</w:t>
+      </w:r>
+      <w:r>
+        <w:t xml:space="preserve"> </w:t>
+      </w:r>
+      <w:r>
+        <w:t xml:space="preserve">in the run that receives it.</w:t>
+      </w:r>
+    </w:p>
+    <w:bookmarkEnd w:id="26"/>
+    <w:bookmarkEnd w:id="27"/>
+    <w:bookmarkStart w:id="36" w:name="actions-and-data"/>
     <w:p>
       <w:pPr>
         <w:pStyle w:val="Heading1"/>
@@ -4536,7 +4985,7 @@
         </w:tc>
       </w:tr>
     </w:tbl>
-    <w:bookmarkStart w:id="26" w:name="reference"/>
+    <w:bookmarkStart w:id="28" w:name="reference"/>
     <w:p>
       <w:pPr>
         <w:pStyle w:val="Heading2"/>
@@ -4657,8 +5106,8 @@
         <w:t xml:space="preserve">says when the counts were built (every 15 minutes).</w:t>
       </w:r>
     </w:p>
-    <w:bookmarkEnd w:id="26"/>
-    <w:bookmarkStart w:id="27" w:name="search-course-finder"/>
+    <w:bookmarkEnd w:id="28"/>
+    <w:bookmarkStart w:id="29" w:name="search-course-finder"/>
     <w:p>
       <w:pPr>
         <w:pStyle w:val="Heading2"/>
@@ -7162,8 +7611,8 @@
         </w:tc>
       </w:tr>
     </w:tbl>
-    <w:bookmarkEnd w:id="27"/>
-    <w:bookmarkStart w:id="28" w:name="course-detail"/>
+    <w:bookmarkEnd w:id="29"/>
+    <w:bookmarkStart w:id="30" w:name="course-detail"/>
     <w:p>
       <w:pPr>
         <w:pStyle w:val="Heading2"/>
@@ -7431,8 +7880,8 @@
         <w:t xml:space="preserve">(the provider’s QILT statistics, as in 7.4).</w:t>
       </w:r>
     </w:p>
-    <w:bookmarkEnd w:id="28"/>
-    <w:bookmarkStart w:id="29" w:name="providers-and-provider-university-finder"/>
+    <w:bookmarkEnd w:id="30"/>
+    <w:bookmarkStart w:id="31" w:name="providers-and-provider-university-finder"/>
     <w:p>
       <w:pPr>
         <w:pStyle w:val="Heading2"/>
@@ -8971,8 +9420,8 @@
         <w:t xml:space="preserve">An average tuition per provider is not returned: there is no sound basis for one.</w:t>
       </w:r>
     </w:p>
-    <w:bookmarkEnd w:id="29"/>
-    <w:bookmarkStart w:id="30" w:name="Xfb71ca4790f1d65c8dcc94c263d00ffddef2aba"/>
+    <w:bookmarkEnd w:id="31"/>
+    <w:bookmarkStart w:id="32" w:name="Xfb71ca4790f1d65c8dcc94c263d00ffddef2aba"/>
     <w:p>
       <w:pPr>
         <w:pStyle w:val="Heading2"/>
@@ -10421,8 +10870,8 @@
         </w:tc>
       </w:tr>
     </w:tbl>
-    <w:bookmarkEnd w:id="30"/>
-    <w:bookmarkStart w:id="31" w:name="rankings"/>
+    <w:bookmarkEnd w:id="32"/>
+    <w:bookmarkStart w:id="33" w:name="rankings"/>
     <w:p>
       <w:pPr>
         <w:pStyle w:val="Heading2"/>
@@ -11088,8 +11537,8 @@
         <w:t xml:space="preserve">with every ranking.</w:t>
       </w:r>
     </w:p>
-    <w:bookmarkEnd w:id="31"/>
-    <w:bookmarkStart w:id="32" w:name="logos"/>
+    <w:bookmarkEnd w:id="33"/>
+    <w:bookmarkStart w:id="34" w:name="logos"/>
     <w:p>
       <w:pPr>
         <w:pStyle w:val="Heading2"/>
@@ -11125,133 +11574,6 @@
       </w:r>
       <w:r>
         <w:t xml:space="preserve">where no approved logo is held.</w:t>
-      </w:r>
-    </w:p>
-    <w:p>
-      <w:pPr>
-        <w:numPr>
-          <w:ilvl w:val="0"/>
-          <w:numId w:val="1008"/>
-        </w:numPr>
-        <w:pStyle w:val="Compact"/>
-      </w:pPr>
-      <w:r>
-        <w:t xml:space="preserve">One primary logo per provider, from the provider’s own website, as published (SVG, PNG or JPEG; not recoloured or resized).</w:t>
-      </w:r>
-    </w:p>
-    <w:p>
-      <w:pPr>
-        <w:numPr>
-          <w:ilvl w:val="0"/>
-          <w:numId w:val="1008"/>
-        </w:numPr>
-        <w:pStyle w:val="Compact"/>
-      </w:pPr>
-      <w:r>
-        <w:rPr>
-          <w:rStyle w:val="VerbatimChar"/>
-        </w:rPr>
-        <w:t xml:space="preserve">url</w:t>
-      </w:r>
-      <w:r>
-        <w:t xml:space="preserve"> </w:t>
-      </w:r>
-      <w:r>
-        <w:t xml:space="preserve">is a signed link valid for 365 days. Copy the file to Wix Media and serve your copy. Copy it again when</w:t>
-      </w:r>
-      <w:r>
-        <w:t xml:space="preserve"> </w:t>
-      </w:r>
-      <w:r>
-        <w:rPr>
-          <w:rStyle w:val="VerbatimChar"/>
-        </w:rPr>
-        <w:t xml:space="preserve">content_hash</w:t>
-      </w:r>
-      <w:r>
-        <w:t xml:space="preserve"> </w:t>
-      </w:r>
-      <w:r>
-        <w:t xml:space="preserve">changes or when</w:t>
-      </w:r>
-      <w:r>
-        <w:t xml:space="preserve"> </w:t>
-      </w:r>
-      <w:r>
-        <w:rPr>
-          <w:rStyle w:val="VerbatimChar"/>
-        </w:rPr>
-        <w:t xml:space="preserve">sync</w:t>
-      </w:r>
-      <w:r>
-        <w:t xml:space="preserve"> </w:t>
-      </w:r>
-      <w:r>
-        <w:t xml:space="preserve">sends the logo again.</w:t>
-      </w:r>
-    </w:p>
-    <w:p>
-      <w:pPr>
-        <w:numPr>
-          <w:ilvl w:val="0"/>
-          <w:numId w:val="1008"/>
-        </w:numPr>
-        <w:pStyle w:val="Compact"/>
-      </w:pPr>
-      <w:r>
-        <w:t xml:space="preserve">If signing fails for a call,</w:t>
-      </w:r>
-      <w:r>
-        <w:t xml:space="preserve"> </w:t>
-      </w:r>
-      <w:r>
-        <w:rPr>
-          <w:rStyle w:val="VerbatimChar"/>
-        </w:rPr>
-        <w:t xml:space="preserve">url</w:t>
-      </w:r>
-      <w:r>
-        <w:t xml:space="preserve"> </w:t>
-      </w:r>
-      <w:r>
-        <w:t xml:space="preserve">is</w:t>
-      </w:r>
-      <w:r>
-        <w:t xml:space="preserve"> </w:t>
-      </w:r>
-      <w:r>
-        <w:rPr>
-          <w:rStyle w:val="VerbatimChar"/>
-        </w:rPr>
-        <w:t xml:space="preserve">null</w:t>
-      </w:r>
-      <w:r>
-        <w:t xml:space="preserve"> </w:t>
-      </w:r>
-      <w:r>
-        <w:t xml:space="preserve">for that call only; the rest of the response is unaffected.</w:t>
-      </w:r>
-    </w:p>
-    <w:p>
-      <w:pPr>
-        <w:numPr>
-          <w:ilvl w:val="0"/>
-          <w:numId w:val="1008"/>
-        </w:numPr>
-        <w:pStyle w:val="Compact"/>
-      </w:pPr>
-      <w:r>
-        <w:t xml:space="preserve">A dark variant and a brand colour are not held.</w:t>
-      </w:r>
-    </w:p>
-    <w:bookmarkEnd w:id="32"/>
-    <w:bookmarkStart w:id="33" w:name="tuition-rules"/>
-    <w:p>
-      <w:pPr>
-        <w:pStyle w:val="Heading2"/>
-      </w:pPr>
-      <w:r>
-        <w:t xml:space="preserve">7.8 Tuition rules</w:t>
       </w:r>
     </w:p>
     <w:p>
@@ -11263,94 +11585,7 @@
         <w:pStyle w:val="Compact"/>
       </w:pPr>
       <w:r>
-        <w:rPr>
-          <w:rStyle w:val="VerbatimChar"/>
-        </w:rPr>
-        <w:t xml:space="preserve">basis</w:t>
-      </w:r>
-      <w:r>
-        <w:t xml:space="preserve"> </w:t>
-      </w:r>
-      <w:r>
-        <w:t xml:space="preserve">is always stated:</w:t>
-      </w:r>
-      <w:r>
-        <w:t xml:space="preserve"> </w:t>
-      </w:r>
-      <w:r>
-        <w:rPr>
-          <w:rStyle w:val="VerbatimChar"/>
-        </w:rPr>
-        <w:t xml:space="preserve">annual</w:t>
-      </w:r>
-      <w:r>
-        <w:t xml:space="preserve">,</w:t>
-      </w:r>
-      <w:r>
-        <w:t xml:space="preserve"> </w:t>
-      </w:r>
-      <w:r>
-        <w:rPr>
-          <w:rStyle w:val="VerbatimChar"/>
-        </w:rPr>
-        <w:t xml:space="preserve">indicative_annual</w:t>
-      </w:r>
-      <w:r>
-        <w:t xml:space="preserve">,</w:t>
-      </w:r>
-      <w:r>
-        <w:t xml:space="preserve"> </w:t>
-      </w:r>
-      <w:r>
-        <w:rPr>
-          <w:rStyle w:val="VerbatimChar"/>
-        </w:rPr>
-        <w:t xml:space="preserve">course_total</w:t>
-      </w:r>
-      <w:r>
-        <w:t xml:space="preserve">,</w:t>
-      </w:r>
-      <w:r>
-        <w:t xml:space="preserve"> </w:t>
-      </w:r>
-      <w:r>
-        <w:rPr>
-          <w:rStyle w:val="VerbatimChar"/>
-        </w:rPr>
-        <w:t xml:space="preserve">per_session</w:t>
-      </w:r>
-      <w:r>
-        <w:t xml:space="preserve"> </w:t>
-      </w:r>
-      <w:r>
-        <w:t xml:space="preserve">or</w:t>
-      </w:r>
-      <w:r>
-        <w:t xml:space="preserve"> </w:t>
-      </w:r>
-      <w:r>
-        <w:rPr>
-          <w:rStyle w:val="VerbatimChar"/>
-        </w:rPr>
-        <w:t xml:space="preserve">unspecified</w:t>
-      </w:r>
-      <w:r>
-        <w:t xml:space="preserve">.</w:t>
-      </w:r>
-      <w:r>
-        <w:t xml:space="preserve"> </w:t>
-      </w:r>
-      <w:r>
-        <w:rPr>
-          <w:rStyle w:val="VerbatimChar"/>
-        </w:rPr>
-        <w:t xml:space="preserve">basis_label</w:t>
-      </w:r>
-      <w:r>
-        <w:t xml:space="preserve"> </w:t>
-      </w:r>
-      <w:r>
-        <w:t xml:space="preserve">keeps the provider’s own words.</w:t>
+        <w:t xml:space="preserve">One primary logo per provider, from the provider’s own website, as published (SVG, PNG or JPEG; not recoloured or resized).</w:t>
       </w:r>
     </w:p>
     <w:p>
@@ -11365,13 +11600,13 @@
         <w:rPr>
           <w:rStyle w:val="VerbatimChar"/>
         </w:rPr>
-        <w:t xml:space="preserve">source</w:t>
-      </w:r>
-      <w:r>
-        <w:t xml:space="preserve"> </w:t>
-      </w:r>
-      <w:r>
-        <w:t xml:space="preserve">is</w:t>
+        <w:t xml:space="preserve">url</w:t>
+      </w:r>
+      <w:r>
+        <w:t xml:space="preserve"> </w:t>
+      </w:r>
+      <w:r>
+        <w:t xml:space="preserve">is a signed link valid for 365 days. Copy the file to Wix Media and serve your copy. Copy it again when</w:t>
       </w:r>
       <w:r>
         <w:t xml:space="preserve"> </w:t>
@@ -11380,13 +11615,13 @@
         <w:rPr>
           <w:rStyle w:val="VerbatimChar"/>
         </w:rPr>
-        <w:t xml:space="preserve">provider_current</w:t>
-      </w:r>
-      <w:r>
-        <w:t xml:space="preserve"> </w:t>
-      </w:r>
-      <w:r>
-        <w:t xml:space="preserve">(the provider’s current fee page, preferred) or</w:t>
+        <w:t xml:space="preserve">content_hash</w:t>
+      </w:r>
+      <w:r>
+        <w:t xml:space="preserve"> </w:t>
+      </w:r>
+      <w:r>
+        <w:t xml:space="preserve">changes or when</w:t>
       </w:r>
       <w:r>
         <w:t xml:space="preserve"> </w:t>
@@ -11395,13 +11630,13 @@
         <w:rPr>
           <w:rStyle w:val="VerbatimChar"/>
         </w:rPr>
-        <w:t xml:space="preserve">regulatory_registered</w:t>
-      </w:r>
-      <w:r>
-        <w:t xml:space="preserve"> </w:t>
-      </w:r>
-      <w:r>
-        <w:t xml:space="preserve">(the Australian CRICOS registered course total).</w:t>
+        <w:t xml:space="preserve">sync</w:t>
+      </w:r>
+      <w:r>
+        <w:t xml:space="preserve"> </w:t>
+      </w:r>
+      <w:r>
+        <w:t xml:space="preserve">sends the logo again.</w:t>
       </w:r>
     </w:p>
     <w:p>
@@ -11413,16 +11648,22 @@
         <w:pStyle w:val="Compact"/>
       </w:pPr>
       <w:r>
+        <w:t xml:space="preserve">If signing fails for a call,</w:t>
+      </w:r>
+      <w:r>
+        <w:t xml:space="preserve"> </w:t>
+      </w:r>
+      <w:r>
         <w:rPr>
           <w:rStyle w:val="VerbatimChar"/>
         </w:rPr>
-        <w:t xml:space="preserve">annual_amount</w:t>
-      </w:r>
-      <w:r>
-        <w:t xml:space="preserve"> </w:t>
-      </w:r>
-      <w:r>
-        <w:t xml:space="preserve">is the stated annual figure, or is derived from a course total only for courses of 12 months or more (then</w:t>
+        <w:t xml:space="preserve">url</w:t>
+      </w:r>
+      <w:r>
+        <w:t xml:space="preserve"> </w:t>
+      </w:r>
+      <w:r>
+        <w:t xml:space="preserve">is</w:t>
       </w:r>
       <w:r>
         <w:t xml:space="preserve"> </w:t>
@@ -11431,13 +11672,13 @@
         <w:rPr>
           <w:rStyle w:val="VerbatimChar"/>
         </w:rPr>
-        <w:t xml:space="preserve">annual_is_derived</w:t>
-      </w:r>
-      <w:r>
-        <w:t xml:space="preserve"> </w:t>
-      </w:r>
-      <w:r>
-        <w:t xml:space="preserve">is true). Per-session and unspecified figures have no annual amount.</w:t>
+        <w:t xml:space="preserve">null</w:t>
+      </w:r>
+      <w:r>
+        <w:t xml:space="preserve"> </w:t>
+      </w:r>
+      <w:r>
+        <w:t xml:space="preserve">for that call only; the rest of the response is unaffected.</w:t>
       </w:r>
     </w:p>
     <w:p>
@@ -11449,24 +11690,232 @@
         <w:pStyle w:val="Compact"/>
       </w:pPr>
       <w:r>
-        <w:t xml:space="preserve">A whole-course total is never presented as per year. An amount under 1,000 is treated as not held (provider pages use $0 or $1 as placeholders).</w:t>
+        <w:t xml:space="preserve">A dark variant and a brand colour are not held.</w:t>
+      </w:r>
+    </w:p>
+    <w:bookmarkEnd w:id="34"/>
+    <w:bookmarkStart w:id="35" w:name="tuition-rules"/>
+    <w:p>
+      <w:pPr>
+        <w:pStyle w:val="Heading2"/>
+      </w:pPr>
+      <w:r>
+        <w:t xml:space="preserve">7.8 Tuition rules</w:t>
       </w:r>
     </w:p>
     <w:p>
       <w:pPr>
         <w:numPr>
           <w:ilvl w:val="0"/>
-          <w:numId w:val="1009"/>
+          <w:numId w:val="1010"/>
         </w:numPr>
         <w:pStyle w:val="Compact"/>
       </w:pPr>
       <w:r>
+        <w:rPr>
+          <w:rStyle w:val="VerbatimChar"/>
+        </w:rPr>
+        <w:t xml:space="preserve">basis</w:t>
+      </w:r>
+      <w:r>
+        <w:t xml:space="preserve"> </w:t>
+      </w:r>
+      <w:r>
+        <w:t xml:space="preserve">is always stated:</w:t>
+      </w:r>
+      <w:r>
+        <w:t xml:space="preserve"> </w:t>
+      </w:r>
+      <w:r>
+        <w:rPr>
+          <w:rStyle w:val="VerbatimChar"/>
+        </w:rPr>
+        <w:t xml:space="preserve">annual</w:t>
+      </w:r>
+      <w:r>
+        <w:t xml:space="preserve">,</w:t>
+      </w:r>
+      <w:r>
+        <w:t xml:space="preserve"> </w:t>
+      </w:r>
+      <w:r>
+        <w:rPr>
+          <w:rStyle w:val="VerbatimChar"/>
+        </w:rPr>
+        <w:t xml:space="preserve">indicative_annual</w:t>
+      </w:r>
+      <w:r>
+        <w:t xml:space="preserve">,</w:t>
+      </w:r>
+      <w:r>
+        <w:t xml:space="preserve"> </w:t>
+      </w:r>
+      <w:r>
+        <w:rPr>
+          <w:rStyle w:val="VerbatimChar"/>
+        </w:rPr>
+        <w:t xml:space="preserve">course_total</w:t>
+      </w:r>
+      <w:r>
+        <w:t xml:space="preserve">,</w:t>
+      </w:r>
+      <w:r>
+        <w:t xml:space="preserve"> </w:t>
+      </w:r>
+      <w:r>
+        <w:rPr>
+          <w:rStyle w:val="VerbatimChar"/>
+        </w:rPr>
+        <w:t xml:space="preserve">per_session</w:t>
+      </w:r>
+      <w:r>
+        <w:t xml:space="preserve"> </w:t>
+      </w:r>
+      <w:r>
+        <w:t xml:space="preserve">or</w:t>
+      </w:r>
+      <w:r>
+        <w:t xml:space="preserve"> </w:t>
+      </w:r>
+      <w:r>
+        <w:rPr>
+          <w:rStyle w:val="VerbatimChar"/>
+        </w:rPr>
+        <w:t xml:space="preserve">unspecified</w:t>
+      </w:r>
+      <w:r>
+        <w:t xml:space="preserve">.</w:t>
+      </w:r>
+      <w:r>
+        <w:t xml:space="preserve"> </w:t>
+      </w:r>
+      <w:r>
+        <w:rPr>
+          <w:rStyle w:val="VerbatimChar"/>
+        </w:rPr>
+        <w:t xml:space="preserve">basis_label</w:t>
+      </w:r>
+      <w:r>
+        <w:t xml:space="preserve"> </w:t>
+      </w:r>
+      <w:r>
+        <w:t xml:space="preserve">keeps the provider’s own words.</w:t>
+      </w:r>
+    </w:p>
+    <w:p>
+      <w:pPr>
+        <w:numPr>
+          <w:ilvl w:val="0"/>
+          <w:numId w:val="1010"/>
+        </w:numPr>
+        <w:pStyle w:val="Compact"/>
+      </w:pPr>
+      <w:r>
+        <w:rPr>
+          <w:rStyle w:val="VerbatimChar"/>
+        </w:rPr>
+        <w:t xml:space="preserve">source</w:t>
+      </w:r>
+      <w:r>
+        <w:t xml:space="preserve"> </w:t>
+      </w:r>
+      <w:r>
+        <w:t xml:space="preserve">is</w:t>
+      </w:r>
+      <w:r>
+        <w:t xml:space="preserve"> </w:t>
+      </w:r>
+      <w:r>
+        <w:rPr>
+          <w:rStyle w:val="VerbatimChar"/>
+        </w:rPr>
+        <w:t xml:space="preserve">provider_current</w:t>
+      </w:r>
+      <w:r>
+        <w:t xml:space="preserve"> </w:t>
+      </w:r>
+      <w:r>
+        <w:t xml:space="preserve">(the provider’s current fee page, preferred) or</w:t>
+      </w:r>
+      <w:r>
+        <w:t xml:space="preserve"> </w:t>
+      </w:r>
+      <w:r>
+        <w:rPr>
+          <w:rStyle w:val="VerbatimChar"/>
+        </w:rPr>
+        <w:t xml:space="preserve">regulatory_registered</w:t>
+      </w:r>
+      <w:r>
+        <w:t xml:space="preserve"> </w:t>
+      </w:r>
+      <w:r>
+        <w:t xml:space="preserve">(the Australian CRICOS registered course total).</w:t>
+      </w:r>
+    </w:p>
+    <w:p>
+      <w:pPr>
+        <w:numPr>
+          <w:ilvl w:val="0"/>
+          <w:numId w:val="1010"/>
+        </w:numPr>
+        <w:pStyle w:val="Compact"/>
+      </w:pPr>
+      <w:r>
+        <w:rPr>
+          <w:rStyle w:val="VerbatimChar"/>
+        </w:rPr>
+        <w:t xml:space="preserve">annual_amount</w:t>
+      </w:r>
+      <w:r>
+        <w:t xml:space="preserve"> </w:t>
+      </w:r>
+      <w:r>
+        <w:t xml:space="preserve">is the stated annual figure, or is derived from a course total only for courses of 12 months or more (then</w:t>
+      </w:r>
+      <w:r>
+        <w:t xml:space="preserve"> </w:t>
+      </w:r>
+      <w:r>
+        <w:rPr>
+          <w:rStyle w:val="VerbatimChar"/>
+        </w:rPr>
+        <w:t xml:space="preserve">annual_is_derived</w:t>
+      </w:r>
+      <w:r>
+        <w:t xml:space="preserve"> </w:t>
+      </w:r>
+      <w:r>
+        <w:t xml:space="preserve">is true). Per-session and unspecified figures have no annual amount.</w:t>
+      </w:r>
+    </w:p>
+    <w:p>
+      <w:pPr>
+        <w:numPr>
+          <w:ilvl w:val="0"/>
+          <w:numId w:val="1010"/>
+        </w:numPr>
+        <w:pStyle w:val="Compact"/>
+      </w:pPr>
+      <w:r>
+        <w:t xml:space="preserve">A whole-course total is never presented as per year. An amount under 1,000 is treated as not held (provider pages use $0 or $1 as placeholders).</w:t>
+      </w:r>
+    </w:p>
+    <w:p>
+      <w:pPr>
+        <w:numPr>
+          <w:ilvl w:val="0"/>
+          <w:numId w:val="1010"/>
+        </w:numPr>
+        <w:pStyle w:val="Compact"/>
+      </w:pPr>
+      <w:r>
         <w:t xml:space="preserve">Currency is the course’s own (AUD, NZD or CAD). There is no conversion: filter by country before filtering by tuition.</w:t>
       </w:r>
     </w:p>
-    <w:bookmarkEnd w:id="33"/>
-    <w:bookmarkEnd w:id="34"/>
-    <w:bookmarkStart w:id="35" w:name="what-is-held-now"/>
+    <w:bookmarkEnd w:id="35"/>
+    <w:bookmarkEnd w:id="36"/>
+    <w:bookmarkStart w:id="37" w:name="what-is-held-now"/>
     <w:p>
       <w:pPr>
         <w:pStyle w:val="Heading1"/>
@@ -12140,8 +12589,8 @@
         <w:t xml:space="preserve">Scholarships returned: 1,100 (Australia 901, New Zealand 141, Canada 58); 1,096 open to international students. Providers with an approved logo: 265. QS 2027 ranked Australian providers: 38. QILT statistics: 116 Australian providers. Institution type: held for Australian and New Zealand providers (null for Canada).</w:t>
       </w:r>
     </w:p>
-    <w:bookmarkEnd w:id="35"/>
-    <w:bookmarkStart w:id="36" w:name="your-wix-collections-suggested"/>
+    <w:bookmarkEnd w:id="37"/>
+    <w:bookmarkStart w:id="38" w:name="your-wix-collections-suggested"/>
     <w:p>
       <w:pPr>
         <w:pStyle w:val="Heading1"/>
@@ -12565,8 +13014,8 @@
         <w:t xml:space="preserve">Do not mirror the platform’s own database; map the fields you need once and ignore the rest.</w:t>
       </w:r>
     </w:p>
-    <w:bookmarkEnd w:id="36"/>
-    <w:bookmarkStart w:id="37" w:name="support"/>
+    <w:bookmarkEnd w:id="38"/>
+    <w:bookmarkStart w:id="39" w:name="support"/>
     <w:p>
       <w:pPr>
         <w:pStyle w:val="Heading1"/>
@@ -12595,8 +13044,8 @@
         <w:t xml:space="preserve">, the HTTP status, the time (with time zone) and whether it affects live search, a scheduled sync or your cached pages. Never include the key.</w:t>
       </w:r>
     </w:p>
-    <w:bookmarkEnd w:id="37"/>
-    <w:bookmarkStart w:id="38" w:name="production"/>
+    <w:bookmarkEnd w:id="39"/>
+    <w:bookmarkStart w:id="40" w:name="production"/>
     <w:p>
       <w:pPr>
         <w:pStyle w:val="Heading1"/>
@@ -12609,7 +13058,7 @@
       <w:pPr>
         <w:numPr>
           <w:ilvl w:val="0"/>
-          <w:numId w:val="1010"/>
+          <w:numId w:val="1011"/>
         </w:numPr>
         <w:pStyle w:val="Compact"/>
       </w:pPr>
@@ -12621,7 +13070,7 @@
       <w:pPr>
         <w:numPr>
           <w:ilvl w:val="0"/>
-          <w:numId w:val="1010"/>
+          <w:numId w:val="1011"/>
         </w:numPr>
         <w:pStyle w:val="Compact"/>
       </w:pPr>
@@ -12645,7 +13094,7 @@
       <w:pPr>
         <w:numPr>
           <w:ilvl w:val="0"/>
-          <w:numId w:val="1010"/>
+          <w:numId w:val="1011"/>
         </w:numPr>
         <w:pStyle w:val="Compact"/>
       </w:pPr>
@@ -12653,8 +13102,8 @@
         <w:t xml:space="preserve">The Pilot key is disabled after the Production tests pass.</w:t>
       </w:r>
     </w:p>
-    <w:bookmarkEnd w:id="38"/>
-    <w:bookmarkStart w:id="39" w:name="acceptance-tests"/>
+    <w:bookmarkEnd w:id="40"/>
+    <w:bookmarkStart w:id="41" w:name="acceptance-tests"/>
     <w:p>
       <w:pPr>
         <w:pStyle w:val="Heading1"/>
@@ -13887,8 +14336,8 @@
         </w:tc>
       </w:tr>
     </w:tbl>
-    <w:bookmarkEnd w:id="39"/>
-    <w:bookmarkStart w:id="40" w:name="changes-to-this-guide"/>
+    <w:bookmarkEnd w:id="41"/>
+    <w:bookmarkStart w:id="42" w:name="changes-to-this-guide"/>
     <w:p>
       <w:pPr>
         <w:pStyle w:val="Heading1"/>
@@ -14045,8 +14494,43 @@
           </w:p>
         </w:tc>
       </w:tr>
+      <w:tr>
+        <w:tc>
+          <w:tcPr/>
+          <w:p>
+            <w:pPr>
+              <w:pStyle w:val="Compact"/>
+              <w:jc w:val="left"/>
+            </w:pPr>
+            <w:r>
+              <w:t xml:space="preserve">15 October 2026 (issue 2)</w:t>
+            </w:r>
+          </w:p>
+        </w:tc>
+        <w:tc>
+          <w:tcPr/>
+          <w:p>
+            <w:pPr>
+              <w:pStyle w:val="Compact"/>
+              <w:jc w:val="left"/>
+            </w:pPr>
+            <w:r>
+              <w:rPr>
+                <w:rStyle w:val="VerbatimChar"/>
+              </w:rPr>
+              <w:t xml:space="preserve">sync</w:t>
+            </w:r>
+            <w:r>
+              <w:t xml:space="preserve"> </w:t>
+            </w:r>
+            <w:r>
+              <w:t xml:space="preserve">pages hold up to 200 items (was 50; default 200), and a page also stops at about 550 KB. A full load is about 250 calls, about 5 minutes (was about 1,400 calls, about 25 minutes). Sections 6.1 and 6.2 added: what to expect from a full load, and what we expect from your sync job</w:t>
+            </w:r>
+          </w:p>
+        </w:tc>
+      </w:tr>
     </w:tbl>
-    <w:bookmarkEnd w:id="40"/>
+    <w:bookmarkEnd w:id="42"/>
     <w:sectPr>
       <w:headerReference w:type="default" r:id="rId9"/>
       <w:footerReference w:type="default" r:id="rId10"/>
@@ -14486,12 +14970,42 @@
     <w:abstractNumId w:val="991"/>
   </w:num>
   <w:num w:numId="1008">
-    <w:abstractNumId w:val="991"/>
+    <w:abstractNumId w:val="99411"/>
+    <w:lvlOverride w:ilvl="0">
+      <w:startOverride w:val="1"/>
+    </w:lvlOverride>
+    <w:lvlOverride w:ilvl="1">
+      <w:startOverride w:val="1"/>
+    </w:lvlOverride>
+    <w:lvlOverride w:ilvl="2">
+      <w:startOverride w:val="1"/>
+    </w:lvlOverride>
+    <w:lvlOverride w:ilvl="3">
+      <w:startOverride w:val="1"/>
+    </w:lvlOverride>
+    <w:lvlOverride w:ilvl="4">
+      <w:startOverride w:val="1"/>
+    </w:lvlOverride>
+    <w:lvlOverride w:ilvl="5">
+      <w:startOverride w:val="1"/>
+    </w:lvlOverride>
+    <w:lvlOverride w:ilvl="6">
+      <w:startOverride w:val="1"/>
+    </w:lvlOverride>
+    <w:lvlOverride w:ilvl="7">
+      <w:startOverride w:val="1"/>
+    </w:lvlOverride>
+    <w:lvlOverride w:ilvl="8">
+      <w:startOverride w:val="1"/>
+    </w:lvlOverride>
   </w:num>
   <w:num w:numId="1009">
     <w:abstractNumId w:val="991"/>
   </w:num>
   <w:num w:numId="1010">
+    <w:abstractNumId w:val="991"/>
+  </w:num>
+  <w:num w:numId="1011">
     <w:abstractNumId w:val="991"/>
   </w:num>
 </w:numbering>

</xml_diff>

<commit_message>
CF-247: Website API v2 at its own URL in parallel; developer guide issue 3 (e142)
Co-Authored-By: Claude Opus 5.5 <noreply@anthropic.com>
Claude-Session: https://claude.ai/code/session_01RnriTf32Hcv4Xqnq2DF1qq
</commit_message>
<xml_diff>
--- a/docs/integrations/developer-pack/StudySearch-Website-API-Developer-Guide.docx
+++ b/docs/integrations/developer-pack/StudySearch-Website-API-Developer-Guide.docx
@@ -45,13 +45,7 @@
         <w:pStyle w:val="Subtitle"/>
       </w:pPr>
       <w:r>
-        <w:t xml:space="preserve">Contract</w:t>
-      </w:r>
-      <w:r>
-        <w:t xml:space="preserve"> </w:t>
-      </w:r>
-      <w:r>
-        <w:t xml:space="preserve">website-search-v2</w:t>
+        <w:t xml:space="preserve">website-api-v2</w:t>
       </w:r>
       <w:r>
         <w:t xml:space="preserve"> </w:t>
@@ -81,7 +75,25 @@
         <w:t xml:space="preserve"> </w:t>
       </w:r>
       <w:r>
-        <w:t xml:space="preserve">15</w:t>
+        <w:t xml:space="preserve">Issue</w:t>
+      </w:r>
+      <w:r>
+        <w:t xml:space="preserve"> </w:t>
+      </w:r>
+      <w:r>
+        <w:t xml:space="preserve">3</w:t>
+      </w:r>
+      <w:r>
+        <w:t xml:space="preserve"> </w:t>
+      </w:r>
+      <w:r>
+        <w:t xml:space="preserve">·</w:t>
+      </w:r>
+      <w:r>
+        <w:t xml:space="preserve"> </w:t>
+      </w:r>
+      <w:r>
+        <w:t xml:space="preserve">16</w:t>
       </w:r>
       <w:r>
         <w:t xml:space="preserve"> </w:t>
@@ -182,19 +194,7 @@
               <w:jc w:val="left"/>
             </w:pPr>
             <w:r>
-              <w:t xml:space="preserve">One HTTPS endpoint, contract</w:t>
-            </w:r>
-            <w:r>
-              <w:t xml:space="preserve"> </w:t>
-            </w:r>
-            <w:r>
-              <w:rPr>
-                <w:rStyle w:val="VerbatimChar"/>
-              </w:rPr>
-              <w:t xml:space="preserve">website-search-v2</w:t>
-            </w:r>
-            <w:r>
-              <w:t xml:space="preserve">, nine actions</w:t>
+              <w:t xml:space="preserve">One HTTPS address for Website API v2, nine actions</w:t>
             </w:r>
           </w:p>
         </w:tc>
@@ -441,7 +441,22 @@
         <w:t xml:space="preserve"> </w:t>
       </w:r>
       <w:r>
-        <w:t xml:space="preserve">Fields, filters and actions are added, never renamed or removed, within this contract. Ignore fields you do not use. A breaking change would come as a new contract with its own guide.</w:t>
+        <w:t xml:space="preserve">Fields, filters and actions are added, never renamed or removed, within v2. Ignore fields you do not use. A breaking change would come as</w:t>
+      </w:r>
+      <w:r>
+        <w:t xml:space="preserve"> </w:t>
+      </w:r>
+      <w:r>
+        <w:rPr>
+          <w:rStyle w:val="VerbatimChar"/>
+        </w:rPr>
+        <w:t xml:space="preserve">website-api-v3</w:t>
+      </w:r>
+      <w:r>
+        <w:t xml:space="preserve"> </w:t>
+      </w:r>
+      <w:r>
+        <w:t xml:space="preserve">at a new address, with its own guide, and v2 would keep running alongside it.</w:t>
       </w:r>
     </w:p>
     <w:p>
@@ -716,7 +731,7 @@
         <w:rPr>
           <w:rStyle w:val="VerbatimChar"/>
         </w:rPr>
-        <w:t xml:space="preserve">POST https://fxcwkweaxjtknorudmwp.supabase.co/functions/v1/wix-course-api</w:t>
+        <w:t xml:space="preserve">POST https://fxcwkweaxjtknorudmwp.supabase.co/functions/v1/website-api-v2</w:t>
       </w:r>
       <w:r>
         <w:br/>
@@ -746,22 +761,7 @@
         <w:pStyle w:val="Compact"/>
       </w:pPr>
       <w:r>
-        <w:t xml:space="preserve">Every request body includes</w:t>
-      </w:r>
-      <w:r>
-        <w:t xml:space="preserve"> </w:t>
-      </w:r>
-      <w:r>
-        <w:rPr>
-          <w:rStyle w:val="VerbatimChar"/>
-        </w:rPr>
-        <w:t xml:space="preserve">"contract": "website-search-v2"</w:t>
-      </w:r>
-      <w:r>
-        <w:t xml:space="preserve"> </w:t>
-      </w:r>
-      <w:r>
-        <w:t xml:space="preserve">and an</w:t>
+        <w:t xml:space="preserve">Every request body includes an</w:t>
       </w:r>
       <w:r>
         <w:t xml:space="preserve"> </w:t>
@@ -773,7 +773,22 @@
         <w:t xml:space="preserve">action</w:t>
       </w:r>
       <w:r>
-        <w:t xml:space="preserve">.</w:t>
+        <w:t xml:space="preserve">. There is no</w:t>
+      </w:r>
+      <w:r>
+        <w:t xml:space="preserve"> </w:t>
+      </w:r>
+      <w:r>
+        <w:rPr>
+          <w:rStyle w:val="VerbatimChar"/>
+        </w:rPr>
+        <w:t xml:space="preserve">contract</w:t>
+      </w:r>
+      <w:r>
+        <w:t xml:space="preserve"> </w:t>
+      </w:r>
+      <w:r>
+        <w:t xml:space="preserve">field: the address is the version.</w:t>
       </w:r>
     </w:p>
     <w:p>
@@ -807,7 +822,7 @@
           <w:bCs/>
           <w:b/>
         </w:rPr>
-        <w:t xml:space="preserve">60 requests a minute per action</w:t>
+        <w:t xml:space="preserve">300 requests a minute, all actions together</w:t>
       </w:r>
       <w:r>
         <w:t xml:space="preserve">. Over the limit you get HTTP 429 with a</w:t>
@@ -837,7 +852,97 @@
         <w:pStyle w:val="Compact"/>
       </w:pPr>
       <w:r>
-        <w:t xml:space="preserve">Your key works with this contract only. If a key is exposed, tell us: we disable it and issue a new one (a key cannot be recovered, only replaced).</w:t>
+        <w:t xml:space="preserve">Your key works with this address only. If a key is exposed, tell us: we disable it and issue a new one (a key cannot be recovered, only replaced).</w:t>
+      </w:r>
+    </w:p>
+    <w:p>
+      <w:pPr>
+        <w:pStyle w:val="FirstParagraph"/>
+      </w:pPr>
+      <w:r>
+        <w:rPr>
+          <w:bCs/>
+          <w:b/>
+        </w:rPr>
+        <w:t xml:space="preserve">Moving from the earlier address.</w:t>
+      </w:r>
+      <w:r>
+        <w:t xml:space="preserve"> </w:t>
+      </w:r>
+      <w:r>
+        <w:t xml:space="preserve">Until now the API was reached at</w:t>
+      </w:r>
+      <w:r>
+        <w:t xml:space="preserve"> </w:t>
+      </w:r>
+      <w:r>
+        <w:rPr>
+          <w:rStyle w:val="VerbatimChar"/>
+        </w:rPr>
+        <w:t xml:space="preserve">wix-course-api</w:t>
+      </w:r>
+      <w:r>
+        <w:t xml:space="preserve"> </w:t>
+      </w:r>
+      <w:r>
+        <w:t xml:space="preserve">with</w:t>
+      </w:r>
+      <w:r>
+        <w:t xml:space="preserve"> </w:t>
+      </w:r>
+      <w:r>
+        <w:rPr>
+          <w:rStyle w:val="VerbatimChar"/>
+        </w:rPr>
+        <w:t xml:space="preserve">"contract": "website-search-v2"</w:t>
+      </w:r>
+      <w:r>
+        <w:t xml:space="preserve"> </w:t>
+      </w:r>
+      <w:r>
+        <w:t xml:space="preserve">in every body. That address and its key keep working, unchanged, until you have moved; we will agree the switch-off date with you. The answers are the same at both addresses. To move: store the new key, change the address, drop the</w:t>
+      </w:r>
+      <w:r>
+        <w:t xml:space="preserve"> </w:t>
+      </w:r>
+      <w:r>
+        <w:rPr>
+          <w:rStyle w:val="VerbatimChar"/>
+        </w:rPr>
+        <w:t xml:space="preserve">contract</w:t>
+      </w:r>
+      <w:r>
+        <w:t xml:space="preserve"> </w:t>
+      </w:r>
+      <w:r>
+        <w:t xml:space="preserve">field, and read</w:t>
+      </w:r>
+      <w:r>
+        <w:t xml:space="preserve"> </w:t>
+      </w:r>
+      <w:r>
+        <w:rPr>
+          <w:rStyle w:val="VerbatimChar"/>
+        </w:rPr>
+        <w:t xml:space="preserve">api_version</w:t>
+      </w:r>
+      <w:r>
+        <w:t xml:space="preserve"> </w:t>
+      </w:r>
+      <w:r>
+        <w:t xml:space="preserve">instead of</w:t>
+      </w:r>
+      <w:r>
+        <w:t xml:space="preserve"> </w:t>
+      </w:r>
+      <w:r>
+        <w:rPr>
+          <w:rStyle w:val="VerbatimChar"/>
+        </w:rPr>
+        <w:t xml:space="preserve">contract_version</w:t>
+      </w:r>
+      <w:r>
+        <w:t xml:space="preserve">. Your stored sync cursor works at the new address, so no new full load is needed.</w:t>
       </w:r>
     </w:p>
     <w:bookmarkEnd w:id="22"/>
@@ -871,45 +976,6 @@
           <w:rStyle w:val="FunctionTok"/>
         </w:rPr>
         <w:t xml:space="preserve">{</w:t>
-      </w:r>
-      <w:r>
-        <w:br/>
-      </w:r>
-      <w:r>
-        <w:rPr>
-          <w:rStyle w:val="NormalTok"/>
-        </w:rPr>
-        <w:t xml:space="preserve">  </w:t>
-      </w:r>
-      <w:r>
-        <w:rPr>
-          <w:rStyle w:val="DataTypeTok"/>
-        </w:rPr>
-        <w:t xml:space="preserve">"contract"</w:t>
-      </w:r>
-      <w:r>
-        <w:rPr>
-          <w:rStyle w:val="FunctionTok"/>
-        </w:rPr>
-        <w:t xml:space="preserve">:</w:t>
-      </w:r>
-      <w:r>
-        <w:rPr>
-          <w:rStyle w:val="NormalTok"/>
-        </w:rPr>
-        <w:t xml:space="preserve"> </w:t>
-      </w:r>
-      <w:r>
-        <w:rPr>
-          <w:rStyle w:val="StringTok"/>
-        </w:rPr>
-        <w:t xml:space="preserve">"website-search-v2"</w:t>
-      </w:r>
-      <w:r>
-        <w:rPr>
-          <w:rStyle w:val="FunctionTok"/>
-        </w:rPr>
-        <w:t xml:space="preserve">,</w:t>
       </w:r>
       <w:r>
         <w:br/>
@@ -1227,7 +1293,7 @@
         <w:rPr>
           <w:rStyle w:val="VerbatimChar"/>
         </w:rPr>
-        <w:t xml:space="preserve">contract_version: "website-search-v2"</w:t>
+        <w:t xml:space="preserve">api_version: "website-v2"</w:t>
       </w:r>
       <w:r>
         <w:t xml:space="preserve"> </w:t>
@@ -1261,6 +1327,45 @@
       </w:r>
       <w:r>
         <w:t xml:space="preserve">when you report a problem.</w:t>
+      </w:r>
+    </w:p>
+    <w:p>
+      <w:pPr>
+        <w:numPr>
+          <w:ilvl w:val="0"/>
+          <w:numId w:val="1004"/>
+        </w:numPr>
+        <w:pStyle w:val="Compact"/>
+      </w:pPr>
+      <w:r>
+        <w:t xml:space="preserve">An error reply is</w:t>
+      </w:r>
+      <w:r>
+        <w:t xml:space="preserve"> </w:t>
+      </w:r>
+      <w:r>
+        <w:rPr>
+          <w:rStyle w:val="VerbatimChar"/>
+        </w:rPr>
+        <w:t xml:space="preserve">{ api_version, error: { code, message, detail }, request_id }</w:t>
+      </w:r>
+      <w:r>
+        <w:t xml:space="preserve">;</w:t>
+      </w:r>
+      <w:r>
+        <w:t xml:space="preserve"> </w:t>
+      </w:r>
+      <w:r>
+        <w:rPr>
+          <w:rStyle w:val="VerbatimChar"/>
+        </w:rPr>
+        <w:t xml:space="preserve">detail</w:t>
+      </w:r>
+      <w:r>
+        <w:t xml:space="preserve"> </w:t>
+      </w:r>
+      <w:r>
+        <w:t xml:space="preserve">says what was wrong where it can.</w:t>
       </w:r>
     </w:p>
     <w:p>
@@ -1479,19 +1584,19 @@
               <w:rPr>
                 <w:rStyle w:val="VerbatimChar"/>
               </w:rPr>
-              <w:t xml:space="preserve">INVALID_ACTION</w:t>
-            </w:r>
-          </w:p>
-        </w:tc>
-        <w:tc>
-          <w:tcPr/>
-          <w:p>
-            <w:pPr>
-              <w:pStyle w:val="Compact"/>
-              <w:jc w:val="left"/>
-            </w:pPr>
-            <w:r>
-              <w:t xml:space="preserve">The action is not in the contract</w:t>
+              <w:t xml:space="preserve">INVALID_JSON</w:t>
+            </w:r>
+          </w:p>
+        </w:tc>
+        <w:tc>
+          <w:tcPr/>
+          <w:p>
+            <w:pPr>
+              <w:pStyle w:val="Compact"/>
+              <w:jc w:val="left"/>
+            </w:pPr>
+            <w:r>
+              <w:t xml:space="preserve">The body is not a JSON object</w:t>
             </w:r>
           </w:p>
         </w:tc>
@@ -1505,34 +1610,34 @@
               <w:jc w:val="left"/>
             </w:pPr>
             <w:r>
-              <w:t xml:space="preserve">401</w:t>
-            </w:r>
-          </w:p>
-        </w:tc>
-        <w:tc>
-          <w:tcPr/>
-          <w:p>
-            <w:pPr>
-              <w:pStyle w:val="Compact"/>
-              <w:jc w:val="left"/>
-            </w:pPr>
-            <w:r>
-              <w:rPr>
-                <w:rStyle w:val="VerbatimChar"/>
-              </w:rPr>
-              <w:t xml:space="preserve">AUTHENTICATION_REQUIRED</w:t>
-            </w:r>
-          </w:p>
-        </w:tc>
-        <w:tc>
-          <w:tcPr/>
-          <w:p>
-            <w:pPr>
-              <w:pStyle w:val="Compact"/>
-              <w:jc w:val="left"/>
-            </w:pPr>
-            <w:r>
-              <w:t xml:space="preserve">Missing or invalid key</w:t>
+              <w:t xml:space="preserve">400</w:t>
+            </w:r>
+          </w:p>
+        </w:tc>
+        <w:tc>
+          <w:tcPr/>
+          <w:p>
+            <w:pPr>
+              <w:pStyle w:val="Compact"/>
+              <w:jc w:val="left"/>
+            </w:pPr>
+            <w:r>
+              <w:rPr>
+                <w:rStyle w:val="VerbatimChar"/>
+              </w:rPr>
+              <w:t xml:space="preserve">INVALID_ACTION</w:t>
+            </w:r>
+          </w:p>
+        </w:tc>
+        <w:tc>
+          <w:tcPr/>
+          <w:p>
+            <w:pPr>
+              <w:pStyle w:val="Compact"/>
+              <w:jc w:val="left"/>
+            </w:pPr>
+            <w:r>
+              <w:t xml:space="preserve">The action is not one of the nine</w:t>
             </w:r>
           </w:p>
         </w:tc>
@@ -1546,34 +1651,34 @@
               <w:jc w:val="left"/>
             </w:pPr>
             <w:r>
-              <w:t xml:space="preserve">404</w:t>
-            </w:r>
-          </w:p>
-        </w:tc>
-        <w:tc>
-          <w:tcPr/>
-          <w:p>
-            <w:pPr>
-              <w:pStyle w:val="Compact"/>
-              <w:jc w:val="left"/>
-            </w:pPr>
-            <w:r>
-              <w:rPr>
-                <w:rStyle w:val="VerbatimChar"/>
-              </w:rPr>
-              <w:t xml:space="preserve">NOT_FOUND</w:t>
-            </w:r>
-          </w:p>
-        </w:tc>
-        <w:tc>
-          <w:tcPr/>
-          <w:p>
-            <w:pPr>
-              <w:pStyle w:val="Compact"/>
-              <w:jc w:val="left"/>
-            </w:pPr>
-            <w:r>
-              <w:t xml:space="preserve">The course, provider or scholarship identifier was not found</w:t>
+              <w:t xml:space="preserve">401</w:t>
+            </w:r>
+          </w:p>
+        </w:tc>
+        <w:tc>
+          <w:tcPr/>
+          <w:p>
+            <w:pPr>
+              <w:pStyle w:val="Compact"/>
+              <w:jc w:val="left"/>
+            </w:pPr>
+            <w:r>
+              <w:rPr>
+                <w:rStyle w:val="VerbatimChar"/>
+              </w:rPr>
+              <w:t xml:space="preserve">AUTHENTICATION_REQUIRED</w:t>
+            </w:r>
+          </w:p>
+        </w:tc>
+        <w:tc>
+          <w:tcPr/>
+          <w:p>
+            <w:pPr>
+              <w:pStyle w:val="Compact"/>
+              <w:jc w:val="left"/>
+            </w:pPr>
+            <w:r>
+              <w:t xml:space="preserve">Missing or invalid key</w:t>
             </w:r>
           </w:p>
         </w:tc>
@@ -1587,6 +1692,47 @@
               <w:jc w:val="left"/>
             </w:pPr>
             <w:r>
+              <w:t xml:space="preserve">404</w:t>
+            </w:r>
+          </w:p>
+        </w:tc>
+        <w:tc>
+          <w:tcPr/>
+          <w:p>
+            <w:pPr>
+              <w:pStyle w:val="Compact"/>
+              <w:jc w:val="left"/>
+            </w:pPr>
+            <w:r>
+              <w:rPr>
+                <w:rStyle w:val="VerbatimChar"/>
+              </w:rPr>
+              <w:t xml:space="preserve">NOT_FOUND</w:t>
+            </w:r>
+          </w:p>
+        </w:tc>
+        <w:tc>
+          <w:tcPr/>
+          <w:p>
+            <w:pPr>
+              <w:pStyle w:val="Compact"/>
+              <w:jc w:val="left"/>
+            </w:pPr>
+            <w:r>
+              <w:t xml:space="preserve">The course, provider or scholarship identifier was not found</w:t>
+            </w:r>
+          </w:p>
+        </w:tc>
+      </w:tr>
+      <w:tr>
+        <w:tc>
+          <w:tcPr/>
+          <w:p>
+            <w:pPr>
+              <w:pStyle w:val="Compact"/>
+              <w:jc w:val="left"/>
+            </w:pPr>
+            <w:r>
               <w:t xml:space="preserve">429</w:t>
             </w:r>
           </w:p>
@@ -1614,7 +1760,7 @@
               <w:jc w:val="left"/>
             </w:pPr>
             <w:r>
-              <w:t xml:space="preserve">Over 60 a minute for that action; wait for</w:t>
+              <w:t xml:space="preserve">Over 300 a minute for your key; wait for</w:t>
             </w:r>
             <w:r>
               <w:t xml:space="preserve"> </w:t>
@@ -2242,45 +2388,6 @@
           <w:rStyle w:val="FunctionTok"/>
         </w:rPr>
         <w:t xml:space="preserve">{</w:t>
-      </w:r>
-      <w:r>
-        <w:br/>
-      </w:r>
-      <w:r>
-        <w:rPr>
-          <w:rStyle w:val="NormalTok"/>
-        </w:rPr>
-        <w:t xml:space="preserve">  </w:t>
-      </w:r>
-      <w:r>
-        <w:rPr>
-          <w:rStyle w:val="DataTypeTok"/>
-        </w:rPr>
-        <w:t xml:space="preserve">"contract"</w:t>
-      </w:r>
-      <w:r>
-        <w:rPr>
-          <w:rStyle w:val="FunctionTok"/>
-        </w:rPr>
-        <w:t xml:space="preserve">:</w:t>
-      </w:r>
-      <w:r>
-        <w:rPr>
-          <w:rStyle w:val="NormalTok"/>
-        </w:rPr>
-        <w:t xml:space="preserve"> </w:t>
-      </w:r>
-      <w:r>
-        <w:rPr>
-          <w:rStyle w:val="StringTok"/>
-        </w:rPr>
-        <w:t xml:space="preserve">"website-search-v2"</w:t>
-      </w:r>
-      <w:r>
-        <w:rPr>
-          <w:rStyle w:val="FunctionTok"/>
-        </w:rPr>
-        <w:t xml:space="preserve">,</w:t>
       </w:r>
       <w:r>
         <w:br/>
@@ -3872,7 +3979,7 @@
         <w:pStyle w:val="FirstParagraph"/>
       </w:pPr>
       <w:r>
-        <w:t xml:space="preserve">Measured on Pilot on 15 October 2026.</w:t>
+        <w:t xml:space="preserve">Measured on Pilot on 16 October 2026.</w:t>
       </w:r>
     </w:p>
     <w:tbl>
@@ -3956,7 +4063,7 @@
               <w:jc w:val="left"/>
             </w:pPr>
             <w:r>
-              <w:t xml:space="preserve">About 40,600 (courses 37,300; providers 1,885; scholarships 1,100; logos 275; ranking sets 56; reference 1)</w:t>
+              <w:t xml:space="preserve">About 41,700 (courses 37,300; providers 1,885; scholarships 1,100; logos 1,399; ranking sets 56; reference 1)</w:t>
             </w:r>
           </w:p>
         </w:tc>
@@ -3982,7 +4089,7 @@
               <w:jc w:val="left"/>
             </w:pPr>
             <w:r>
-              <w:t xml:space="preserve">About 250 at the default page size</w:t>
+              <w:t xml:space="preserve">About 260 at the default page size</w:t>
             </w:r>
           </w:p>
         </w:tc>
@@ -4060,7 +4167,7 @@
               <w:jc w:val="left"/>
             </w:pPr>
             <w:r>
-              <w:t xml:space="preserve">About 5 minutes, paced at the limit of 60 calls a minute</w:t>
+              <w:t xml:space="preserve">About 5 minutes (one page at a time)</w:t>
             </w:r>
           </w:p>
         </w:tc>
@@ -4174,7 +4281,7 @@
           <w:bCs/>
           <w:b/>
         </w:rPr>
-        <w:t xml:space="preserve">Stay within 60 calls a minute.</w:t>
+        <w:t xml:space="preserve">Stay within 300 calls a minute.</w:t>
       </w:r>
       <w:r>
         <w:t xml:space="preserve"> </w:t>
@@ -5014,42 +5121,6 @@
         <w:rPr>
           <w:rStyle w:val="DataTypeTok"/>
         </w:rPr>
-        <w:t xml:space="preserve">"contract"</w:t>
-      </w:r>
-      <w:r>
-        <w:rPr>
-          <w:rStyle w:val="FunctionTok"/>
-        </w:rPr>
-        <w:t xml:space="preserve">:</w:t>
-      </w:r>
-      <w:r>
-        <w:rPr>
-          <w:rStyle w:val="NormalTok"/>
-        </w:rPr>
-        <w:t xml:space="preserve"> </w:t>
-      </w:r>
-      <w:r>
-        <w:rPr>
-          <w:rStyle w:val="StringTok"/>
-        </w:rPr>
-        <w:t xml:space="preserve">"website-search-v2"</w:t>
-      </w:r>
-      <w:r>
-        <w:rPr>
-          <w:rStyle w:val="FunctionTok"/>
-        </w:rPr>
-        <w:t xml:space="preserve">,</w:t>
-      </w:r>
-      <w:r>
-        <w:rPr>
-          <w:rStyle w:val="NormalTok"/>
-        </w:rPr>
-        <w:t xml:space="preserve"> </w:t>
-      </w:r>
-      <w:r>
-        <w:rPr>
-          <w:rStyle w:val="DataTypeTok"/>
-        </w:rPr>
         <w:t xml:space="preserve">"action"</w:t>
       </w:r>
       <w:r>
@@ -5139,45 +5210,6 @@
         <w:rPr>
           <w:rStyle w:val="DataTypeTok"/>
         </w:rPr>
-        <w:t xml:space="preserve">"contract"</w:t>
-      </w:r>
-      <w:r>
-        <w:rPr>
-          <w:rStyle w:val="FunctionTok"/>
-        </w:rPr>
-        <w:t xml:space="preserve">:</w:t>
-      </w:r>
-      <w:r>
-        <w:rPr>
-          <w:rStyle w:val="NormalTok"/>
-        </w:rPr>
-        <w:t xml:space="preserve"> </w:t>
-      </w:r>
-      <w:r>
-        <w:rPr>
-          <w:rStyle w:val="StringTok"/>
-        </w:rPr>
-        <w:t xml:space="preserve">"website-search-v2"</w:t>
-      </w:r>
-      <w:r>
-        <w:rPr>
-          <w:rStyle w:val="FunctionTok"/>
-        </w:rPr>
-        <w:t xml:space="preserve">,</w:t>
-      </w:r>
-      <w:r>
-        <w:br/>
-      </w:r>
-      <w:r>
-        <w:rPr>
-          <w:rStyle w:val="NormalTok"/>
-        </w:rPr>
-        <w:t xml:space="preserve">  </w:t>
-      </w:r>
-      <w:r>
-        <w:rPr>
-          <w:rStyle w:val="DataTypeTok"/>
-        </w:rPr>
         <w:t xml:space="preserve">"action"</w:t>
       </w:r>
       <w:r>
@@ -5705,7 +5737,7 @@
         <w:pStyle w:val="FirstParagraph"/>
       </w:pPr>
       <w:r>
-        <w:t xml:space="preserve">This returned 78 courses on 15 October 2026. All filters are optional and combine with AND.</w:t>
+        <w:t xml:space="preserve">This returned 35 courses on 16 October 2026. All filters are optional and combine with AND.</w:t>
       </w:r>
     </w:p>
     <w:tbl>
@@ -7641,42 +7673,6 @@
         <w:rPr>
           <w:rStyle w:val="DataTypeTok"/>
         </w:rPr>
-        <w:t xml:space="preserve">"contract"</w:t>
-      </w:r>
-      <w:r>
-        <w:rPr>
-          <w:rStyle w:val="FunctionTok"/>
-        </w:rPr>
-        <w:t xml:space="preserve">:</w:t>
-      </w:r>
-      <w:r>
-        <w:rPr>
-          <w:rStyle w:val="NormalTok"/>
-        </w:rPr>
-        <w:t xml:space="preserve"> </w:t>
-      </w:r>
-      <w:r>
-        <w:rPr>
-          <w:rStyle w:val="StringTok"/>
-        </w:rPr>
-        <w:t xml:space="preserve">"website-search-v2"</w:t>
-      </w:r>
-      <w:r>
-        <w:rPr>
-          <w:rStyle w:val="FunctionTok"/>
-        </w:rPr>
-        <w:t xml:space="preserve">,</w:t>
-      </w:r>
-      <w:r>
-        <w:rPr>
-          <w:rStyle w:val="NormalTok"/>
-        </w:rPr>
-        <w:t xml:space="preserve"> </w:t>
-      </w:r>
-      <w:r>
-        <w:rPr>
-          <w:rStyle w:val="DataTypeTok"/>
-        </w:rPr>
         <w:t xml:space="preserve">"action"</w:t>
       </w:r>
       <w:r>
@@ -7910,7 +7906,7 @@
         <w:rPr>
           <w:rStyle w:val="DataTypeTok"/>
         </w:rPr>
-        <w:t xml:space="preserve">"contract"</w:t>
+        <w:t xml:space="preserve">"action"</w:t>
       </w:r>
       <w:r>
         <w:rPr>
@@ -7928,7 +7924,7 @@
         <w:rPr>
           <w:rStyle w:val="StringTok"/>
         </w:rPr>
-        <w:t xml:space="preserve">"website-search-v2"</w:t>
+        <w:t xml:space="preserve">"providers"</w:t>
       </w:r>
       <w:r>
         <w:rPr>
@@ -7937,16 +7933,19 @@
         <w:t xml:space="preserve">,</w:t>
       </w:r>
       <w:r>
+        <w:br/>
+      </w:r>
+      <w:r>
         <w:rPr>
           <w:rStyle w:val="NormalTok"/>
         </w:rPr>
-        <w:t xml:space="preserve"> </w:t>
+        <w:t xml:space="preserve">  </w:t>
       </w:r>
       <w:r>
         <w:rPr>
           <w:rStyle w:val="DataTypeTok"/>
         </w:rPr>
-        <w:t xml:space="preserve">"action"</w:t>
+        <w:t xml:space="preserve">"filters"</w:t>
       </w:r>
       <w:r>
         <w:rPr>
@@ -7962,9 +7961,51 @@
       </w:r>
       <w:r>
         <w:rPr>
+          <w:rStyle w:val="FunctionTok"/>
+        </w:rPr>
+        <w:t xml:space="preserve">{</w:t>
+      </w:r>
+      <w:r>
+        <w:rPr>
+          <w:rStyle w:val="NormalTok"/>
+        </w:rPr>
+        <w:t xml:space="preserve"> </w:t>
+      </w:r>
+      <w:r>
+        <w:rPr>
+          <w:rStyle w:val="DataTypeTok"/>
+        </w:rPr>
+        <w:t xml:space="preserve">"country_codes"</w:t>
+      </w:r>
+      <w:r>
+        <w:rPr>
+          <w:rStyle w:val="FunctionTok"/>
+        </w:rPr>
+        <w:t xml:space="preserve">:</w:t>
+      </w:r>
+      <w:r>
+        <w:rPr>
+          <w:rStyle w:val="NormalTok"/>
+        </w:rPr>
+        <w:t xml:space="preserve"> </w:t>
+      </w:r>
+      <w:r>
+        <w:rPr>
+          <w:rStyle w:val="OtherTok"/>
+        </w:rPr>
+        <w:t xml:space="preserve">[</w:t>
+      </w:r>
+      <w:r>
+        <w:rPr>
           <w:rStyle w:val="StringTok"/>
         </w:rPr>
-        <w:t xml:space="preserve">"providers"</w:t>
+        <w:t xml:space="preserve">"AU"</w:t>
+      </w:r>
+      <w:r>
+        <w:rPr>
+          <w:rStyle w:val="OtherTok"/>
+        </w:rPr>
+        <w:t xml:space="preserve">]</w:t>
       </w:r>
       <w:r>
         <w:rPr>
@@ -7973,6 +8014,60 @@
         <w:t xml:space="preserve">,</w:t>
       </w:r>
       <w:r>
+        <w:rPr>
+          <w:rStyle w:val="NormalTok"/>
+        </w:rPr>
+        <w:t xml:space="preserve"> </w:t>
+      </w:r>
+      <w:r>
+        <w:rPr>
+          <w:rStyle w:val="DataTypeTok"/>
+        </w:rPr>
+        <w:t xml:space="preserve">"university_groups"</w:t>
+      </w:r>
+      <w:r>
+        <w:rPr>
+          <w:rStyle w:val="FunctionTok"/>
+        </w:rPr>
+        <w:t xml:space="preserve">:</w:t>
+      </w:r>
+      <w:r>
+        <w:rPr>
+          <w:rStyle w:val="NormalTok"/>
+        </w:rPr>
+        <w:t xml:space="preserve"> </w:t>
+      </w:r>
+      <w:r>
+        <w:rPr>
+          <w:rStyle w:val="OtherTok"/>
+        </w:rPr>
+        <w:t xml:space="preserve">[</w:t>
+      </w:r>
+      <w:r>
+        <w:rPr>
+          <w:rStyle w:val="StringTok"/>
+        </w:rPr>
+        <w:t xml:space="preserve">"go8"</w:t>
+      </w:r>
+      <w:r>
+        <w:rPr>
+          <w:rStyle w:val="OtherTok"/>
+        </w:rPr>
+        <w:t xml:space="preserve">]</w:t>
+      </w:r>
+      <w:r>
+        <w:rPr>
+          <w:rStyle w:val="NormalTok"/>
+        </w:rPr>
+        <w:t xml:space="preserve"> </w:t>
+      </w:r>
+      <w:r>
+        <w:rPr>
+          <w:rStyle w:val="FunctionTok"/>
+        </w:rPr>
+        <w:t xml:space="preserve">},</w:t>
+      </w:r>
+      <w:r>
         <w:br/>
       </w:r>
       <w:r>
@@ -7985,7 +8080,7 @@
         <w:rPr>
           <w:rStyle w:val="DataTypeTok"/>
         </w:rPr>
-        <w:t xml:space="preserve">"filters"</w:t>
+        <w:t xml:space="preserve">"sort"</w:t>
       </w:r>
       <w:r>
         <w:rPr>
@@ -8001,273 +8096,102 @@
       </w:r>
       <w:r>
         <w:rPr>
+          <w:rStyle w:val="StringTok"/>
+        </w:rPr>
+        <w:t xml:space="preserve">"qs_rank_asc"</w:t>
+      </w:r>
+      <w:r>
+        <w:rPr>
           <w:rStyle w:val="FunctionTok"/>
         </w:rPr>
+        <w:t xml:space="preserve">,</w:t>
+      </w:r>
+      <w:r>
+        <w:rPr>
+          <w:rStyle w:val="NormalTok"/>
+        </w:rPr>
+        <w:t xml:space="preserve"> </w:t>
+      </w:r>
+      <w:r>
+        <w:rPr>
+          <w:rStyle w:val="DataTypeTok"/>
+        </w:rPr>
+        <w:t xml:space="preserve">"page"</w:t>
+      </w:r>
+      <w:r>
+        <w:rPr>
+          <w:rStyle w:val="FunctionTok"/>
+        </w:rPr>
+        <w:t xml:space="preserve">:</w:t>
+      </w:r>
+      <w:r>
+        <w:rPr>
+          <w:rStyle w:val="NormalTok"/>
+        </w:rPr>
+        <w:t xml:space="preserve"> </w:t>
+      </w:r>
+      <w:r>
+        <w:rPr>
+          <w:rStyle w:val="DecValTok"/>
+        </w:rPr>
+        <w:t xml:space="preserve">1</w:t>
+      </w:r>
+      <w:r>
+        <w:rPr>
+          <w:rStyle w:val="FunctionTok"/>
+        </w:rPr>
+        <w:t xml:space="preserve">,</w:t>
+      </w:r>
+      <w:r>
+        <w:rPr>
+          <w:rStyle w:val="NormalTok"/>
+        </w:rPr>
+        <w:t xml:space="preserve"> </w:t>
+      </w:r>
+      <w:r>
+        <w:rPr>
+          <w:rStyle w:val="DataTypeTok"/>
+        </w:rPr>
+        <w:t xml:space="preserve">"page_size"</w:t>
+      </w:r>
+      <w:r>
+        <w:rPr>
+          <w:rStyle w:val="FunctionTok"/>
+        </w:rPr>
+        <w:t xml:space="preserve">:</w:t>
+      </w:r>
+      <w:r>
+        <w:rPr>
+          <w:rStyle w:val="NormalTok"/>
+        </w:rPr>
+        <w:t xml:space="preserve"> </w:t>
+      </w:r>
+      <w:r>
+        <w:rPr>
+          <w:rStyle w:val="DecValTok"/>
+        </w:rPr>
+        <w:t xml:space="preserve">6</w:t>
+      </w:r>
+      <w:r>
+        <w:rPr>
+          <w:rStyle w:val="NormalTok"/>
+        </w:rPr>
+        <w:t xml:space="preserve"> </w:t>
+      </w:r>
+      <w:r>
+        <w:rPr>
+          <w:rStyle w:val="FunctionTok"/>
+        </w:rPr>
+        <w:t xml:space="preserve">}</w:t>
+      </w:r>
+      <w:r>
+        <w:br/>
+      </w:r>
+      <w:r>
+        <w:rPr>
+          <w:rStyle w:val="FunctionTok"/>
+        </w:rPr>
         <w:t xml:space="preserve">{</w:t>
-      </w:r>
-      <w:r>
-        <w:rPr>
-          <w:rStyle w:val="NormalTok"/>
-        </w:rPr>
-        <w:t xml:space="preserve"> </w:t>
-      </w:r>
-      <w:r>
-        <w:rPr>
-          <w:rStyle w:val="DataTypeTok"/>
-        </w:rPr>
-        <w:t xml:space="preserve">"country_codes"</w:t>
-      </w:r>
-      <w:r>
-        <w:rPr>
-          <w:rStyle w:val="FunctionTok"/>
-        </w:rPr>
-        <w:t xml:space="preserve">:</w:t>
-      </w:r>
-      <w:r>
-        <w:rPr>
-          <w:rStyle w:val="NormalTok"/>
-        </w:rPr>
-        <w:t xml:space="preserve"> </w:t>
-      </w:r>
-      <w:r>
-        <w:rPr>
-          <w:rStyle w:val="OtherTok"/>
-        </w:rPr>
-        <w:t xml:space="preserve">[</w:t>
-      </w:r>
-      <w:r>
-        <w:rPr>
-          <w:rStyle w:val="StringTok"/>
-        </w:rPr>
-        <w:t xml:space="preserve">"AU"</w:t>
-      </w:r>
-      <w:r>
-        <w:rPr>
-          <w:rStyle w:val="OtherTok"/>
-        </w:rPr>
-        <w:t xml:space="preserve">]</w:t>
-      </w:r>
-      <w:r>
-        <w:rPr>
-          <w:rStyle w:val="FunctionTok"/>
-        </w:rPr>
-        <w:t xml:space="preserve">,</w:t>
-      </w:r>
-      <w:r>
-        <w:rPr>
-          <w:rStyle w:val="NormalTok"/>
-        </w:rPr>
-        <w:t xml:space="preserve"> </w:t>
-      </w:r>
-      <w:r>
-        <w:rPr>
-          <w:rStyle w:val="DataTypeTok"/>
-        </w:rPr>
-        <w:t xml:space="preserve">"university_groups"</w:t>
-      </w:r>
-      <w:r>
-        <w:rPr>
-          <w:rStyle w:val="FunctionTok"/>
-        </w:rPr>
-        <w:t xml:space="preserve">:</w:t>
-      </w:r>
-      <w:r>
-        <w:rPr>
-          <w:rStyle w:val="NormalTok"/>
-        </w:rPr>
-        <w:t xml:space="preserve"> </w:t>
-      </w:r>
-      <w:r>
-        <w:rPr>
-          <w:rStyle w:val="OtherTok"/>
-        </w:rPr>
-        <w:t xml:space="preserve">[</w:t>
-      </w:r>
-      <w:r>
-        <w:rPr>
-          <w:rStyle w:val="StringTok"/>
-        </w:rPr>
-        <w:t xml:space="preserve">"go8"</w:t>
-      </w:r>
-      <w:r>
-        <w:rPr>
-          <w:rStyle w:val="OtherTok"/>
-        </w:rPr>
-        <w:t xml:space="preserve">]</w:t>
-      </w:r>
-      <w:r>
-        <w:rPr>
-          <w:rStyle w:val="NormalTok"/>
-        </w:rPr>
-        <w:t xml:space="preserve"> </w:t>
-      </w:r>
-      <w:r>
-        <w:rPr>
-          <w:rStyle w:val="FunctionTok"/>
-        </w:rPr>
-        <w:t xml:space="preserve">},</w:t>
-      </w:r>
-      <w:r>
-        <w:br/>
-      </w:r>
-      <w:r>
-        <w:rPr>
-          <w:rStyle w:val="NormalTok"/>
-        </w:rPr>
-        <w:t xml:space="preserve">  </w:t>
-      </w:r>
-      <w:r>
-        <w:rPr>
-          <w:rStyle w:val="DataTypeTok"/>
-        </w:rPr>
-        <w:t xml:space="preserve">"sort"</w:t>
-      </w:r>
-      <w:r>
-        <w:rPr>
-          <w:rStyle w:val="FunctionTok"/>
-        </w:rPr>
-        <w:t xml:space="preserve">:</w:t>
-      </w:r>
-      <w:r>
-        <w:rPr>
-          <w:rStyle w:val="NormalTok"/>
-        </w:rPr>
-        <w:t xml:space="preserve"> </w:t>
-      </w:r>
-      <w:r>
-        <w:rPr>
-          <w:rStyle w:val="StringTok"/>
-        </w:rPr>
-        <w:t xml:space="preserve">"qs_rank_asc"</w:t>
-      </w:r>
-      <w:r>
-        <w:rPr>
-          <w:rStyle w:val="FunctionTok"/>
-        </w:rPr>
-        <w:t xml:space="preserve">,</w:t>
-      </w:r>
-      <w:r>
-        <w:rPr>
-          <w:rStyle w:val="NormalTok"/>
-        </w:rPr>
-        <w:t xml:space="preserve"> </w:t>
-      </w:r>
-      <w:r>
-        <w:rPr>
-          <w:rStyle w:val="DataTypeTok"/>
-        </w:rPr>
-        <w:t xml:space="preserve">"page"</w:t>
-      </w:r>
-      <w:r>
-        <w:rPr>
-          <w:rStyle w:val="FunctionTok"/>
-        </w:rPr>
-        <w:t xml:space="preserve">:</w:t>
-      </w:r>
-      <w:r>
-        <w:rPr>
-          <w:rStyle w:val="NormalTok"/>
-        </w:rPr>
-        <w:t xml:space="preserve"> </w:t>
-      </w:r>
-      <w:r>
-        <w:rPr>
-          <w:rStyle w:val="DecValTok"/>
-        </w:rPr>
-        <w:t xml:space="preserve">1</w:t>
-      </w:r>
-      <w:r>
-        <w:rPr>
-          <w:rStyle w:val="FunctionTok"/>
-        </w:rPr>
-        <w:t xml:space="preserve">,</w:t>
-      </w:r>
-      <w:r>
-        <w:rPr>
-          <w:rStyle w:val="NormalTok"/>
-        </w:rPr>
-        <w:t xml:space="preserve"> </w:t>
-      </w:r>
-      <w:r>
-        <w:rPr>
-          <w:rStyle w:val="DataTypeTok"/>
-        </w:rPr>
-        <w:t xml:space="preserve">"page_size"</w:t>
-      </w:r>
-      <w:r>
-        <w:rPr>
-          <w:rStyle w:val="FunctionTok"/>
-        </w:rPr>
-        <w:t xml:space="preserve">:</w:t>
-      </w:r>
-      <w:r>
-        <w:rPr>
-          <w:rStyle w:val="NormalTok"/>
-        </w:rPr>
-        <w:t xml:space="preserve"> </w:t>
-      </w:r>
-      <w:r>
-        <w:rPr>
-          <w:rStyle w:val="DecValTok"/>
-        </w:rPr>
-        <w:t xml:space="preserve">6</w:t>
-      </w:r>
-      <w:r>
-        <w:rPr>
-          <w:rStyle w:val="NormalTok"/>
-        </w:rPr>
-        <w:t xml:space="preserve"> </w:t>
-      </w:r>
-      <w:r>
-        <w:rPr>
-          <w:rStyle w:val="FunctionTok"/>
-        </w:rPr>
-        <w:t xml:space="preserve">}</w:t>
-      </w:r>
-      <w:r>
-        <w:br/>
-      </w:r>
-      <w:r>
-        <w:rPr>
-          <w:rStyle w:val="FunctionTok"/>
-        </w:rPr>
-        <w:t xml:space="preserve">{</w:t>
-      </w:r>
-      <w:r>
-        <w:rPr>
-          <w:rStyle w:val="NormalTok"/>
-        </w:rPr>
-        <w:t xml:space="preserve"> </w:t>
-      </w:r>
-      <w:r>
-        <w:rPr>
-          <w:rStyle w:val="DataTypeTok"/>
-        </w:rPr>
-        <w:t xml:space="preserve">"contract"</w:t>
-      </w:r>
-      <w:r>
-        <w:rPr>
-          <w:rStyle w:val="FunctionTok"/>
-        </w:rPr>
-        <w:t xml:space="preserve">:</w:t>
-      </w:r>
-      <w:r>
-        <w:rPr>
-          <w:rStyle w:val="NormalTok"/>
-        </w:rPr>
-        <w:t xml:space="preserve"> </w:t>
-      </w:r>
-      <w:r>
-        <w:rPr>
-          <w:rStyle w:val="StringTok"/>
-        </w:rPr>
-        <w:t xml:space="preserve">"website-search-v2"</w:t>
-      </w:r>
-      <w:r>
-        <w:rPr>
-          <w:rStyle w:val="FunctionTok"/>
-        </w:rPr>
-        <w:t xml:space="preserve">,</w:t>
       </w:r>
       <w:r>
         <w:rPr>
@@ -9450,7 +9374,7 @@
         <w:rPr>
           <w:rStyle w:val="DataTypeTok"/>
         </w:rPr>
-        <w:t xml:space="preserve">"contract"</w:t>
+        <w:t xml:space="preserve">"action"</w:t>
       </w:r>
       <w:r>
         <w:rPr>
@@ -9468,7 +9392,7 @@
         <w:rPr>
           <w:rStyle w:val="StringTok"/>
         </w:rPr>
-        <w:t xml:space="preserve">"website-search-v2"</w:t>
+        <w:t xml:space="preserve">"scholarships"</w:t>
       </w:r>
       <w:r>
         <w:rPr>
@@ -9477,16 +9401,19 @@
         <w:t xml:space="preserve">,</w:t>
       </w:r>
       <w:r>
+        <w:br/>
+      </w:r>
+      <w:r>
         <w:rPr>
           <w:rStyle w:val="NormalTok"/>
         </w:rPr>
-        <w:t xml:space="preserve"> </w:t>
+        <w:t xml:space="preserve">  </w:t>
       </w:r>
       <w:r>
         <w:rPr>
           <w:rStyle w:val="DataTypeTok"/>
         </w:rPr>
-        <w:t xml:space="preserve">"action"</w:t>
+        <w:t xml:space="preserve">"filters"</w:t>
       </w:r>
       <w:r>
         <w:rPr>
@@ -9502,225 +9429,150 @@
       </w:r>
       <w:r>
         <w:rPr>
+          <w:rStyle w:val="FunctionTok"/>
+        </w:rPr>
+        <w:t xml:space="preserve">{</w:t>
+      </w:r>
+      <w:r>
+        <w:rPr>
+          <w:rStyle w:val="NormalTok"/>
+        </w:rPr>
+        <w:t xml:space="preserve"> </w:t>
+      </w:r>
+      <w:r>
+        <w:rPr>
+          <w:rStyle w:val="DataTypeTok"/>
+        </w:rPr>
+        <w:t xml:space="preserve">"student_types"</w:t>
+      </w:r>
+      <w:r>
+        <w:rPr>
+          <w:rStyle w:val="FunctionTok"/>
+        </w:rPr>
+        <w:t xml:space="preserve">:</w:t>
+      </w:r>
+      <w:r>
+        <w:rPr>
+          <w:rStyle w:val="NormalTok"/>
+        </w:rPr>
+        <w:t xml:space="preserve"> </w:t>
+      </w:r>
+      <w:r>
+        <w:rPr>
+          <w:rStyle w:val="OtherTok"/>
+        </w:rPr>
+        <w:t xml:space="preserve">[</w:t>
+      </w:r>
+      <w:r>
+        <w:rPr>
           <w:rStyle w:val="StringTok"/>
         </w:rPr>
-        <w:t xml:space="preserve">"scholarships"</w:t>
+        <w:t xml:space="preserve">"international"</w:t>
+      </w:r>
+      <w:r>
+        <w:rPr>
+          <w:rStyle w:val="OtherTok"/>
+        </w:rPr>
+        <w:t xml:space="preserve">]</w:t>
+      </w:r>
+      <w:r>
+        <w:rPr>
+          <w:rStyle w:val="NormalTok"/>
+        </w:rPr>
+        <w:t xml:space="preserve"> </w:t>
       </w:r>
       <w:r>
         <w:rPr>
           <w:rStyle w:val="FunctionTok"/>
         </w:rPr>
+        <w:t xml:space="preserve">},</w:t>
+      </w:r>
+      <w:r>
+        <w:rPr>
+          <w:rStyle w:val="NormalTok"/>
+        </w:rPr>
+        <w:t xml:space="preserve"> </w:t>
+      </w:r>
+      <w:r>
+        <w:rPr>
+          <w:rStyle w:val="DataTypeTok"/>
+        </w:rPr>
+        <w:t xml:space="preserve">"page"</w:t>
+      </w:r>
+      <w:r>
+        <w:rPr>
+          <w:rStyle w:val="FunctionTok"/>
+        </w:rPr>
+        <w:t xml:space="preserve">:</w:t>
+      </w:r>
+      <w:r>
+        <w:rPr>
+          <w:rStyle w:val="NormalTok"/>
+        </w:rPr>
+        <w:t xml:space="preserve"> </w:t>
+      </w:r>
+      <w:r>
+        <w:rPr>
+          <w:rStyle w:val="DecValTok"/>
+        </w:rPr>
+        <w:t xml:space="preserve">1</w:t>
+      </w:r>
+      <w:r>
+        <w:rPr>
+          <w:rStyle w:val="FunctionTok"/>
+        </w:rPr>
         <w:t xml:space="preserve">,</w:t>
       </w:r>
       <w:r>
+        <w:rPr>
+          <w:rStyle w:val="NormalTok"/>
+        </w:rPr>
+        <w:t xml:space="preserve"> </w:t>
+      </w:r>
+      <w:r>
+        <w:rPr>
+          <w:rStyle w:val="DataTypeTok"/>
+        </w:rPr>
+        <w:t xml:space="preserve">"page_size"</w:t>
+      </w:r>
+      <w:r>
+        <w:rPr>
+          <w:rStyle w:val="FunctionTok"/>
+        </w:rPr>
+        <w:t xml:space="preserve">:</w:t>
+      </w:r>
+      <w:r>
+        <w:rPr>
+          <w:rStyle w:val="NormalTok"/>
+        </w:rPr>
+        <w:t xml:space="preserve"> </w:t>
+      </w:r>
+      <w:r>
+        <w:rPr>
+          <w:rStyle w:val="DecValTok"/>
+        </w:rPr>
+        <w:t xml:space="preserve">10</w:t>
+      </w:r>
+      <w:r>
+        <w:rPr>
+          <w:rStyle w:val="NormalTok"/>
+        </w:rPr>
+        <w:t xml:space="preserve"> </w:t>
+      </w:r>
+      <w:r>
+        <w:rPr>
+          <w:rStyle w:val="FunctionTok"/>
+        </w:rPr>
+        <w:t xml:space="preserve">}</w:t>
+      </w:r>
+      <w:r>
         <w:br/>
       </w:r>
       <w:r>
         <w:rPr>
-          <w:rStyle w:val="NormalTok"/>
-        </w:rPr>
-        <w:t xml:space="preserve">  </w:t>
-      </w:r>
-      <w:r>
-        <w:rPr>
-          <w:rStyle w:val="DataTypeTok"/>
-        </w:rPr>
-        <w:t xml:space="preserve">"filters"</w:t>
-      </w:r>
-      <w:r>
-        <w:rPr>
           <w:rStyle w:val="FunctionTok"/>
         </w:rPr>
-        <w:t xml:space="preserve">:</w:t>
-      </w:r>
-      <w:r>
-        <w:rPr>
-          <w:rStyle w:val="NormalTok"/>
-        </w:rPr>
-        <w:t xml:space="preserve"> </w:t>
-      </w:r>
-      <w:r>
-        <w:rPr>
-          <w:rStyle w:val="FunctionTok"/>
-        </w:rPr>
         <w:t xml:space="preserve">{</w:t>
-      </w:r>
-      <w:r>
-        <w:rPr>
-          <w:rStyle w:val="NormalTok"/>
-        </w:rPr>
-        <w:t xml:space="preserve"> </w:t>
-      </w:r>
-      <w:r>
-        <w:rPr>
-          <w:rStyle w:val="DataTypeTok"/>
-        </w:rPr>
-        <w:t xml:space="preserve">"student_types"</w:t>
-      </w:r>
-      <w:r>
-        <w:rPr>
-          <w:rStyle w:val="FunctionTok"/>
-        </w:rPr>
-        <w:t xml:space="preserve">:</w:t>
-      </w:r>
-      <w:r>
-        <w:rPr>
-          <w:rStyle w:val="NormalTok"/>
-        </w:rPr>
-        <w:t xml:space="preserve"> </w:t>
-      </w:r>
-      <w:r>
-        <w:rPr>
-          <w:rStyle w:val="OtherTok"/>
-        </w:rPr>
-        <w:t xml:space="preserve">[</w:t>
-      </w:r>
-      <w:r>
-        <w:rPr>
-          <w:rStyle w:val="StringTok"/>
-        </w:rPr>
-        <w:t xml:space="preserve">"international"</w:t>
-      </w:r>
-      <w:r>
-        <w:rPr>
-          <w:rStyle w:val="OtherTok"/>
-        </w:rPr>
-        <w:t xml:space="preserve">]</w:t>
-      </w:r>
-      <w:r>
-        <w:rPr>
-          <w:rStyle w:val="NormalTok"/>
-        </w:rPr>
-        <w:t xml:space="preserve"> </w:t>
-      </w:r>
-      <w:r>
-        <w:rPr>
-          <w:rStyle w:val="FunctionTok"/>
-        </w:rPr>
-        <w:t xml:space="preserve">},</w:t>
-      </w:r>
-      <w:r>
-        <w:rPr>
-          <w:rStyle w:val="NormalTok"/>
-        </w:rPr>
-        <w:t xml:space="preserve"> </w:t>
-      </w:r>
-      <w:r>
-        <w:rPr>
-          <w:rStyle w:val="DataTypeTok"/>
-        </w:rPr>
-        <w:t xml:space="preserve">"page"</w:t>
-      </w:r>
-      <w:r>
-        <w:rPr>
-          <w:rStyle w:val="FunctionTok"/>
-        </w:rPr>
-        <w:t xml:space="preserve">:</w:t>
-      </w:r>
-      <w:r>
-        <w:rPr>
-          <w:rStyle w:val="NormalTok"/>
-        </w:rPr>
-        <w:t xml:space="preserve"> </w:t>
-      </w:r>
-      <w:r>
-        <w:rPr>
-          <w:rStyle w:val="DecValTok"/>
-        </w:rPr>
-        <w:t xml:space="preserve">1</w:t>
-      </w:r>
-      <w:r>
-        <w:rPr>
-          <w:rStyle w:val="FunctionTok"/>
-        </w:rPr>
-        <w:t xml:space="preserve">,</w:t>
-      </w:r>
-      <w:r>
-        <w:rPr>
-          <w:rStyle w:val="NormalTok"/>
-        </w:rPr>
-        <w:t xml:space="preserve"> </w:t>
-      </w:r>
-      <w:r>
-        <w:rPr>
-          <w:rStyle w:val="DataTypeTok"/>
-        </w:rPr>
-        <w:t xml:space="preserve">"page_size"</w:t>
-      </w:r>
-      <w:r>
-        <w:rPr>
-          <w:rStyle w:val="FunctionTok"/>
-        </w:rPr>
-        <w:t xml:space="preserve">:</w:t>
-      </w:r>
-      <w:r>
-        <w:rPr>
-          <w:rStyle w:val="NormalTok"/>
-        </w:rPr>
-        <w:t xml:space="preserve"> </w:t>
-      </w:r>
-      <w:r>
-        <w:rPr>
-          <w:rStyle w:val="DecValTok"/>
-        </w:rPr>
-        <w:t xml:space="preserve">10</w:t>
-      </w:r>
-      <w:r>
-        <w:rPr>
-          <w:rStyle w:val="NormalTok"/>
-        </w:rPr>
-        <w:t xml:space="preserve"> </w:t>
-      </w:r>
-      <w:r>
-        <w:rPr>
-          <w:rStyle w:val="FunctionTok"/>
-        </w:rPr>
-        <w:t xml:space="preserve">}</w:t>
-      </w:r>
-      <w:r>
-        <w:br/>
-      </w:r>
-      <w:r>
-        <w:rPr>
-          <w:rStyle w:val="FunctionTok"/>
-        </w:rPr>
-        <w:t xml:space="preserve">{</w:t>
-      </w:r>
-      <w:r>
-        <w:rPr>
-          <w:rStyle w:val="NormalTok"/>
-        </w:rPr>
-        <w:t xml:space="preserve"> </w:t>
-      </w:r>
-      <w:r>
-        <w:rPr>
-          <w:rStyle w:val="DataTypeTok"/>
-        </w:rPr>
-        <w:t xml:space="preserve">"contract"</w:t>
-      </w:r>
-      <w:r>
-        <w:rPr>
-          <w:rStyle w:val="FunctionTok"/>
-        </w:rPr>
-        <w:t xml:space="preserve">:</w:t>
-      </w:r>
-      <w:r>
-        <w:rPr>
-          <w:rStyle w:val="NormalTok"/>
-        </w:rPr>
-        <w:t xml:space="preserve"> </w:t>
-      </w:r>
-      <w:r>
-        <w:rPr>
-          <w:rStyle w:val="StringTok"/>
-        </w:rPr>
-        <w:t xml:space="preserve">"website-search-v2"</w:t>
-      </w:r>
-      <w:r>
-        <w:rPr>
-          <w:rStyle w:val="FunctionTok"/>
-        </w:rPr>
-        <w:t xml:space="preserve">,</w:t>
       </w:r>
       <w:r>
         <w:rPr>
@@ -10900,42 +10752,6 @@
         <w:rPr>
           <w:rStyle w:val="DataTypeTok"/>
         </w:rPr>
-        <w:t xml:space="preserve">"contract"</w:t>
-      </w:r>
-      <w:r>
-        <w:rPr>
-          <w:rStyle w:val="FunctionTok"/>
-        </w:rPr>
-        <w:t xml:space="preserve">:</w:t>
-      </w:r>
-      <w:r>
-        <w:rPr>
-          <w:rStyle w:val="NormalTok"/>
-        </w:rPr>
-        <w:t xml:space="preserve"> </w:t>
-      </w:r>
-      <w:r>
-        <w:rPr>
-          <w:rStyle w:val="StringTok"/>
-        </w:rPr>
-        <w:t xml:space="preserve">"website-search-v2"</w:t>
-      </w:r>
-      <w:r>
-        <w:rPr>
-          <w:rStyle w:val="FunctionTok"/>
-        </w:rPr>
-        <w:t xml:space="preserve">,</w:t>
-      </w:r>
-      <w:r>
-        <w:rPr>
-          <w:rStyle w:val="NormalTok"/>
-        </w:rPr>
-        <w:t xml:space="preserve"> </w:t>
-      </w:r>
-      <w:r>
-        <w:rPr>
-          <w:rStyle w:val="DataTypeTok"/>
-        </w:rPr>
         <w:t xml:space="preserve">"action"</w:t>
       </w:r>
       <w:r>
@@ -11929,7 +11745,7 @@
         <w:pStyle w:val="FirstParagraph"/>
       </w:pPr>
       <w:r>
-        <w:t xml:space="preserve">Courses or records the API returns holding a value (15 October 2026; coverage grows daily).</w:t>
+        <w:t xml:space="preserve">Courses or records the API returns holding a value (16 October 2026; coverage grows daily).</w:t>
       </w:r>
     </w:p>
     <w:tbl>
@@ -12113,7 +11929,7 @@
               <w:jc w:val="left"/>
             </w:pPr>
             <w:r>
-              <w:t xml:space="preserve">1,927</w:t>
+              <w:t xml:space="preserve">1,929</w:t>
             </w:r>
           </w:p>
         </w:tc>
@@ -12201,7 +12017,7 @@
               <w:jc w:val="left"/>
             </w:pPr>
             <w:r>
-              <w:t xml:space="preserve">25,922</w:t>
+              <w:t xml:space="preserve">25,716</w:t>
             </w:r>
           </w:p>
         </w:tc>
@@ -12363,19 +12179,19 @@
               <w:jc w:val="left"/>
             </w:pPr>
             <w:r>
-              <w:t xml:space="preserve">3,073</w:t>
-            </w:r>
-          </w:p>
-        </w:tc>
-        <w:tc>
-          <w:tcPr/>
-          <w:p>
-            <w:pPr>
-              <w:pStyle w:val="Compact"/>
-              <w:jc w:val="left"/>
-            </w:pPr>
-            <w:r>
-              <w:t xml:space="preserve">1,469</w:t>
+              <w:t xml:space="preserve">2,929</w:t>
+            </w:r>
+          </w:p>
+        </w:tc>
+        <w:tc>
+          <w:tcPr/>
+          <w:p>
+            <w:pPr>
+              <w:pStyle w:val="Compact"/>
+              <w:jc w:val="left"/>
+            </w:pPr>
+            <w:r>
+              <w:t xml:space="preserve">1,319</w:t>
             </w:r>
           </w:p>
         </w:tc>
@@ -12586,7 +12402,7 @@
         <w:pStyle w:val="BodyText"/>
       </w:pPr>
       <w:r>
-        <w:t xml:space="preserve">Scholarships returned: 1,100 (Australia 901, New Zealand 141, Canada 58); 1,096 open to international students. Providers with an approved logo: 265. QS 2027 ranked Australian providers: 38. QILT statistics: 116 Australian providers. Institution type: held for Australian and New Zealand providers (null for Canada).</w:t>
+        <w:t xml:space="preserve">Scholarships returned: 1,100 (Australia 901, New Zealand 141, Canada 58); 1,096 open to international students. Providers with an approved logo: 1,445. QS 2027 ranked Australian providers: 38. QILT statistics: 116 Australian providers. Institution type: held for Australian and New Zealand providers (null for Canada).</w:t>
       </w:r>
     </w:p>
     <w:bookmarkEnd w:id="37"/>
@@ -13117,7 +12933,7 @@
         <w:pStyle w:val="FirstParagraph"/>
       </w:pPr>
       <w:r>
-        <w:t xml:space="preserve">Counts are as measured on Pilot on 15 October 2026; expect the same or more.</w:t>
+        <w:t xml:space="preserve">Counts are as measured on Pilot on 16 October 2026; expect the same or more.</w:t>
       </w:r>
     </w:p>
     <w:tbl>
@@ -13241,16 +13057,16 @@
               <w:t xml:space="preserve"> </w:t>
             </w:r>
             <w:r>
-              <w:t xml:space="preserve">with your key returns 200 with</w:t>
-            </w:r>
-            <w:r>
-              <w:t xml:space="preserve"> </w:t>
-            </w:r>
-            <w:r>
-              <w:rPr>
-                <w:rStyle w:val="VerbatimChar"/>
-              </w:rPr>
-              <w:t xml:space="preserve">contract_version: "website-search-v2"</w:t>
+              <w:t xml:space="preserve">with your key at the new address returns 200 with</w:t>
+            </w:r>
+            <w:r>
+              <w:t xml:space="preserve"> </w:t>
+            </w:r>
+            <w:r>
+              <w:rPr>
+                <w:rStyle w:val="VerbatimChar"/>
+              </w:rPr>
+              <w:t xml:space="preserve">api_version: "website-v2"</w:t>
             </w:r>
           </w:p>
         </w:tc>
@@ -13364,7 +13180,7 @@
               <w:jc w:val="left"/>
             </w:pPr>
             <w:r>
-              <w:t xml:space="preserve">The example in 7.2 returns 78 courses; each has a February intake, an IELTS minimum at or below 6.5 and annual tuition at or below 45,000</w:t>
+              <w:t xml:space="preserve">The example in 7.2 returns 35 courses; each has a February intake, an IELTS minimum at or below 6.5 and annual tuition at or below 45,000</w:t>
             </w:r>
           </w:p>
         </w:tc>
@@ -14011,7 +13827,7 @@
               <w:t xml:space="preserve"> </w:t>
             </w:r>
             <w:r>
-              <w:t xml:space="preserve">true returns 265 providers; each</w:t>
+              <w:t xml:space="preserve">true returns 1,445 providers; each</w:t>
             </w:r>
             <w:r>
               <w:t xml:space="preserve"> </w:t>
@@ -14351,22 +14167,7 @@
         <w:pStyle w:val="FirstParagraph"/>
       </w:pPr>
       <w:r>
-        <w:t xml:space="preserve">Changes within</w:t>
-      </w:r>
-      <w:r>
-        <w:t xml:space="preserve"> </w:t>
-      </w:r>
-      <w:r>
-        <w:rPr>
-          <w:rStyle w:val="VerbatimChar"/>
-        </w:rPr>
-        <w:t xml:space="preserve">website-search-v2</w:t>
-      </w:r>
-      <w:r>
-        <w:t xml:space="preserve"> </w:t>
-      </w:r>
-      <w:r>
-        <w:t xml:space="preserve">are additive. A change to the API (a new field, filter, action or behaviour) reissues this guide with a new date and a line here. Data grows between issues; the counts in this guide are measures on the date shown.</w:t>
+        <w:t xml:space="preserve">Changes within Website API v2 are additive. A change to the API (a new field, filter, action or behaviour) reissues this guide with a new date and a line here. Data grows between issues; the counts in this guide are measures on the date shown.</w:t>
       </w:r>
     </w:p>
     <w:tbl>
@@ -14525,6 +14326,128 @@
             </w:r>
             <w:r>
               <w:t xml:space="preserve">pages hold up to 200 items (was 50; default 200), and a page also stops at about 550 KB. A full load is about 250 calls, about 5 minutes (was about 1,400 calls, about 25 minutes). Sections 6.1 and 6.2 added: what to expect from a full load, and what we expect from your sync job</w:t>
+            </w:r>
+          </w:p>
+        </w:tc>
+      </w:tr>
+      <w:tr>
+        <w:tc>
+          <w:tcPr/>
+          <w:p>
+            <w:pPr>
+              <w:pStyle w:val="Compact"/>
+              <w:jc w:val="left"/>
+            </w:pPr>
+            <w:r>
+              <w:t xml:space="preserve">16 October 2026 (issue 3)</w:t>
+            </w:r>
+          </w:p>
+        </w:tc>
+        <w:tc>
+          <w:tcPr/>
+          <w:p>
+            <w:pPr>
+              <w:pStyle w:val="Compact"/>
+              <w:jc w:val="left"/>
+            </w:pPr>
+            <w:r>
+              <w:t xml:space="preserve">Website API v2 at its own address,</w:t>
+            </w:r>
+            <w:r>
+              <w:t xml:space="preserve"> </w:t>
+            </w:r>
+            <w:r>
+              <w:rPr>
+                <w:rStyle w:val="VerbatimChar"/>
+              </w:rPr>
+              <w:t xml:space="preserve">website-api-v2</w:t>
+            </w:r>
+            <w:r>
+              <w:t xml:space="preserve">, with its own key: no</w:t>
+            </w:r>
+            <w:r>
+              <w:t xml:space="preserve"> </w:t>
+            </w:r>
+            <w:r>
+              <w:rPr>
+                <w:rStyle w:val="VerbatimChar"/>
+              </w:rPr>
+              <w:t xml:space="preserve">contract</w:t>
+            </w:r>
+            <w:r>
+              <w:t xml:space="preserve"> </w:t>
+            </w:r>
+            <w:r>
+              <w:t xml:space="preserve">field; responses carry</w:t>
+            </w:r>
+            <w:r>
+              <w:t xml:space="preserve"> </w:t>
+            </w:r>
+            <w:r>
+              <w:rPr>
+                <w:rStyle w:val="VerbatimChar"/>
+              </w:rPr>
+              <w:t xml:space="preserve">api_version: "website-v2"</w:t>
+            </w:r>
+            <w:r>
+              <w:t xml:space="preserve"> </w:t>
+            </w:r>
+            <w:r>
+              <w:t xml:space="preserve">instead of</w:t>
+            </w:r>
+            <w:r>
+              <w:t xml:space="preserve"> </w:t>
+            </w:r>
+            <w:r>
+              <w:rPr>
+                <w:rStyle w:val="VerbatimChar"/>
+              </w:rPr>
+              <w:t xml:space="preserve">contract_version</w:t>
+            </w:r>
+            <w:r>
+              <w:t xml:space="preserve">; errors add</w:t>
+            </w:r>
+            <w:r>
+              <w:t xml:space="preserve"> </w:t>
+            </w:r>
+            <w:r>
+              <w:rPr>
+                <w:rStyle w:val="VerbatimChar"/>
+              </w:rPr>
+              <w:t xml:space="preserve">message</w:t>
+            </w:r>
+            <w:r>
+              <w:t xml:space="preserve"> </w:t>
+            </w:r>
+            <w:r>
+              <w:t xml:space="preserve">and</w:t>
+            </w:r>
+            <w:r>
+              <w:t xml:space="preserve"> </w:t>
+            </w:r>
+            <w:r>
+              <w:rPr>
+                <w:rStyle w:val="VerbatimChar"/>
+              </w:rPr>
+              <w:t xml:space="preserve">detail</w:t>
+            </w:r>
+            <w:r>
+              <w:t xml:space="preserve"> </w:t>
+            </w:r>
+            <w:r>
+              <w:t xml:space="preserve">(and</w:t>
+            </w:r>
+            <w:r>
+              <w:t xml:space="preserve"> </w:t>
+            </w:r>
+            <w:r>
+              <w:rPr>
+                <w:rStyle w:val="VerbatimChar"/>
+              </w:rPr>
+              <w:t xml:space="preserve">INVALID_JSON</w:t>
+            </w:r>
+            <w:r>
+              <w:t xml:space="preserve">); 300 calls a minute per key, all actions together. Same actions, fields and answers. The earlier address keeps working until you have moved</w:t>
             </w:r>
           </w:p>
         </w:tc>
@@ -14556,7 +14479,7 @@
         <w:color w:val="606060"/>
         <w:sz w:val="16"/>
       </w:rPr>
-      <w:t>website-search-v2 · Version 2 · 15 October 2026 · Pilot</w:t>
+      <w:t>website-api-v2 · Version 2 · Issue 3 · 16 October 2026 · Pilot</w:t>
     </w:r>
   </w:p>
 </w:ftr>

</xml_diff>

<commit_message>
CF-247: Website API v2 at its own URL in parallel; developer guide issue 3 (e142) (#356)
Claude-Session: https://claude.ai/code/session_01RnriTf32Hcv4Xqnq2DF1qq

Co-authored-by: Claude <noreply@anthropic.com>
</commit_message>
<xml_diff>
--- a/docs/integrations/developer-pack/StudySearch-Website-API-Developer-Guide.docx
+++ b/docs/integrations/developer-pack/StudySearch-Website-API-Developer-Guide.docx
@@ -45,13 +45,7 @@
         <w:pStyle w:val="Subtitle"/>
       </w:pPr>
       <w:r>
-        <w:t xml:space="preserve">Contract</w:t>
-      </w:r>
-      <w:r>
-        <w:t xml:space="preserve"> </w:t>
-      </w:r>
-      <w:r>
-        <w:t xml:space="preserve">website-search-v2</w:t>
+        <w:t xml:space="preserve">website-api-v2</w:t>
       </w:r>
       <w:r>
         <w:t xml:space="preserve"> </w:t>
@@ -81,7 +75,25 @@
         <w:t xml:space="preserve"> </w:t>
       </w:r>
       <w:r>
-        <w:t xml:space="preserve">15</w:t>
+        <w:t xml:space="preserve">Issue</w:t>
+      </w:r>
+      <w:r>
+        <w:t xml:space="preserve"> </w:t>
+      </w:r>
+      <w:r>
+        <w:t xml:space="preserve">3</w:t>
+      </w:r>
+      <w:r>
+        <w:t xml:space="preserve"> </w:t>
+      </w:r>
+      <w:r>
+        <w:t xml:space="preserve">·</w:t>
+      </w:r>
+      <w:r>
+        <w:t xml:space="preserve"> </w:t>
+      </w:r>
+      <w:r>
+        <w:t xml:space="preserve">16</w:t>
       </w:r>
       <w:r>
         <w:t xml:space="preserve"> </w:t>
@@ -182,19 +194,7 @@
               <w:jc w:val="left"/>
             </w:pPr>
             <w:r>
-              <w:t xml:space="preserve">One HTTPS endpoint, contract</w:t>
-            </w:r>
-            <w:r>
-              <w:t xml:space="preserve"> </w:t>
-            </w:r>
-            <w:r>
-              <w:rPr>
-                <w:rStyle w:val="VerbatimChar"/>
-              </w:rPr>
-              <w:t xml:space="preserve">website-search-v2</w:t>
-            </w:r>
-            <w:r>
-              <w:t xml:space="preserve">, nine actions</w:t>
+              <w:t xml:space="preserve">One HTTPS address for Website API v2, nine actions</w:t>
             </w:r>
           </w:p>
         </w:tc>
@@ -441,7 +441,22 @@
         <w:t xml:space="preserve"> </w:t>
       </w:r>
       <w:r>
-        <w:t xml:space="preserve">Fields, filters and actions are added, never renamed or removed, within this contract. Ignore fields you do not use. A breaking change would come as a new contract with its own guide.</w:t>
+        <w:t xml:space="preserve">Fields, filters and actions are added, never renamed or removed, within v2. Ignore fields you do not use. A breaking change would come as</w:t>
+      </w:r>
+      <w:r>
+        <w:t xml:space="preserve"> </w:t>
+      </w:r>
+      <w:r>
+        <w:rPr>
+          <w:rStyle w:val="VerbatimChar"/>
+        </w:rPr>
+        <w:t xml:space="preserve">website-api-v3</w:t>
+      </w:r>
+      <w:r>
+        <w:t xml:space="preserve"> </w:t>
+      </w:r>
+      <w:r>
+        <w:t xml:space="preserve">at a new address, with its own guide, and v2 would keep running alongside it.</w:t>
       </w:r>
     </w:p>
     <w:p>
@@ -716,7 +731,7 @@
         <w:rPr>
           <w:rStyle w:val="VerbatimChar"/>
         </w:rPr>
-        <w:t xml:space="preserve">POST https://fxcwkweaxjtknorudmwp.supabase.co/functions/v1/wix-course-api</w:t>
+        <w:t xml:space="preserve">POST https://fxcwkweaxjtknorudmwp.supabase.co/functions/v1/website-api-v2</w:t>
       </w:r>
       <w:r>
         <w:br/>
@@ -746,22 +761,7 @@
         <w:pStyle w:val="Compact"/>
       </w:pPr>
       <w:r>
-        <w:t xml:space="preserve">Every request body includes</w:t>
-      </w:r>
-      <w:r>
-        <w:t xml:space="preserve"> </w:t>
-      </w:r>
-      <w:r>
-        <w:rPr>
-          <w:rStyle w:val="VerbatimChar"/>
-        </w:rPr>
-        <w:t xml:space="preserve">"contract": "website-search-v2"</w:t>
-      </w:r>
-      <w:r>
-        <w:t xml:space="preserve"> </w:t>
-      </w:r>
-      <w:r>
-        <w:t xml:space="preserve">and an</w:t>
+        <w:t xml:space="preserve">Every request body includes an</w:t>
       </w:r>
       <w:r>
         <w:t xml:space="preserve"> </w:t>
@@ -773,7 +773,22 @@
         <w:t xml:space="preserve">action</w:t>
       </w:r>
       <w:r>
-        <w:t xml:space="preserve">.</w:t>
+        <w:t xml:space="preserve">. There is no</w:t>
+      </w:r>
+      <w:r>
+        <w:t xml:space="preserve"> </w:t>
+      </w:r>
+      <w:r>
+        <w:rPr>
+          <w:rStyle w:val="VerbatimChar"/>
+        </w:rPr>
+        <w:t xml:space="preserve">contract</w:t>
+      </w:r>
+      <w:r>
+        <w:t xml:space="preserve"> </w:t>
+      </w:r>
+      <w:r>
+        <w:t xml:space="preserve">field: the address is the version.</w:t>
       </w:r>
     </w:p>
     <w:p>
@@ -807,7 +822,7 @@
           <w:bCs/>
           <w:b/>
         </w:rPr>
-        <w:t xml:space="preserve">60 requests a minute per action</w:t>
+        <w:t xml:space="preserve">300 requests a minute, all actions together</w:t>
       </w:r>
       <w:r>
         <w:t xml:space="preserve">. Over the limit you get HTTP 429 with a</w:t>
@@ -837,7 +852,97 @@
         <w:pStyle w:val="Compact"/>
       </w:pPr>
       <w:r>
-        <w:t xml:space="preserve">Your key works with this contract only. If a key is exposed, tell us: we disable it and issue a new one (a key cannot be recovered, only replaced).</w:t>
+        <w:t xml:space="preserve">Your key works with this address only. If a key is exposed, tell us: we disable it and issue a new one (a key cannot be recovered, only replaced).</w:t>
+      </w:r>
+    </w:p>
+    <w:p>
+      <w:pPr>
+        <w:pStyle w:val="FirstParagraph"/>
+      </w:pPr>
+      <w:r>
+        <w:rPr>
+          <w:bCs/>
+          <w:b/>
+        </w:rPr>
+        <w:t xml:space="preserve">Moving from the earlier address.</w:t>
+      </w:r>
+      <w:r>
+        <w:t xml:space="preserve"> </w:t>
+      </w:r>
+      <w:r>
+        <w:t xml:space="preserve">Until now the API was reached at</w:t>
+      </w:r>
+      <w:r>
+        <w:t xml:space="preserve"> </w:t>
+      </w:r>
+      <w:r>
+        <w:rPr>
+          <w:rStyle w:val="VerbatimChar"/>
+        </w:rPr>
+        <w:t xml:space="preserve">wix-course-api</w:t>
+      </w:r>
+      <w:r>
+        <w:t xml:space="preserve"> </w:t>
+      </w:r>
+      <w:r>
+        <w:t xml:space="preserve">with</w:t>
+      </w:r>
+      <w:r>
+        <w:t xml:space="preserve"> </w:t>
+      </w:r>
+      <w:r>
+        <w:rPr>
+          <w:rStyle w:val="VerbatimChar"/>
+        </w:rPr>
+        <w:t xml:space="preserve">"contract": "website-search-v2"</w:t>
+      </w:r>
+      <w:r>
+        <w:t xml:space="preserve"> </w:t>
+      </w:r>
+      <w:r>
+        <w:t xml:space="preserve">in every body. That address and its key keep working, unchanged, until you have moved; we will agree the switch-off date with you. The answers are the same at both addresses. To move: store the new key, change the address, drop the</w:t>
+      </w:r>
+      <w:r>
+        <w:t xml:space="preserve"> </w:t>
+      </w:r>
+      <w:r>
+        <w:rPr>
+          <w:rStyle w:val="VerbatimChar"/>
+        </w:rPr>
+        <w:t xml:space="preserve">contract</w:t>
+      </w:r>
+      <w:r>
+        <w:t xml:space="preserve"> </w:t>
+      </w:r>
+      <w:r>
+        <w:t xml:space="preserve">field, and read</w:t>
+      </w:r>
+      <w:r>
+        <w:t xml:space="preserve"> </w:t>
+      </w:r>
+      <w:r>
+        <w:rPr>
+          <w:rStyle w:val="VerbatimChar"/>
+        </w:rPr>
+        <w:t xml:space="preserve">api_version</w:t>
+      </w:r>
+      <w:r>
+        <w:t xml:space="preserve"> </w:t>
+      </w:r>
+      <w:r>
+        <w:t xml:space="preserve">instead of</w:t>
+      </w:r>
+      <w:r>
+        <w:t xml:space="preserve"> </w:t>
+      </w:r>
+      <w:r>
+        <w:rPr>
+          <w:rStyle w:val="VerbatimChar"/>
+        </w:rPr>
+        <w:t xml:space="preserve">contract_version</w:t>
+      </w:r>
+      <w:r>
+        <w:t xml:space="preserve">. Your stored sync cursor works at the new address, so no new full load is needed.</w:t>
       </w:r>
     </w:p>
     <w:bookmarkEnd w:id="22"/>
@@ -871,45 +976,6 @@
           <w:rStyle w:val="FunctionTok"/>
         </w:rPr>
         <w:t xml:space="preserve">{</w:t>
-      </w:r>
-      <w:r>
-        <w:br/>
-      </w:r>
-      <w:r>
-        <w:rPr>
-          <w:rStyle w:val="NormalTok"/>
-        </w:rPr>
-        <w:t xml:space="preserve">  </w:t>
-      </w:r>
-      <w:r>
-        <w:rPr>
-          <w:rStyle w:val="DataTypeTok"/>
-        </w:rPr>
-        <w:t xml:space="preserve">"contract"</w:t>
-      </w:r>
-      <w:r>
-        <w:rPr>
-          <w:rStyle w:val="FunctionTok"/>
-        </w:rPr>
-        <w:t xml:space="preserve">:</w:t>
-      </w:r>
-      <w:r>
-        <w:rPr>
-          <w:rStyle w:val="NormalTok"/>
-        </w:rPr>
-        <w:t xml:space="preserve"> </w:t>
-      </w:r>
-      <w:r>
-        <w:rPr>
-          <w:rStyle w:val="StringTok"/>
-        </w:rPr>
-        <w:t xml:space="preserve">"website-search-v2"</w:t>
-      </w:r>
-      <w:r>
-        <w:rPr>
-          <w:rStyle w:val="FunctionTok"/>
-        </w:rPr>
-        <w:t xml:space="preserve">,</w:t>
       </w:r>
       <w:r>
         <w:br/>
@@ -1227,7 +1293,7 @@
         <w:rPr>
           <w:rStyle w:val="VerbatimChar"/>
         </w:rPr>
-        <w:t xml:space="preserve">contract_version: "website-search-v2"</w:t>
+        <w:t xml:space="preserve">api_version: "website-v2"</w:t>
       </w:r>
       <w:r>
         <w:t xml:space="preserve"> </w:t>
@@ -1261,6 +1327,45 @@
       </w:r>
       <w:r>
         <w:t xml:space="preserve">when you report a problem.</w:t>
+      </w:r>
+    </w:p>
+    <w:p>
+      <w:pPr>
+        <w:numPr>
+          <w:ilvl w:val="0"/>
+          <w:numId w:val="1004"/>
+        </w:numPr>
+        <w:pStyle w:val="Compact"/>
+      </w:pPr>
+      <w:r>
+        <w:t xml:space="preserve">An error reply is</w:t>
+      </w:r>
+      <w:r>
+        <w:t xml:space="preserve"> </w:t>
+      </w:r>
+      <w:r>
+        <w:rPr>
+          <w:rStyle w:val="VerbatimChar"/>
+        </w:rPr>
+        <w:t xml:space="preserve">{ api_version, error: { code, message, detail }, request_id }</w:t>
+      </w:r>
+      <w:r>
+        <w:t xml:space="preserve">;</w:t>
+      </w:r>
+      <w:r>
+        <w:t xml:space="preserve"> </w:t>
+      </w:r>
+      <w:r>
+        <w:rPr>
+          <w:rStyle w:val="VerbatimChar"/>
+        </w:rPr>
+        <w:t xml:space="preserve">detail</w:t>
+      </w:r>
+      <w:r>
+        <w:t xml:space="preserve"> </w:t>
+      </w:r>
+      <w:r>
+        <w:t xml:space="preserve">says what was wrong where it can.</w:t>
       </w:r>
     </w:p>
     <w:p>
@@ -1479,19 +1584,19 @@
               <w:rPr>
                 <w:rStyle w:val="VerbatimChar"/>
               </w:rPr>
-              <w:t xml:space="preserve">INVALID_ACTION</w:t>
-            </w:r>
-          </w:p>
-        </w:tc>
-        <w:tc>
-          <w:tcPr/>
-          <w:p>
-            <w:pPr>
-              <w:pStyle w:val="Compact"/>
-              <w:jc w:val="left"/>
-            </w:pPr>
-            <w:r>
-              <w:t xml:space="preserve">The action is not in the contract</w:t>
+              <w:t xml:space="preserve">INVALID_JSON</w:t>
+            </w:r>
+          </w:p>
+        </w:tc>
+        <w:tc>
+          <w:tcPr/>
+          <w:p>
+            <w:pPr>
+              <w:pStyle w:val="Compact"/>
+              <w:jc w:val="left"/>
+            </w:pPr>
+            <w:r>
+              <w:t xml:space="preserve">The body is not a JSON object</w:t>
             </w:r>
           </w:p>
         </w:tc>
@@ -1505,34 +1610,34 @@
               <w:jc w:val="left"/>
             </w:pPr>
             <w:r>
-              <w:t xml:space="preserve">401</w:t>
-            </w:r>
-          </w:p>
-        </w:tc>
-        <w:tc>
-          <w:tcPr/>
-          <w:p>
-            <w:pPr>
-              <w:pStyle w:val="Compact"/>
-              <w:jc w:val="left"/>
-            </w:pPr>
-            <w:r>
-              <w:rPr>
-                <w:rStyle w:val="VerbatimChar"/>
-              </w:rPr>
-              <w:t xml:space="preserve">AUTHENTICATION_REQUIRED</w:t>
-            </w:r>
-          </w:p>
-        </w:tc>
-        <w:tc>
-          <w:tcPr/>
-          <w:p>
-            <w:pPr>
-              <w:pStyle w:val="Compact"/>
-              <w:jc w:val="left"/>
-            </w:pPr>
-            <w:r>
-              <w:t xml:space="preserve">Missing or invalid key</w:t>
+              <w:t xml:space="preserve">400</w:t>
+            </w:r>
+          </w:p>
+        </w:tc>
+        <w:tc>
+          <w:tcPr/>
+          <w:p>
+            <w:pPr>
+              <w:pStyle w:val="Compact"/>
+              <w:jc w:val="left"/>
+            </w:pPr>
+            <w:r>
+              <w:rPr>
+                <w:rStyle w:val="VerbatimChar"/>
+              </w:rPr>
+              <w:t xml:space="preserve">INVALID_ACTION</w:t>
+            </w:r>
+          </w:p>
+        </w:tc>
+        <w:tc>
+          <w:tcPr/>
+          <w:p>
+            <w:pPr>
+              <w:pStyle w:val="Compact"/>
+              <w:jc w:val="left"/>
+            </w:pPr>
+            <w:r>
+              <w:t xml:space="preserve">The action is not one of the nine</w:t>
             </w:r>
           </w:p>
         </w:tc>
@@ -1546,34 +1651,34 @@
               <w:jc w:val="left"/>
             </w:pPr>
             <w:r>
-              <w:t xml:space="preserve">404</w:t>
-            </w:r>
-          </w:p>
-        </w:tc>
-        <w:tc>
-          <w:tcPr/>
-          <w:p>
-            <w:pPr>
-              <w:pStyle w:val="Compact"/>
-              <w:jc w:val="left"/>
-            </w:pPr>
-            <w:r>
-              <w:rPr>
-                <w:rStyle w:val="VerbatimChar"/>
-              </w:rPr>
-              <w:t xml:space="preserve">NOT_FOUND</w:t>
-            </w:r>
-          </w:p>
-        </w:tc>
-        <w:tc>
-          <w:tcPr/>
-          <w:p>
-            <w:pPr>
-              <w:pStyle w:val="Compact"/>
-              <w:jc w:val="left"/>
-            </w:pPr>
-            <w:r>
-              <w:t xml:space="preserve">The course, provider or scholarship identifier was not found</w:t>
+              <w:t xml:space="preserve">401</w:t>
+            </w:r>
+          </w:p>
+        </w:tc>
+        <w:tc>
+          <w:tcPr/>
+          <w:p>
+            <w:pPr>
+              <w:pStyle w:val="Compact"/>
+              <w:jc w:val="left"/>
+            </w:pPr>
+            <w:r>
+              <w:rPr>
+                <w:rStyle w:val="VerbatimChar"/>
+              </w:rPr>
+              <w:t xml:space="preserve">AUTHENTICATION_REQUIRED</w:t>
+            </w:r>
+          </w:p>
+        </w:tc>
+        <w:tc>
+          <w:tcPr/>
+          <w:p>
+            <w:pPr>
+              <w:pStyle w:val="Compact"/>
+              <w:jc w:val="left"/>
+            </w:pPr>
+            <w:r>
+              <w:t xml:space="preserve">Missing or invalid key</w:t>
             </w:r>
           </w:p>
         </w:tc>
@@ -1587,6 +1692,47 @@
               <w:jc w:val="left"/>
             </w:pPr>
             <w:r>
+              <w:t xml:space="preserve">404</w:t>
+            </w:r>
+          </w:p>
+        </w:tc>
+        <w:tc>
+          <w:tcPr/>
+          <w:p>
+            <w:pPr>
+              <w:pStyle w:val="Compact"/>
+              <w:jc w:val="left"/>
+            </w:pPr>
+            <w:r>
+              <w:rPr>
+                <w:rStyle w:val="VerbatimChar"/>
+              </w:rPr>
+              <w:t xml:space="preserve">NOT_FOUND</w:t>
+            </w:r>
+          </w:p>
+        </w:tc>
+        <w:tc>
+          <w:tcPr/>
+          <w:p>
+            <w:pPr>
+              <w:pStyle w:val="Compact"/>
+              <w:jc w:val="left"/>
+            </w:pPr>
+            <w:r>
+              <w:t xml:space="preserve">The course, provider or scholarship identifier was not found</w:t>
+            </w:r>
+          </w:p>
+        </w:tc>
+      </w:tr>
+      <w:tr>
+        <w:tc>
+          <w:tcPr/>
+          <w:p>
+            <w:pPr>
+              <w:pStyle w:val="Compact"/>
+              <w:jc w:val="left"/>
+            </w:pPr>
+            <w:r>
               <w:t xml:space="preserve">429</w:t>
             </w:r>
           </w:p>
@@ -1614,7 +1760,7 @@
               <w:jc w:val="left"/>
             </w:pPr>
             <w:r>
-              <w:t xml:space="preserve">Over 60 a minute for that action; wait for</w:t>
+              <w:t xml:space="preserve">Over 300 a minute for your key; wait for</w:t>
             </w:r>
             <w:r>
               <w:t xml:space="preserve"> </w:t>
@@ -2242,45 +2388,6 @@
           <w:rStyle w:val="FunctionTok"/>
         </w:rPr>
         <w:t xml:space="preserve">{</w:t>
-      </w:r>
-      <w:r>
-        <w:br/>
-      </w:r>
-      <w:r>
-        <w:rPr>
-          <w:rStyle w:val="NormalTok"/>
-        </w:rPr>
-        <w:t xml:space="preserve">  </w:t>
-      </w:r>
-      <w:r>
-        <w:rPr>
-          <w:rStyle w:val="DataTypeTok"/>
-        </w:rPr>
-        <w:t xml:space="preserve">"contract"</w:t>
-      </w:r>
-      <w:r>
-        <w:rPr>
-          <w:rStyle w:val="FunctionTok"/>
-        </w:rPr>
-        <w:t xml:space="preserve">:</w:t>
-      </w:r>
-      <w:r>
-        <w:rPr>
-          <w:rStyle w:val="NormalTok"/>
-        </w:rPr>
-        <w:t xml:space="preserve"> </w:t>
-      </w:r>
-      <w:r>
-        <w:rPr>
-          <w:rStyle w:val="StringTok"/>
-        </w:rPr>
-        <w:t xml:space="preserve">"website-search-v2"</w:t>
-      </w:r>
-      <w:r>
-        <w:rPr>
-          <w:rStyle w:val="FunctionTok"/>
-        </w:rPr>
-        <w:t xml:space="preserve">,</w:t>
       </w:r>
       <w:r>
         <w:br/>
@@ -3872,7 +3979,7 @@
         <w:pStyle w:val="FirstParagraph"/>
       </w:pPr>
       <w:r>
-        <w:t xml:space="preserve">Measured on Pilot on 15 October 2026.</w:t>
+        <w:t xml:space="preserve">Measured on Pilot on 16 October 2026.</w:t>
       </w:r>
     </w:p>
     <w:tbl>
@@ -3956,7 +4063,7 @@
               <w:jc w:val="left"/>
             </w:pPr>
             <w:r>
-              <w:t xml:space="preserve">About 40,600 (courses 37,300; providers 1,885; scholarships 1,100; logos 275; ranking sets 56; reference 1)</w:t>
+              <w:t xml:space="preserve">About 41,700 (courses 37,300; providers 1,885; scholarships 1,100; logos 1,399; ranking sets 56; reference 1)</w:t>
             </w:r>
           </w:p>
         </w:tc>
@@ -3982,7 +4089,7 @@
               <w:jc w:val="left"/>
             </w:pPr>
             <w:r>
-              <w:t xml:space="preserve">About 250 at the default page size</w:t>
+              <w:t xml:space="preserve">About 260 at the default page size</w:t>
             </w:r>
           </w:p>
         </w:tc>
@@ -4060,7 +4167,7 @@
               <w:jc w:val="left"/>
             </w:pPr>
             <w:r>
-              <w:t xml:space="preserve">About 5 minutes, paced at the limit of 60 calls a minute</w:t>
+              <w:t xml:space="preserve">About 5 minutes (one page at a time)</w:t>
             </w:r>
           </w:p>
         </w:tc>
@@ -4174,7 +4281,7 @@
           <w:bCs/>
           <w:b/>
         </w:rPr>
-        <w:t xml:space="preserve">Stay within 60 calls a minute.</w:t>
+        <w:t xml:space="preserve">Stay within 300 calls a minute.</w:t>
       </w:r>
       <w:r>
         <w:t xml:space="preserve"> </w:t>
@@ -5014,42 +5121,6 @@
         <w:rPr>
           <w:rStyle w:val="DataTypeTok"/>
         </w:rPr>
-        <w:t xml:space="preserve">"contract"</w:t>
-      </w:r>
-      <w:r>
-        <w:rPr>
-          <w:rStyle w:val="FunctionTok"/>
-        </w:rPr>
-        <w:t xml:space="preserve">:</w:t>
-      </w:r>
-      <w:r>
-        <w:rPr>
-          <w:rStyle w:val="NormalTok"/>
-        </w:rPr>
-        <w:t xml:space="preserve"> </w:t>
-      </w:r>
-      <w:r>
-        <w:rPr>
-          <w:rStyle w:val="StringTok"/>
-        </w:rPr>
-        <w:t xml:space="preserve">"website-search-v2"</w:t>
-      </w:r>
-      <w:r>
-        <w:rPr>
-          <w:rStyle w:val="FunctionTok"/>
-        </w:rPr>
-        <w:t xml:space="preserve">,</w:t>
-      </w:r>
-      <w:r>
-        <w:rPr>
-          <w:rStyle w:val="NormalTok"/>
-        </w:rPr>
-        <w:t xml:space="preserve"> </w:t>
-      </w:r>
-      <w:r>
-        <w:rPr>
-          <w:rStyle w:val="DataTypeTok"/>
-        </w:rPr>
         <w:t xml:space="preserve">"action"</w:t>
       </w:r>
       <w:r>
@@ -5139,45 +5210,6 @@
         <w:rPr>
           <w:rStyle w:val="DataTypeTok"/>
         </w:rPr>
-        <w:t xml:space="preserve">"contract"</w:t>
-      </w:r>
-      <w:r>
-        <w:rPr>
-          <w:rStyle w:val="FunctionTok"/>
-        </w:rPr>
-        <w:t xml:space="preserve">:</w:t>
-      </w:r>
-      <w:r>
-        <w:rPr>
-          <w:rStyle w:val="NormalTok"/>
-        </w:rPr>
-        <w:t xml:space="preserve"> </w:t>
-      </w:r>
-      <w:r>
-        <w:rPr>
-          <w:rStyle w:val="StringTok"/>
-        </w:rPr>
-        <w:t xml:space="preserve">"website-search-v2"</w:t>
-      </w:r>
-      <w:r>
-        <w:rPr>
-          <w:rStyle w:val="FunctionTok"/>
-        </w:rPr>
-        <w:t xml:space="preserve">,</w:t>
-      </w:r>
-      <w:r>
-        <w:br/>
-      </w:r>
-      <w:r>
-        <w:rPr>
-          <w:rStyle w:val="NormalTok"/>
-        </w:rPr>
-        <w:t xml:space="preserve">  </w:t>
-      </w:r>
-      <w:r>
-        <w:rPr>
-          <w:rStyle w:val="DataTypeTok"/>
-        </w:rPr>
         <w:t xml:space="preserve">"action"</w:t>
       </w:r>
       <w:r>
@@ -5705,7 +5737,7 @@
         <w:pStyle w:val="FirstParagraph"/>
       </w:pPr>
       <w:r>
-        <w:t xml:space="preserve">This returned 78 courses on 15 October 2026. All filters are optional and combine with AND.</w:t>
+        <w:t xml:space="preserve">This returned 35 courses on 16 October 2026. All filters are optional and combine with AND.</w:t>
       </w:r>
     </w:p>
     <w:tbl>
@@ -7641,42 +7673,6 @@
         <w:rPr>
           <w:rStyle w:val="DataTypeTok"/>
         </w:rPr>
-        <w:t xml:space="preserve">"contract"</w:t>
-      </w:r>
-      <w:r>
-        <w:rPr>
-          <w:rStyle w:val="FunctionTok"/>
-        </w:rPr>
-        <w:t xml:space="preserve">:</w:t>
-      </w:r>
-      <w:r>
-        <w:rPr>
-          <w:rStyle w:val="NormalTok"/>
-        </w:rPr>
-        <w:t xml:space="preserve"> </w:t>
-      </w:r>
-      <w:r>
-        <w:rPr>
-          <w:rStyle w:val="StringTok"/>
-        </w:rPr>
-        <w:t xml:space="preserve">"website-search-v2"</w:t>
-      </w:r>
-      <w:r>
-        <w:rPr>
-          <w:rStyle w:val="FunctionTok"/>
-        </w:rPr>
-        <w:t xml:space="preserve">,</w:t>
-      </w:r>
-      <w:r>
-        <w:rPr>
-          <w:rStyle w:val="NormalTok"/>
-        </w:rPr>
-        <w:t xml:space="preserve"> </w:t>
-      </w:r>
-      <w:r>
-        <w:rPr>
-          <w:rStyle w:val="DataTypeTok"/>
-        </w:rPr>
         <w:t xml:space="preserve">"action"</w:t>
       </w:r>
       <w:r>
@@ -7910,7 +7906,7 @@
         <w:rPr>
           <w:rStyle w:val="DataTypeTok"/>
         </w:rPr>
-        <w:t xml:space="preserve">"contract"</w:t>
+        <w:t xml:space="preserve">"action"</w:t>
       </w:r>
       <w:r>
         <w:rPr>
@@ -7928,7 +7924,7 @@
         <w:rPr>
           <w:rStyle w:val="StringTok"/>
         </w:rPr>
-        <w:t xml:space="preserve">"website-search-v2"</w:t>
+        <w:t xml:space="preserve">"providers"</w:t>
       </w:r>
       <w:r>
         <w:rPr>
@@ -7937,16 +7933,19 @@
         <w:t xml:space="preserve">,</w:t>
       </w:r>
       <w:r>
+        <w:br/>
+      </w:r>
+      <w:r>
         <w:rPr>
           <w:rStyle w:val="NormalTok"/>
         </w:rPr>
-        <w:t xml:space="preserve"> </w:t>
+        <w:t xml:space="preserve">  </w:t>
       </w:r>
       <w:r>
         <w:rPr>
           <w:rStyle w:val="DataTypeTok"/>
         </w:rPr>
-        <w:t xml:space="preserve">"action"</w:t>
+        <w:t xml:space="preserve">"filters"</w:t>
       </w:r>
       <w:r>
         <w:rPr>
@@ -7962,9 +7961,51 @@
       </w:r>
       <w:r>
         <w:rPr>
+          <w:rStyle w:val="FunctionTok"/>
+        </w:rPr>
+        <w:t xml:space="preserve">{</w:t>
+      </w:r>
+      <w:r>
+        <w:rPr>
+          <w:rStyle w:val="NormalTok"/>
+        </w:rPr>
+        <w:t xml:space="preserve"> </w:t>
+      </w:r>
+      <w:r>
+        <w:rPr>
+          <w:rStyle w:val="DataTypeTok"/>
+        </w:rPr>
+        <w:t xml:space="preserve">"country_codes"</w:t>
+      </w:r>
+      <w:r>
+        <w:rPr>
+          <w:rStyle w:val="FunctionTok"/>
+        </w:rPr>
+        <w:t xml:space="preserve">:</w:t>
+      </w:r>
+      <w:r>
+        <w:rPr>
+          <w:rStyle w:val="NormalTok"/>
+        </w:rPr>
+        <w:t xml:space="preserve"> </w:t>
+      </w:r>
+      <w:r>
+        <w:rPr>
+          <w:rStyle w:val="OtherTok"/>
+        </w:rPr>
+        <w:t xml:space="preserve">[</w:t>
+      </w:r>
+      <w:r>
+        <w:rPr>
           <w:rStyle w:val="StringTok"/>
         </w:rPr>
-        <w:t xml:space="preserve">"providers"</w:t>
+        <w:t xml:space="preserve">"AU"</w:t>
+      </w:r>
+      <w:r>
+        <w:rPr>
+          <w:rStyle w:val="OtherTok"/>
+        </w:rPr>
+        <w:t xml:space="preserve">]</w:t>
       </w:r>
       <w:r>
         <w:rPr>
@@ -7973,6 +8014,60 @@
         <w:t xml:space="preserve">,</w:t>
       </w:r>
       <w:r>
+        <w:rPr>
+          <w:rStyle w:val="NormalTok"/>
+        </w:rPr>
+        <w:t xml:space="preserve"> </w:t>
+      </w:r>
+      <w:r>
+        <w:rPr>
+          <w:rStyle w:val="DataTypeTok"/>
+        </w:rPr>
+        <w:t xml:space="preserve">"university_groups"</w:t>
+      </w:r>
+      <w:r>
+        <w:rPr>
+          <w:rStyle w:val="FunctionTok"/>
+        </w:rPr>
+        <w:t xml:space="preserve">:</w:t>
+      </w:r>
+      <w:r>
+        <w:rPr>
+          <w:rStyle w:val="NormalTok"/>
+        </w:rPr>
+        <w:t xml:space="preserve"> </w:t>
+      </w:r>
+      <w:r>
+        <w:rPr>
+          <w:rStyle w:val="OtherTok"/>
+        </w:rPr>
+        <w:t xml:space="preserve">[</w:t>
+      </w:r>
+      <w:r>
+        <w:rPr>
+          <w:rStyle w:val="StringTok"/>
+        </w:rPr>
+        <w:t xml:space="preserve">"go8"</w:t>
+      </w:r>
+      <w:r>
+        <w:rPr>
+          <w:rStyle w:val="OtherTok"/>
+        </w:rPr>
+        <w:t xml:space="preserve">]</w:t>
+      </w:r>
+      <w:r>
+        <w:rPr>
+          <w:rStyle w:val="NormalTok"/>
+        </w:rPr>
+        <w:t xml:space="preserve"> </w:t>
+      </w:r>
+      <w:r>
+        <w:rPr>
+          <w:rStyle w:val="FunctionTok"/>
+        </w:rPr>
+        <w:t xml:space="preserve">},</w:t>
+      </w:r>
+      <w:r>
         <w:br/>
       </w:r>
       <w:r>
@@ -7985,7 +8080,7 @@
         <w:rPr>
           <w:rStyle w:val="DataTypeTok"/>
         </w:rPr>
-        <w:t xml:space="preserve">"filters"</w:t>
+        <w:t xml:space="preserve">"sort"</w:t>
       </w:r>
       <w:r>
         <w:rPr>
@@ -8001,273 +8096,102 @@
       </w:r>
       <w:r>
         <w:rPr>
+          <w:rStyle w:val="StringTok"/>
+        </w:rPr>
+        <w:t xml:space="preserve">"qs_rank_asc"</w:t>
+      </w:r>
+      <w:r>
+        <w:rPr>
           <w:rStyle w:val="FunctionTok"/>
         </w:rPr>
+        <w:t xml:space="preserve">,</w:t>
+      </w:r>
+      <w:r>
+        <w:rPr>
+          <w:rStyle w:val="NormalTok"/>
+        </w:rPr>
+        <w:t xml:space="preserve"> </w:t>
+      </w:r>
+      <w:r>
+        <w:rPr>
+          <w:rStyle w:val="DataTypeTok"/>
+        </w:rPr>
+        <w:t xml:space="preserve">"page"</w:t>
+      </w:r>
+      <w:r>
+        <w:rPr>
+          <w:rStyle w:val="FunctionTok"/>
+        </w:rPr>
+        <w:t xml:space="preserve">:</w:t>
+      </w:r>
+      <w:r>
+        <w:rPr>
+          <w:rStyle w:val="NormalTok"/>
+        </w:rPr>
+        <w:t xml:space="preserve"> </w:t>
+      </w:r>
+      <w:r>
+        <w:rPr>
+          <w:rStyle w:val="DecValTok"/>
+        </w:rPr>
+        <w:t xml:space="preserve">1</w:t>
+      </w:r>
+      <w:r>
+        <w:rPr>
+          <w:rStyle w:val="FunctionTok"/>
+        </w:rPr>
+        <w:t xml:space="preserve">,</w:t>
+      </w:r>
+      <w:r>
+        <w:rPr>
+          <w:rStyle w:val="NormalTok"/>
+        </w:rPr>
+        <w:t xml:space="preserve"> </w:t>
+      </w:r>
+      <w:r>
+        <w:rPr>
+          <w:rStyle w:val="DataTypeTok"/>
+        </w:rPr>
+        <w:t xml:space="preserve">"page_size"</w:t>
+      </w:r>
+      <w:r>
+        <w:rPr>
+          <w:rStyle w:val="FunctionTok"/>
+        </w:rPr>
+        <w:t xml:space="preserve">:</w:t>
+      </w:r>
+      <w:r>
+        <w:rPr>
+          <w:rStyle w:val="NormalTok"/>
+        </w:rPr>
+        <w:t xml:space="preserve"> </w:t>
+      </w:r>
+      <w:r>
+        <w:rPr>
+          <w:rStyle w:val="DecValTok"/>
+        </w:rPr>
+        <w:t xml:space="preserve">6</w:t>
+      </w:r>
+      <w:r>
+        <w:rPr>
+          <w:rStyle w:val="NormalTok"/>
+        </w:rPr>
+        <w:t xml:space="preserve"> </w:t>
+      </w:r>
+      <w:r>
+        <w:rPr>
+          <w:rStyle w:val="FunctionTok"/>
+        </w:rPr>
+        <w:t xml:space="preserve">}</w:t>
+      </w:r>
+      <w:r>
+        <w:br/>
+      </w:r>
+      <w:r>
+        <w:rPr>
+          <w:rStyle w:val="FunctionTok"/>
+        </w:rPr>
         <w:t xml:space="preserve">{</w:t>
-      </w:r>
-      <w:r>
-        <w:rPr>
-          <w:rStyle w:val="NormalTok"/>
-        </w:rPr>
-        <w:t xml:space="preserve"> </w:t>
-      </w:r>
-      <w:r>
-        <w:rPr>
-          <w:rStyle w:val="DataTypeTok"/>
-        </w:rPr>
-        <w:t xml:space="preserve">"country_codes"</w:t>
-      </w:r>
-      <w:r>
-        <w:rPr>
-          <w:rStyle w:val="FunctionTok"/>
-        </w:rPr>
-        <w:t xml:space="preserve">:</w:t>
-      </w:r>
-      <w:r>
-        <w:rPr>
-          <w:rStyle w:val="NormalTok"/>
-        </w:rPr>
-        <w:t xml:space="preserve"> </w:t>
-      </w:r>
-      <w:r>
-        <w:rPr>
-          <w:rStyle w:val="OtherTok"/>
-        </w:rPr>
-        <w:t xml:space="preserve">[</w:t>
-      </w:r>
-      <w:r>
-        <w:rPr>
-          <w:rStyle w:val="StringTok"/>
-        </w:rPr>
-        <w:t xml:space="preserve">"AU"</w:t>
-      </w:r>
-      <w:r>
-        <w:rPr>
-          <w:rStyle w:val="OtherTok"/>
-        </w:rPr>
-        <w:t xml:space="preserve">]</w:t>
-      </w:r>
-      <w:r>
-        <w:rPr>
-          <w:rStyle w:val="FunctionTok"/>
-        </w:rPr>
-        <w:t xml:space="preserve">,</w:t>
-      </w:r>
-      <w:r>
-        <w:rPr>
-          <w:rStyle w:val="NormalTok"/>
-        </w:rPr>
-        <w:t xml:space="preserve"> </w:t>
-      </w:r>
-      <w:r>
-        <w:rPr>
-          <w:rStyle w:val="DataTypeTok"/>
-        </w:rPr>
-        <w:t xml:space="preserve">"university_groups"</w:t>
-      </w:r>
-      <w:r>
-        <w:rPr>
-          <w:rStyle w:val="FunctionTok"/>
-        </w:rPr>
-        <w:t xml:space="preserve">:</w:t>
-      </w:r>
-      <w:r>
-        <w:rPr>
-          <w:rStyle w:val="NormalTok"/>
-        </w:rPr>
-        <w:t xml:space="preserve"> </w:t>
-      </w:r>
-      <w:r>
-        <w:rPr>
-          <w:rStyle w:val="OtherTok"/>
-        </w:rPr>
-        <w:t xml:space="preserve">[</w:t>
-      </w:r>
-      <w:r>
-        <w:rPr>
-          <w:rStyle w:val="StringTok"/>
-        </w:rPr>
-        <w:t xml:space="preserve">"go8"</w:t>
-      </w:r>
-      <w:r>
-        <w:rPr>
-          <w:rStyle w:val="OtherTok"/>
-        </w:rPr>
-        <w:t xml:space="preserve">]</w:t>
-      </w:r>
-      <w:r>
-        <w:rPr>
-          <w:rStyle w:val="NormalTok"/>
-        </w:rPr>
-        <w:t xml:space="preserve"> </w:t>
-      </w:r>
-      <w:r>
-        <w:rPr>
-          <w:rStyle w:val="FunctionTok"/>
-        </w:rPr>
-        <w:t xml:space="preserve">},</w:t>
-      </w:r>
-      <w:r>
-        <w:br/>
-      </w:r>
-      <w:r>
-        <w:rPr>
-          <w:rStyle w:val="NormalTok"/>
-        </w:rPr>
-        <w:t xml:space="preserve">  </w:t>
-      </w:r>
-      <w:r>
-        <w:rPr>
-          <w:rStyle w:val="DataTypeTok"/>
-        </w:rPr>
-        <w:t xml:space="preserve">"sort"</w:t>
-      </w:r>
-      <w:r>
-        <w:rPr>
-          <w:rStyle w:val="FunctionTok"/>
-        </w:rPr>
-        <w:t xml:space="preserve">:</w:t>
-      </w:r>
-      <w:r>
-        <w:rPr>
-          <w:rStyle w:val="NormalTok"/>
-        </w:rPr>
-        <w:t xml:space="preserve"> </w:t>
-      </w:r>
-      <w:r>
-        <w:rPr>
-          <w:rStyle w:val="StringTok"/>
-        </w:rPr>
-        <w:t xml:space="preserve">"qs_rank_asc"</w:t>
-      </w:r>
-      <w:r>
-        <w:rPr>
-          <w:rStyle w:val="FunctionTok"/>
-        </w:rPr>
-        <w:t xml:space="preserve">,</w:t>
-      </w:r>
-      <w:r>
-        <w:rPr>
-          <w:rStyle w:val="NormalTok"/>
-        </w:rPr>
-        <w:t xml:space="preserve"> </w:t>
-      </w:r>
-      <w:r>
-        <w:rPr>
-          <w:rStyle w:val="DataTypeTok"/>
-        </w:rPr>
-        <w:t xml:space="preserve">"page"</w:t>
-      </w:r>
-      <w:r>
-        <w:rPr>
-          <w:rStyle w:val="FunctionTok"/>
-        </w:rPr>
-        <w:t xml:space="preserve">:</w:t>
-      </w:r>
-      <w:r>
-        <w:rPr>
-          <w:rStyle w:val="NormalTok"/>
-        </w:rPr>
-        <w:t xml:space="preserve"> </w:t>
-      </w:r>
-      <w:r>
-        <w:rPr>
-          <w:rStyle w:val="DecValTok"/>
-        </w:rPr>
-        <w:t xml:space="preserve">1</w:t>
-      </w:r>
-      <w:r>
-        <w:rPr>
-          <w:rStyle w:val="FunctionTok"/>
-        </w:rPr>
-        <w:t xml:space="preserve">,</w:t>
-      </w:r>
-      <w:r>
-        <w:rPr>
-          <w:rStyle w:val="NormalTok"/>
-        </w:rPr>
-        <w:t xml:space="preserve"> </w:t>
-      </w:r>
-      <w:r>
-        <w:rPr>
-          <w:rStyle w:val="DataTypeTok"/>
-        </w:rPr>
-        <w:t xml:space="preserve">"page_size"</w:t>
-      </w:r>
-      <w:r>
-        <w:rPr>
-          <w:rStyle w:val="FunctionTok"/>
-        </w:rPr>
-        <w:t xml:space="preserve">:</w:t>
-      </w:r>
-      <w:r>
-        <w:rPr>
-          <w:rStyle w:val="NormalTok"/>
-        </w:rPr>
-        <w:t xml:space="preserve"> </w:t>
-      </w:r>
-      <w:r>
-        <w:rPr>
-          <w:rStyle w:val="DecValTok"/>
-        </w:rPr>
-        <w:t xml:space="preserve">6</w:t>
-      </w:r>
-      <w:r>
-        <w:rPr>
-          <w:rStyle w:val="NormalTok"/>
-        </w:rPr>
-        <w:t xml:space="preserve"> </w:t>
-      </w:r>
-      <w:r>
-        <w:rPr>
-          <w:rStyle w:val="FunctionTok"/>
-        </w:rPr>
-        <w:t xml:space="preserve">}</w:t>
-      </w:r>
-      <w:r>
-        <w:br/>
-      </w:r>
-      <w:r>
-        <w:rPr>
-          <w:rStyle w:val="FunctionTok"/>
-        </w:rPr>
-        <w:t xml:space="preserve">{</w:t>
-      </w:r>
-      <w:r>
-        <w:rPr>
-          <w:rStyle w:val="NormalTok"/>
-        </w:rPr>
-        <w:t xml:space="preserve"> </w:t>
-      </w:r>
-      <w:r>
-        <w:rPr>
-          <w:rStyle w:val="DataTypeTok"/>
-        </w:rPr>
-        <w:t xml:space="preserve">"contract"</w:t>
-      </w:r>
-      <w:r>
-        <w:rPr>
-          <w:rStyle w:val="FunctionTok"/>
-        </w:rPr>
-        <w:t xml:space="preserve">:</w:t>
-      </w:r>
-      <w:r>
-        <w:rPr>
-          <w:rStyle w:val="NormalTok"/>
-        </w:rPr>
-        <w:t xml:space="preserve"> </w:t>
-      </w:r>
-      <w:r>
-        <w:rPr>
-          <w:rStyle w:val="StringTok"/>
-        </w:rPr>
-        <w:t xml:space="preserve">"website-search-v2"</w:t>
-      </w:r>
-      <w:r>
-        <w:rPr>
-          <w:rStyle w:val="FunctionTok"/>
-        </w:rPr>
-        <w:t xml:space="preserve">,</w:t>
       </w:r>
       <w:r>
         <w:rPr>
@@ -9450,7 +9374,7 @@
         <w:rPr>
           <w:rStyle w:val="DataTypeTok"/>
         </w:rPr>
-        <w:t xml:space="preserve">"contract"</w:t>
+        <w:t xml:space="preserve">"action"</w:t>
       </w:r>
       <w:r>
         <w:rPr>
@@ -9468,7 +9392,7 @@
         <w:rPr>
           <w:rStyle w:val="StringTok"/>
         </w:rPr>
-        <w:t xml:space="preserve">"website-search-v2"</w:t>
+        <w:t xml:space="preserve">"scholarships"</w:t>
       </w:r>
       <w:r>
         <w:rPr>
@@ -9477,16 +9401,19 @@
         <w:t xml:space="preserve">,</w:t>
       </w:r>
       <w:r>
+        <w:br/>
+      </w:r>
+      <w:r>
         <w:rPr>
           <w:rStyle w:val="NormalTok"/>
         </w:rPr>
-        <w:t xml:space="preserve"> </w:t>
+        <w:t xml:space="preserve">  </w:t>
       </w:r>
       <w:r>
         <w:rPr>
           <w:rStyle w:val="DataTypeTok"/>
         </w:rPr>
-        <w:t xml:space="preserve">"action"</w:t>
+        <w:t xml:space="preserve">"filters"</w:t>
       </w:r>
       <w:r>
         <w:rPr>
@@ -9502,225 +9429,150 @@
       </w:r>
       <w:r>
         <w:rPr>
+          <w:rStyle w:val="FunctionTok"/>
+        </w:rPr>
+        <w:t xml:space="preserve">{</w:t>
+      </w:r>
+      <w:r>
+        <w:rPr>
+          <w:rStyle w:val="NormalTok"/>
+        </w:rPr>
+        <w:t xml:space="preserve"> </w:t>
+      </w:r>
+      <w:r>
+        <w:rPr>
+          <w:rStyle w:val="DataTypeTok"/>
+        </w:rPr>
+        <w:t xml:space="preserve">"student_types"</w:t>
+      </w:r>
+      <w:r>
+        <w:rPr>
+          <w:rStyle w:val="FunctionTok"/>
+        </w:rPr>
+        <w:t xml:space="preserve">:</w:t>
+      </w:r>
+      <w:r>
+        <w:rPr>
+          <w:rStyle w:val="NormalTok"/>
+        </w:rPr>
+        <w:t xml:space="preserve"> </w:t>
+      </w:r>
+      <w:r>
+        <w:rPr>
+          <w:rStyle w:val="OtherTok"/>
+        </w:rPr>
+        <w:t xml:space="preserve">[</w:t>
+      </w:r>
+      <w:r>
+        <w:rPr>
           <w:rStyle w:val="StringTok"/>
         </w:rPr>
-        <w:t xml:space="preserve">"scholarships"</w:t>
+        <w:t xml:space="preserve">"international"</w:t>
+      </w:r>
+      <w:r>
+        <w:rPr>
+          <w:rStyle w:val="OtherTok"/>
+        </w:rPr>
+        <w:t xml:space="preserve">]</w:t>
+      </w:r>
+      <w:r>
+        <w:rPr>
+          <w:rStyle w:val="NormalTok"/>
+        </w:rPr>
+        <w:t xml:space="preserve"> </w:t>
       </w:r>
       <w:r>
         <w:rPr>
           <w:rStyle w:val="FunctionTok"/>
         </w:rPr>
+        <w:t xml:space="preserve">},</w:t>
+      </w:r>
+      <w:r>
+        <w:rPr>
+          <w:rStyle w:val="NormalTok"/>
+        </w:rPr>
+        <w:t xml:space="preserve"> </w:t>
+      </w:r>
+      <w:r>
+        <w:rPr>
+          <w:rStyle w:val="DataTypeTok"/>
+        </w:rPr>
+        <w:t xml:space="preserve">"page"</w:t>
+      </w:r>
+      <w:r>
+        <w:rPr>
+          <w:rStyle w:val="FunctionTok"/>
+        </w:rPr>
+        <w:t xml:space="preserve">:</w:t>
+      </w:r>
+      <w:r>
+        <w:rPr>
+          <w:rStyle w:val="NormalTok"/>
+        </w:rPr>
+        <w:t xml:space="preserve"> </w:t>
+      </w:r>
+      <w:r>
+        <w:rPr>
+          <w:rStyle w:val="DecValTok"/>
+        </w:rPr>
+        <w:t xml:space="preserve">1</w:t>
+      </w:r>
+      <w:r>
+        <w:rPr>
+          <w:rStyle w:val="FunctionTok"/>
+        </w:rPr>
         <w:t xml:space="preserve">,</w:t>
       </w:r>
       <w:r>
+        <w:rPr>
+          <w:rStyle w:val="NormalTok"/>
+        </w:rPr>
+        <w:t xml:space="preserve"> </w:t>
+      </w:r>
+      <w:r>
+        <w:rPr>
+          <w:rStyle w:val="DataTypeTok"/>
+        </w:rPr>
+        <w:t xml:space="preserve">"page_size"</w:t>
+      </w:r>
+      <w:r>
+        <w:rPr>
+          <w:rStyle w:val="FunctionTok"/>
+        </w:rPr>
+        <w:t xml:space="preserve">:</w:t>
+      </w:r>
+      <w:r>
+        <w:rPr>
+          <w:rStyle w:val="NormalTok"/>
+        </w:rPr>
+        <w:t xml:space="preserve"> </w:t>
+      </w:r>
+      <w:r>
+        <w:rPr>
+          <w:rStyle w:val="DecValTok"/>
+        </w:rPr>
+        <w:t xml:space="preserve">10</w:t>
+      </w:r>
+      <w:r>
+        <w:rPr>
+          <w:rStyle w:val="NormalTok"/>
+        </w:rPr>
+        <w:t xml:space="preserve"> </w:t>
+      </w:r>
+      <w:r>
+        <w:rPr>
+          <w:rStyle w:val="FunctionTok"/>
+        </w:rPr>
+        <w:t xml:space="preserve">}</w:t>
+      </w:r>
+      <w:r>
         <w:br/>
       </w:r>
       <w:r>
         <w:rPr>
-          <w:rStyle w:val="NormalTok"/>
-        </w:rPr>
-        <w:t xml:space="preserve">  </w:t>
-      </w:r>
-      <w:r>
-        <w:rPr>
-          <w:rStyle w:val="DataTypeTok"/>
-        </w:rPr>
-        <w:t xml:space="preserve">"filters"</w:t>
-      </w:r>
-      <w:r>
-        <w:rPr>
           <w:rStyle w:val="FunctionTok"/>
         </w:rPr>
-        <w:t xml:space="preserve">:</w:t>
-      </w:r>
-      <w:r>
-        <w:rPr>
-          <w:rStyle w:val="NormalTok"/>
-        </w:rPr>
-        <w:t xml:space="preserve"> </w:t>
-      </w:r>
-      <w:r>
-        <w:rPr>
-          <w:rStyle w:val="FunctionTok"/>
-        </w:rPr>
         <w:t xml:space="preserve">{</w:t>
-      </w:r>
-      <w:r>
-        <w:rPr>
-          <w:rStyle w:val="NormalTok"/>
-        </w:rPr>
-        <w:t xml:space="preserve"> </w:t>
-      </w:r>
-      <w:r>
-        <w:rPr>
-          <w:rStyle w:val="DataTypeTok"/>
-        </w:rPr>
-        <w:t xml:space="preserve">"student_types"</w:t>
-      </w:r>
-      <w:r>
-        <w:rPr>
-          <w:rStyle w:val="FunctionTok"/>
-        </w:rPr>
-        <w:t xml:space="preserve">:</w:t>
-      </w:r>
-      <w:r>
-        <w:rPr>
-          <w:rStyle w:val="NormalTok"/>
-        </w:rPr>
-        <w:t xml:space="preserve"> </w:t>
-      </w:r>
-      <w:r>
-        <w:rPr>
-          <w:rStyle w:val="OtherTok"/>
-        </w:rPr>
-        <w:t xml:space="preserve">[</w:t>
-      </w:r>
-      <w:r>
-        <w:rPr>
-          <w:rStyle w:val="StringTok"/>
-        </w:rPr>
-        <w:t xml:space="preserve">"international"</w:t>
-      </w:r>
-      <w:r>
-        <w:rPr>
-          <w:rStyle w:val="OtherTok"/>
-        </w:rPr>
-        <w:t xml:space="preserve">]</w:t>
-      </w:r>
-      <w:r>
-        <w:rPr>
-          <w:rStyle w:val="NormalTok"/>
-        </w:rPr>
-        <w:t xml:space="preserve"> </w:t>
-      </w:r>
-      <w:r>
-        <w:rPr>
-          <w:rStyle w:val="FunctionTok"/>
-        </w:rPr>
-        <w:t xml:space="preserve">},</w:t>
-      </w:r>
-      <w:r>
-        <w:rPr>
-          <w:rStyle w:val="NormalTok"/>
-        </w:rPr>
-        <w:t xml:space="preserve"> </w:t>
-      </w:r>
-      <w:r>
-        <w:rPr>
-          <w:rStyle w:val="DataTypeTok"/>
-        </w:rPr>
-        <w:t xml:space="preserve">"page"</w:t>
-      </w:r>
-      <w:r>
-        <w:rPr>
-          <w:rStyle w:val="FunctionTok"/>
-        </w:rPr>
-        <w:t xml:space="preserve">:</w:t>
-      </w:r>
-      <w:r>
-        <w:rPr>
-          <w:rStyle w:val="NormalTok"/>
-        </w:rPr>
-        <w:t xml:space="preserve"> </w:t>
-      </w:r>
-      <w:r>
-        <w:rPr>
-          <w:rStyle w:val="DecValTok"/>
-        </w:rPr>
-        <w:t xml:space="preserve">1</w:t>
-      </w:r>
-      <w:r>
-        <w:rPr>
-          <w:rStyle w:val="FunctionTok"/>
-        </w:rPr>
-        <w:t xml:space="preserve">,</w:t>
-      </w:r>
-      <w:r>
-        <w:rPr>
-          <w:rStyle w:val="NormalTok"/>
-        </w:rPr>
-        <w:t xml:space="preserve"> </w:t>
-      </w:r>
-      <w:r>
-        <w:rPr>
-          <w:rStyle w:val="DataTypeTok"/>
-        </w:rPr>
-        <w:t xml:space="preserve">"page_size"</w:t>
-      </w:r>
-      <w:r>
-        <w:rPr>
-          <w:rStyle w:val="FunctionTok"/>
-        </w:rPr>
-        <w:t xml:space="preserve">:</w:t>
-      </w:r>
-      <w:r>
-        <w:rPr>
-          <w:rStyle w:val="NormalTok"/>
-        </w:rPr>
-        <w:t xml:space="preserve"> </w:t>
-      </w:r>
-      <w:r>
-        <w:rPr>
-          <w:rStyle w:val="DecValTok"/>
-        </w:rPr>
-        <w:t xml:space="preserve">10</w:t>
-      </w:r>
-      <w:r>
-        <w:rPr>
-          <w:rStyle w:val="NormalTok"/>
-        </w:rPr>
-        <w:t xml:space="preserve"> </w:t>
-      </w:r>
-      <w:r>
-        <w:rPr>
-          <w:rStyle w:val="FunctionTok"/>
-        </w:rPr>
-        <w:t xml:space="preserve">}</w:t>
-      </w:r>
-      <w:r>
-        <w:br/>
-      </w:r>
-      <w:r>
-        <w:rPr>
-          <w:rStyle w:val="FunctionTok"/>
-        </w:rPr>
-        <w:t xml:space="preserve">{</w:t>
-      </w:r>
-      <w:r>
-        <w:rPr>
-          <w:rStyle w:val="NormalTok"/>
-        </w:rPr>
-        <w:t xml:space="preserve"> </w:t>
-      </w:r>
-      <w:r>
-        <w:rPr>
-          <w:rStyle w:val="DataTypeTok"/>
-        </w:rPr>
-        <w:t xml:space="preserve">"contract"</w:t>
-      </w:r>
-      <w:r>
-        <w:rPr>
-          <w:rStyle w:val="FunctionTok"/>
-        </w:rPr>
-        <w:t xml:space="preserve">:</w:t>
-      </w:r>
-      <w:r>
-        <w:rPr>
-          <w:rStyle w:val="NormalTok"/>
-        </w:rPr>
-        <w:t xml:space="preserve"> </w:t>
-      </w:r>
-      <w:r>
-        <w:rPr>
-          <w:rStyle w:val="StringTok"/>
-        </w:rPr>
-        <w:t xml:space="preserve">"website-search-v2"</w:t>
-      </w:r>
-      <w:r>
-        <w:rPr>
-          <w:rStyle w:val="FunctionTok"/>
-        </w:rPr>
-        <w:t xml:space="preserve">,</w:t>
       </w:r>
       <w:r>
         <w:rPr>
@@ -10900,42 +10752,6 @@
         <w:rPr>
           <w:rStyle w:val="DataTypeTok"/>
         </w:rPr>
-        <w:t xml:space="preserve">"contract"</w:t>
-      </w:r>
-      <w:r>
-        <w:rPr>
-          <w:rStyle w:val="FunctionTok"/>
-        </w:rPr>
-        <w:t xml:space="preserve">:</w:t>
-      </w:r>
-      <w:r>
-        <w:rPr>
-          <w:rStyle w:val="NormalTok"/>
-        </w:rPr>
-        <w:t xml:space="preserve"> </w:t>
-      </w:r>
-      <w:r>
-        <w:rPr>
-          <w:rStyle w:val="StringTok"/>
-        </w:rPr>
-        <w:t xml:space="preserve">"website-search-v2"</w:t>
-      </w:r>
-      <w:r>
-        <w:rPr>
-          <w:rStyle w:val="FunctionTok"/>
-        </w:rPr>
-        <w:t xml:space="preserve">,</w:t>
-      </w:r>
-      <w:r>
-        <w:rPr>
-          <w:rStyle w:val="NormalTok"/>
-        </w:rPr>
-        <w:t xml:space="preserve"> </w:t>
-      </w:r>
-      <w:r>
-        <w:rPr>
-          <w:rStyle w:val="DataTypeTok"/>
-        </w:rPr>
         <w:t xml:space="preserve">"action"</w:t>
       </w:r>
       <w:r>
@@ -11929,7 +11745,7 @@
         <w:pStyle w:val="FirstParagraph"/>
       </w:pPr>
       <w:r>
-        <w:t xml:space="preserve">Courses or records the API returns holding a value (15 October 2026; coverage grows daily).</w:t>
+        <w:t xml:space="preserve">Courses or records the API returns holding a value (16 October 2026; coverage grows daily).</w:t>
       </w:r>
     </w:p>
     <w:tbl>
@@ -12113,7 +11929,7 @@
               <w:jc w:val="left"/>
             </w:pPr>
             <w:r>
-              <w:t xml:space="preserve">1,927</w:t>
+              <w:t xml:space="preserve">1,929</w:t>
             </w:r>
           </w:p>
         </w:tc>
@@ -12201,7 +12017,7 @@
               <w:jc w:val="left"/>
             </w:pPr>
             <w:r>
-              <w:t xml:space="preserve">25,922</w:t>
+              <w:t xml:space="preserve">25,716</w:t>
             </w:r>
           </w:p>
         </w:tc>
@@ -12363,19 +12179,19 @@
               <w:jc w:val="left"/>
             </w:pPr>
             <w:r>
-              <w:t xml:space="preserve">3,073</w:t>
-            </w:r>
-          </w:p>
-        </w:tc>
-        <w:tc>
-          <w:tcPr/>
-          <w:p>
-            <w:pPr>
-              <w:pStyle w:val="Compact"/>
-              <w:jc w:val="left"/>
-            </w:pPr>
-            <w:r>
-              <w:t xml:space="preserve">1,469</w:t>
+              <w:t xml:space="preserve">2,929</w:t>
+            </w:r>
+          </w:p>
+        </w:tc>
+        <w:tc>
+          <w:tcPr/>
+          <w:p>
+            <w:pPr>
+              <w:pStyle w:val="Compact"/>
+              <w:jc w:val="left"/>
+            </w:pPr>
+            <w:r>
+              <w:t xml:space="preserve">1,319</w:t>
             </w:r>
           </w:p>
         </w:tc>
@@ -12586,7 +12402,7 @@
         <w:pStyle w:val="BodyText"/>
       </w:pPr>
       <w:r>
-        <w:t xml:space="preserve">Scholarships returned: 1,100 (Australia 901, New Zealand 141, Canada 58); 1,096 open to international students. Providers with an approved logo: 265. QS 2027 ranked Australian providers: 38. QILT statistics: 116 Australian providers. Institution type: held for Australian and New Zealand providers (null for Canada).</w:t>
+        <w:t xml:space="preserve">Scholarships returned: 1,100 (Australia 901, New Zealand 141, Canada 58); 1,096 open to international students. Providers with an approved logo: 1,445. QS 2027 ranked Australian providers: 38. QILT statistics: 116 Australian providers. Institution type: held for Australian and New Zealand providers (null for Canada).</w:t>
       </w:r>
     </w:p>
     <w:bookmarkEnd w:id="37"/>
@@ -13117,7 +12933,7 @@
         <w:pStyle w:val="FirstParagraph"/>
       </w:pPr>
       <w:r>
-        <w:t xml:space="preserve">Counts are as measured on Pilot on 15 October 2026; expect the same or more.</w:t>
+        <w:t xml:space="preserve">Counts are as measured on Pilot on 16 October 2026; expect the same or more.</w:t>
       </w:r>
     </w:p>
     <w:tbl>
@@ -13241,16 +13057,16 @@
               <w:t xml:space="preserve"> </w:t>
             </w:r>
             <w:r>
-              <w:t xml:space="preserve">with your key returns 200 with</w:t>
-            </w:r>
-            <w:r>
-              <w:t xml:space="preserve"> </w:t>
-            </w:r>
-            <w:r>
-              <w:rPr>
-                <w:rStyle w:val="VerbatimChar"/>
-              </w:rPr>
-              <w:t xml:space="preserve">contract_version: "website-search-v2"</w:t>
+              <w:t xml:space="preserve">with your key at the new address returns 200 with</w:t>
+            </w:r>
+            <w:r>
+              <w:t xml:space="preserve"> </w:t>
+            </w:r>
+            <w:r>
+              <w:rPr>
+                <w:rStyle w:val="VerbatimChar"/>
+              </w:rPr>
+              <w:t xml:space="preserve">api_version: "website-v2"</w:t>
             </w:r>
           </w:p>
         </w:tc>
@@ -13364,7 +13180,7 @@
               <w:jc w:val="left"/>
             </w:pPr>
             <w:r>
-              <w:t xml:space="preserve">The example in 7.2 returns 78 courses; each has a February intake, an IELTS minimum at or below 6.5 and annual tuition at or below 45,000</w:t>
+              <w:t xml:space="preserve">The example in 7.2 returns 35 courses; each has a February intake, an IELTS minimum at or below 6.5 and annual tuition at or below 45,000</w:t>
             </w:r>
           </w:p>
         </w:tc>
@@ -14011,7 +13827,7 @@
               <w:t xml:space="preserve"> </w:t>
             </w:r>
             <w:r>
-              <w:t xml:space="preserve">true returns 265 providers; each</w:t>
+              <w:t xml:space="preserve">true returns 1,445 providers; each</w:t>
             </w:r>
             <w:r>
               <w:t xml:space="preserve"> </w:t>
@@ -14351,22 +14167,7 @@
         <w:pStyle w:val="FirstParagraph"/>
       </w:pPr>
       <w:r>
-        <w:t xml:space="preserve">Changes within</w:t>
-      </w:r>
-      <w:r>
-        <w:t xml:space="preserve"> </w:t>
-      </w:r>
-      <w:r>
-        <w:rPr>
-          <w:rStyle w:val="VerbatimChar"/>
-        </w:rPr>
-        <w:t xml:space="preserve">website-search-v2</w:t>
-      </w:r>
-      <w:r>
-        <w:t xml:space="preserve"> </w:t>
-      </w:r>
-      <w:r>
-        <w:t xml:space="preserve">are additive. A change to the API (a new field, filter, action or behaviour) reissues this guide with a new date and a line here. Data grows between issues; the counts in this guide are measures on the date shown.</w:t>
+        <w:t xml:space="preserve">Changes within Website API v2 are additive. A change to the API (a new field, filter, action or behaviour) reissues this guide with a new date and a line here. Data grows between issues; the counts in this guide are measures on the date shown.</w:t>
       </w:r>
     </w:p>
     <w:tbl>
@@ -14525,6 +14326,128 @@
             </w:r>
             <w:r>
               <w:t xml:space="preserve">pages hold up to 200 items (was 50; default 200), and a page also stops at about 550 KB. A full load is about 250 calls, about 5 minutes (was about 1,400 calls, about 25 minutes). Sections 6.1 and 6.2 added: what to expect from a full load, and what we expect from your sync job</w:t>
+            </w:r>
+          </w:p>
+        </w:tc>
+      </w:tr>
+      <w:tr>
+        <w:tc>
+          <w:tcPr/>
+          <w:p>
+            <w:pPr>
+              <w:pStyle w:val="Compact"/>
+              <w:jc w:val="left"/>
+            </w:pPr>
+            <w:r>
+              <w:t xml:space="preserve">16 October 2026 (issue 3)</w:t>
+            </w:r>
+          </w:p>
+        </w:tc>
+        <w:tc>
+          <w:tcPr/>
+          <w:p>
+            <w:pPr>
+              <w:pStyle w:val="Compact"/>
+              <w:jc w:val="left"/>
+            </w:pPr>
+            <w:r>
+              <w:t xml:space="preserve">Website API v2 at its own address,</w:t>
+            </w:r>
+            <w:r>
+              <w:t xml:space="preserve"> </w:t>
+            </w:r>
+            <w:r>
+              <w:rPr>
+                <w:rStyle w:val="VerbatimChar"/>
+              </w:rPr>
+              <w:t xml:space="preserve">website-api-v2</w:t>
+            </w:r>
+            <w:r>
+              <w:t xml:space="preserve">, with its own key: no</w:t>
+            </w:r>
+            <w:r>
+              <w:t xml:space="preserve"> </w:t>
+            </w:r>
+            <w:r>
+              <w:rPr>
+                <w:rStyle w:val="VerbatimChar"/>
+              </w:rPr>
+              <w:t xml:space="preserve">contract</w:t>
+            </w:r>
+            <w:r>
+              <w:t xml:space="preserve"> </w:t>
+            </w:r>
+            <w:r>
+              <w:t xml:space="preserve">field; responses carry</w:t>
+            </w:r>
+            <w:r>
+              <w:t xml:space="preserve"> </w:t>
+            </w:r>
+            <w:r>
+              <w:rPr>
+                <w:rStyle w:val="VerbatimChar"/>
+              </w:rPr>
+              <w:t xml:space="preserve">api_version: "website-v2"</w:t>
+            </w:r>
+            <w:r>
+              <w:t xml:space="preserve"> </w:t>
+            </w:r>
+            <w:r>
+              <w:t xml:space="preserve">instead of</w:t>
+            </w:r>
+            <w:r>
+              <w:t xml:space="preserve"> </w:t>
+            </w:r>
+            <w:r>
+              <w:rPr>
+                <w:rStyle w:val="VerbatimChar"/>
+              </w:rPr>
+              <w:t xml:space="preserve">contract_version</w:t>
+            </w:r>
+            <w:r>
+              <w:t xml:space="preserve">; errors add</w:t>
+            </w:r>
+            <w:r>
+              <w:t xml:space="preserve"> </w:t>
+            </w:r>
+            <w:r>
+              <w:rPr>
+                <w:rStyle w:val="VerbatimChar"/>
+              </w:rPr>
+              <w:t xml:space="preserve">message</w:t>
+            </w:r>
+            <w:r>
+              <w:t xml:space="preserve"> </w:t>
+            </w:r>
+            <w:r>
+              <w:t xml:space="preserve">and</w:t>
+            </w:r>
+            <w:r>
+              <w:t xml:space="preserve"> </w:t>
+            </w:r>
+            <w:r>
+              <w:rPr>
+                <w:rStyle w:val="VerbatimChar"/>
+              </w:rPr>
+              <w:t xml:space="preserve">detail</w:t>
+            </w:r>
+            <w:r>
+              <w:t xml:space="preserve"> </w:t>
+            </w:r>
+            <w:r>
+              <w:t xml:space="preserve">(and</w:t>
+            </w:r>
+            <w:r>
+              <w:t xml:space="preserve"> </w:t>
+            </w:r>
+            <w:r>
+              <w:rPr>
+                <w:rStyle w:val="VerbatimChar"/>
+              </w:rPr>
+              <w:t xml:space="preserve">INVALID_JSON</w:t>
+            </w:r>
+            <w:r>
+              <w:t xml:space="preserve">); 300 calls a minute per key, all actions together. Same actions, fields and answers. The earlier address keeps working until you have moved</w:t>
             </w:r>
           </w:p>
         </w:tc>
@@ -14556,7 +14479,7 @@
         <w:color w:val="606060"/>
         <w:sz w:val="16"/>
       </w:rPr>
-      <w:t>website-search-v2 · Version 2 · 15 October 2026 · Pilot</w:t>
+      <w:t>website-api-v2 · Version 2 · Issue 3 · 16 October 2026 · Pilot</w:t>
     </w:r>
   </w:p>
 </w:ftr>

</xml_diff>